<commit_message>
Protocol Flamingo REV10: apply audit fixes from claude/protocol-flamingo-book-repo-2e6vqo (d3f3207 structural defects, 73405d2 4-way literary audit); STATUS from that branch (based on main's newer REV10 sync)
</commit_message>
<xml_diff>
--- a/Protocol Flamingo/Protocol_Flamingo_REV10.docx
+++ b/Protocol Flamingo/Protocol_Flamingo_REV10.docx
@@ -11160,6 +11160,15 @@
           <w:sz w:val="28"/>
         </w:rPr>
       </w:pPr>
+      <w:r>
+        <w:rPr>
+          <w:rFonts w:ascii="Georgia" w:hAnsi="Georgia"/>
+          <w:b/>
+          <w:color w:val="3B6EA5"/>
+          <w:sz w:val="28"/>
+        </w:rPr>
+        <w:br w:type="page"/>
+      </w:r>
     </w:p>
     <w:p>
       <w:pPr>
@@ -11180,7 +11189,6 @@
     </w:p>
     <w:p>
       <w:pPr>
-        <w:pStyle w:val="Heading2"/>
         <w:spacing w:before="600" w:after="320"/>
         <w:jc w:val="left"/>
         <w:rPr>
@@ -11204,7 +11212,6 @@
     </w:p>
     <w:p>
       <w:pPr>
-        <w:pStyle w:val="Heading2"/>
         <w:spacing w:before="600" w:after="0"/>
         <w:jc w:val="left"/>
         <w:rPr>
@@ -11230,7 +11237,6 @@
     </w:p>
     <w:p>
       <w:pPr>
-        <w:pStyle w:val="Heading2"/>
         <w:spacing w:before="600" w:after="0"/>
         <w:jc w:val="left"/>
         <w:rPr>
@@ -11254,7 +11260,6 @@
     </w:p>
     <w:p>
       <w:pPr>
-        <w:pStyle w:val="Heading2"/>
         <w:spacing w:before="600" w:after="0"/>
         <w:jc w:val="left"/>
         <w:rPr>
@@ -11278,7 +11283,6 @@
     </w:p>
     <w:p>
       <w:pPr>
-        <w:pStyle w:val="Heading2"/>
         <w:spacing w:after="0"/>
         <w:jc w:val="left"/>
         <w:rPr>
@@ -11302,7 +11306,6 @@
     </w:p>
     <w:p>
       <w:pPr>
-        <w:pStyle w:val="Heading2"/>
         <w:spacing w:after="0"/>
         <w:jc w:val="left"/>
         <w:rPr>
@@ -11334,15 +11337,6 @@
           <w:szCs w:val="20"/>
         </w:rPr>
       </w:pPr>
-      <w:r>
-        <w:rPr>
-          <w:rFonts w:ascii="Georgia" w:hAnsi="Georgia"/>
-          <w:color w:val="2B2B2B"/>
-          <w:sz w:val="26"/>
-          <w:szCs w:val="20"/>
-        </w:rPr>
-        <w:br w:type="page"/>
-      </w:r>
     </w:p>
     <w:p>
       <w:pPr>
@@ -14951,7 +14945,7 @@
           <w:color w:val="2B2B2B"/>
           <w:sz w:val="26"/>
         </w:rPr>
-        <w:t>“Buchanan thinks she can. Every time she sends an authorization that treats Halo like a contractor instead of a country that happens to file quarterly reports.” “She’s not wrong that we built the microphone. She’s wrong that the people who paid for the satellites get to choose the song without hearing it first.”</w:t>
+        <w:t>“Buchanan thinks she can. Every time she sends an authorization that treats Halo like a contractor instead of a country that happens to file quarterly reports. She’s not wrong that we built the microphone. She’s wrong that the people who paid for the satellites get to choose the song without hearing it first.”</w:t>
       </w:r>
     </w:p>
     <w:p>
@@ -15298,7 +15292,7 @@
           <w:color w:val="2B2B2B"/>
           <w:sz w:val="26"/>
         </w:rPr>
-        <w:t>“They stopped traveling a long time ago. Forty thousand years at a few percent of light speed gets you a long way, but it doesn’t get you to anywhere you’ve chosen. They’d been coasting between stars, looking. Then, in 1947, they heard us.” He tapped the edge of the plate. “Radar. The war left us with very powerful transmitters and no idea what they sounded like from outside. Earth’s radio leakage carries further than you’d like; there’s a 1978 paper that does the arithmetic. They were close when it reached them. Less than a light-year out, coasting through the edge of the Sun’s comet cloud, which by the standards of the galaxy is a near miss. They heard us, and they turned, and they spent the next thirty years braking, and they parked in the Trojan swarm, sixty degrees ahead of Jupiter, tucked in with a crowd of dark rock the surveys had agreed was boring. The hull is four kilometers across. A moon would have been famous. A rock that size is a catalog number.”</w:t>
+        <w:t>“They stopped traveling a long time ago. Forty thousand years at a few percent of light speed gets you a long way, but it doesn’t get you to anywhere you’ve chosen. They’d been coasting between stars, looking. Then, in 1947, they heard us.” He tapped the edge of the plate. “Radar. The war left us with very powerful transmitters and no idea what they sounded like from outside. Earth’s radio leakage carries further than you’d like; there’s a 1978 paper that does the arithmetic. They were close when it reached them. Less than a light-year out, coasting through the edge of the Sun’s comet cloud, which by the standards of the galaxy is a near miss. They heard us, and they turned, and they spent the next thirty-two years braking, and they parked in the Trojan swarm, sixty degrees ahead of Jupiter, tucked in with a crowd of dark rock the surveys had agreed was boring. The hull is four kilometers across. A moon would have been famous. A rock that size is a catalog number.”</w:t>
       </w:r>
     </w:p>
     <w:p>
@@ -15462,7 +15456,7 @@
           <w:color w:val="2B2B2B"/>
           <w:sz w:val="26"/>
         </w:rPr>
-        <w:t>The air handling ticked. In the parking lot, a man was loading a mattress into a pickup truck with great care, as if it were a patient.</w:t>
+        <w:t>The air handler ticked. In the parking lot, a man was loading a mattress into a pickup truck with great care, as if it were a patient.</w:t>
       </w:r>
     </w:p>
     <w:p>
@@ -19470,7 +19464,6 @@
     </w:p>
     <w:p>
       <w:pPr>
-        <w:pStyle w:val="Heading2"/>
         <w:spacing w:after="0"/>
         <w:jc w:val="left"/>
         <w:rPr>
@@ -19494,7 +19487,6 @@
     </w:p>
     <w:p>
       <w:pPr>
-        <w:pStyle w:val="Heading2"/>
         <w:spacing w:before="600" w:after="0"/>
         <w:jc w:val="left"/>
         <w:rPr>
@@ -19518,7 +19510,6 @@
     </w:p>
     <w:p>
       <w:pPr>
-        <w:pStyle w:val="Heading2"/>
         <w:spacing w:before="600" w:after="0"/>
         <w:jc w:val="left"/>
         <w:rPr>
@@ -19544,7 +19535,6 @@
     </w:p>
     <w:p>
       <w:pPr>
-        <w:pStyle w:val="Heading2"/>
         <w:spacing w:before="600" w:after="320"/>
         <w:jc w:val="left"/>
         <w:rPr>
@@ -19576,15 +19566,6 @@
           <w:szCs w:val="20"/>
         </w:rPr>
       </w:pPr>
-      <w:r>
-        <w:rPr>
-          <w:rFonts w:ascii="Georgia" w:hAnsi="Georgia"/>
-          <w:color w:val="2B2B2B"/>
-          <w:sz w:val="26"/>
-          <w:szCs w:val="20"/>
-        </w:rPr>
-        <w:br w:type="page"/>
-      </w:r>
     </w:p>
     <w:p>
       <w:pPr>
@@ -19654,7 +19635,7 @@
           <w:color w:val="2B2B2B"/>
           <w:sz w:val="26"/>
         </w:rPr>
-        <w:t>They took Nora and Jesse two nights after the fence, which finally answered the question of what the man in the parking lot had meant by useful a while longer.</w:t>
+        <w:t>They took Nora and Jesse two nights after the fence, which finally answered the question of what the man in the parking lot had meant by useful.</w:t>
       </w:r>
     </w:p>
     <w:p>
@@ -23195,8 +23176,7 @@
           <w:color w:val="2B2B2B"/>
           <w:sz w:val="26"/>
         </w:rPr>
-        <w:lastRenderedPageBreak/>
-        <w:t>“Sacramento to Reno is twenty-five minutes,” said the operations lead slowly. “Reno to Denver is an hour forty. The crew’s within limits if they’re wheels-up from Reno by nine. We’d have to hold Feld until then. If he’s on the bus at nine-fifteen —”</w:t>
+        <w:t>“Sacramento to Reno is twenty-five minutes,” said the operations lead slowly. “Reno to Denver is an hour fifteen. The crew’s within limits if they’re wheels-up from Reno by nine. We’d have to hold Feld until then. If he’s on the bus at nine-fifteen —”</w:t>
       </w:r>
     </w:p>
     <w:p>
@@ -23994,7 +23974,7 @@
           <w:color w:val="2B2B2B"/>
           <w:sz w:val="26"/>
         </w:rPr>
-        <w:t>“I haven’t decided,” she said. “But his mother says he gets told, and he decides. I’d like to try it her way first.”</w:t>
+        <w:t>“I haven’t decided,” she said. “But his mother’s rule is that he hears it first and chooses for himself. I’d like to try it her way first.”</w:t>
       </w:r>
     </w:p>
     <w:p>
@@ -28644,8 +28624,6 @@
           <w:color w:val="3B6EA5"/>
           <w:szCs w:val="30"/>
         </w:rPr>
-        <w:lastRenderedPageBreak/>
-        <w:t xml:space="preserve">  </w:t>
       </w:r>
     </w:p>
     <w:p>
@@ -28726,43 +28704,47 @@
           <w:sz w:val="28"/>
         </w:rPr>
       </w:pPr>
-    </w:p>
-    <w:p>
-      <w:pPr>
-        <w:ind w:firstLine="0"/>
-        <w:jc w:val="center"/>
-        <w:rPr>
-          <w:rFonts w:ascii="Arial" w:hAnsi="Arial"/>
-          <w:b/>
-          <w:color w:val="2E74B5"/>
-          <w:sz w:val="28"/>
-        </w:rPr>
-      </w:pPr>
-      <w:r>
-        <w:rPr>
-          <w:rFonts w:ascii="Arial" w:hAnsi="Arial"/>
-          <w:b/>
-          <w:color w:val="2E74B5"/>
-          <w:sz w:val="28"/>
-        </w:rPr>
-        <w:t>Zaragoza</w:t>
-      </w:r>
-    </w:p>
-    <w:p>
-      <w:pPr>
-        <w:ind w:firstLine="0"/>
-        <w:jc w:val="center"/>
+      <w:r>
         <w:rPr>
           <w:rFonts w:ascii="Georgia" w:hAnsi="Georgia"/>
           <w:b/>
           <w:color w:val="3B6EA5"/>
           <w:sz w:val="28"/>
         </w:rPr>
-      </w:pPr>
+        <w:br w:type="page"/>
+      </w:r>
     </w:p>
     <w:p>
       <w:pPr>
         <w:pStyle w:val="Heading2"/>
+        <w:spacing w:before="600" w:after="0" w:line="400" w:lineRule="auto"/>
+        <w:rPr>
+          <w:rFonts w:ascii="Georgia" w:hAnsi="Georgia"/>
+          <w:color w:val="3B6EA5"/>
+          <w:sz w:val="28"/>
+        </w:rPr>
+      </w:pPr>
+      <w:r>
+        <w:rPr>
+          <w:sz w:val="28"/>
+        </w:rPr>
+        <w:t>Zaragoza</w:t>
+      </w:r>
+    </w:p>
+    <w:p>
+      <w:pPr>
+        <w:ind w:firstLine="0"/>
+        <w:jc w:val="center"/>
+        <w:rPr>
+          <w:rFonts w:ascii="Georgia" w:hAnsi="Georgia"/>
+          <w:b/>
+          <w:color w:val="3B6EA5"/>
+          <w:sz w:val="28"/>
+        </w:rPr>
+      </w:pPr>
+    </w:p>
+    <w:p>
+      <w:pPr>
         <w:spacing w:after="0"/>
         <w:jc w:val="left"/>
         <w:rPr>
@@ -28787,7 +28769,6 @@
     </w:p>
     <w:p>
       <w:pPr>
-        <w:pStyle w:val="Heading2"/>
         <w:spacing w:after="320"/>
         <w:jc w:val="left"/>
         <w:rPr>
@@ -28802,7 +28783,6 @@
     </w:p>
     <w:p>
       <w:pPr>
-        <w:pStyle w:val="Heading2"/>
         <w:spacing w:after="0"/>
         <w:jc w:val="left"/>
         <w:rPr>
@@ -28828,7 +28808,6 @@
     </w:p>
     <w:p>
       <w:pPr>
-        <w:pStyle w:val="Heading2"/>
         <w:spacing w:before="600" w:after="320"/>
         <w:jc w:val="left"/>
         <w:rPr>
@@ -28862,17 +28841,6 @@
           <w:szCs w:val="20"/>
         </w:rPr>
       </w:pPr>
-      <w:r>
-        <w:rPr>
-          <w:rFonts w:ascii="Georgia" w:hAnsi="Georgia"/>
-          <w:i/>
-          <w:iCs/>
-          <w:color w:val="2B2B2B"/>
-          <w:sz w:val="26"/>
-          <w:szCs w:val="20"/>
-        </w:rPr>
-        <w:br w:type="page"/>
-      </w:r>
     </w:p>
     <w:p>
       <w:pPr>
@@ -30561,7 +30529,7 @@
           <w:sz w:val="26"/>
           <w:szCs w:val="20"/>
         </w:rPr>
-        <w:t xml:space="preserve"> On authority: an order that needs two signatures is an order that one person was not trusted to give. Count the signatures before you count the consequences.</w:t>
+        <w:t>On authority: an order that needs two signatures is an order that one person was not trusted to give. Count the signatures before you count the consequences.</w:t>
       </w:r>
     </w:p>
     <w:p>
@@ -30686,7 +30654,7 @@
           <w:color w:val="2B2B2B"/>
           <w:sz w:val="26"/>
         </w:rPr>
-        <w:t>“It says directed,” Kade said, in his low level voice, to the room. “Not requested. The prepared counter-signal, at full constellation power, and anything else I send is a breach.” He set the tablet face up on the console. “Buchanan signed. Cole initialed the second box, on the emergency provision.”</w:t>
+        <w:t>“It says directed,” Kade said, in his low-level voice, to the room. “Not requested. The prepared counter-signal, at full constellation power, and anything else I send is a breach.” He set the tablet face up on the console. “Buchanan signed. Cole initialed the second box, on the emergency provision.”</w:t>
       </w:r>
     </w:p>
     <w:p>
@@ -35556,8 +35524,7 @@
           <w:color w:val="2B2B2B"/>
           <w:sz w:val="26"/>
         </w:rPr>
-        <w:lastRenderedPageBreak/>
-        <w:t>Steve did not kick him. Alpacas rarely kick, and this one had already spent his courage on the doorway. He blew air, hard, the sweet chemical smell of the link rolling off the man in the cap, and the man flinched the way you flinch at a stove. It bought a second. It did not buy the switch.</w:t>
+        <w:t>Steve did not kick him; this one had already spent his courage on the doorway. He blew air, hard, the sweet chemical smell of the link rolling off the man in the cap, and the man flinched the way you flinch at a stove. It bought a second. It did not buy the switch.</w:t>
       </w:r>
     </w:p>
     <w:p>
@@ -39057,7 +39024,6 @@
     </w:p>
     <w:p>
       <w:pPr>
-        <w:pStyle w:val="Heading2"/>
         <w:spacing w:after="0"/>
         <w:jc w:val="left"/>
         <w:rPr>
@@ -39081,7 +39047,6 @@
     </w:p>
     <w:p>
       <w:pPr>
-        <w:pStyle w:val="Heading2"/>
         <w:spacing w:after="0"/>
         <w:jc w:val="left"/>
         <w:rPr>
@@ -39095,7 +39060,6 @@
     </w:p>
     <w:p>
       <w:pPr>
-        <w:pStyle w:val="Heading2"/>
         <w:spacing w:after="0"/>
         <w:jc w:val="left"/>
         <w:rPr>
@@ -39119,7 +39083,6 @@
     </w:p>
     <w:p>
       <w:pPr>
-        <w:pStyle w:val="Heading2"/>
         <w:spacing w:after="0"/>
         <w:jc w:val="left"/>
         <w:rPr>
@@ -39133,7 +39096,6 @@
     </w:p>
     <w:p>
       <w:pPr>
-        <w:pStyle w:val="Heading2"/>
         <w:spacing w:after="0"/>
         <w:jc w:val="left"/>
         <w:rPr>
@@ -39158,7 +39120,6 @@
     </w:p>
     <w:p>
       <w:pPr>
-        <w:pStyle w:val="Heading2"/>
         <w:spacing w:after="320"/>
         <w:jc w:val="left"/>
         <w:rPr>
@@ -39173,7 +39134,6 @@
     </w:p>
     <w:p>
       <w:pPr>
-        <w:pStyle w:val="Heading2"/>
         <w:spacing w:after="320"/>
         <w:jc w:val="left"/>
         <w:rPr>
@@ -39207,17 +39167,6 @@
           <w:szCs w:val="20"/>
         </w:rPr>
       </w:pPr>
-      <w:r>
-        <w:rPr>
-          <w:rFonts w:ascii="Georgia" w:hAnsi="Georgia"/>
-          <w:i/>
-          <w:iCs/>
-          <w:color w:val="2B2B2B"/>
-          <w:sz w:val="26"/>
-          <w:szCs w:val="20"/>
-        </w:rPr>
-        <w:br w:type="page"/>
-      </w:r>
     </w:p>
     <w:p>
       <w:pPr>
@@ -44032,8 +43981,7 @@
           <w:bCs/>
           <w:szCs w:val="30"/>
         </w:rPr>
-        <w:lastRenderedPageBreak/>
-        <w:t>A NOTE  ON THE COUSINS</w:t>
+        <w:t>A NOTE ON THE COUSINS</w:t>
       </w:r>
     </w:p>
     <w:p>
@@ -44776,7 +44724,7 @@
           <w:color w:val="2B2B2B"/>
           <w:sz w:val="26"/>
         </w:rPr>
-        <w:t>, that ultrasonic neural dust can record from a nerve at that size. What this book adds, and does not pretend has been demonstrated, is the second hop. The mote talks to a tender or a ground relay close enough to hear it. It does not stream a life to Jupiter. The constant signal in the novel is a dog tag: alive, located, unharmed. The occasional signal is a visit, at a range of hours missing from an ordinary afternoon, not a radio conversation with the Trojan swarm. A coin-sized commercial brain implant that talks to hardware worn on the body is a different machine, and it is not the one in this story.</w:t>
+        <w:t>, that ultrasonic neural dust — wireless, dust-sized sensors — can record from a nerve at that size. What this book adds, and does not pretend has been demonstrated, is the second hop. The mote talks to a tender or a ground relay close enough to hear it. It does not stream a life to Jupiter. The constant signal in the novel is a dog tag: alive, located, unharmed. The occasional signal is a visit, at a range of hours missing from an ordinary afternoon, not a radio conversation with the Trojan swarm. A coin-sized commercial brain implant that talks to hardware worn on the body is a different machine, and it is not the one in this story.</w:t>
       </w:r>
     </w:p>
     <w:p>
@@ -44997,7 +44945,7 @@
         </w:rPr>
       </w:pPr>
       <w:r>
-        <w:t>The Boat’s location among the Jupiter Trojans also uses a real piece of celestial mechanics. Trojan objects share Jupiter’s orbit around the Sun in stable regions associated with the Sun-Jupiter L4 and L5 points, roughly sixty degrees ahead of or behind Jupiter. The novel’s ship is fictional; the orbital neighborhood is not.</w:t>
+        <w:t>The Boat’s location among the Jupiter Trojans also uses a real piece of celestial mechanics. Trojan objects share Jupiter’s orbit around the Sun in stable regions associated with the Sun-Jupiter L4 and L5 points (where an object can sit gravitationally locked to Jupiter instead of drifting around it), roughly sixty degrees ahead of or behind Jupiter. The novel’s ship is fictional; the orbital neighborhood is not.</w:t>
       </w:r>
     </w:p>
     <w:p>
@@ -45323,6 +45271,16 @@
           <w:sz w:val="26"/>
           <w:szCs w:val="26"/>
         </w:rPr>
+        <w:t>Caisse Saide, R., and Garrett, M. Airport civilian and military radar leakage as a marker for extraterrestrial detection, presented at the Royal Astronomical Society National Astronomy Meeting 2025; reported by Sci.News. https://www.sci.news/astronomy/civilian-military-radar-leakage-alien-civilizations-14055.html</w:t>
+      </w:r>
+    </w:p>
+    <w:p>
+      <w:r>
+        <w:rPr>
+          <w:rFonts w:ascii="Georgia" w:hAnsi="Georgia"/>
+          <w:sz w:val="26"/>
+          <w:szCs w:val="26"/>
+        </w:rPr>
         <w:t>Bracewell, R. N. “Communications from Superior Galactic Communities.” Nature 186 (1960): 670. https://doi.org/10.1038/186670a0</w:t>
       </w:r>
     </w:p>
@@ -45333,7 +45291,7 @@
           <w:sz w:val="26"/>
           <w:szCs w:val="26"/>
         </w:rPr>
-        <w:t>Benford, J. “Looking for Lurkers.” arXiv:1903.09582 (2019). https://arxiv.org/abs/1903.09582</w:t>
+        <w:t>Benford, J. “Looking for Lurkers.” arXiv:1903.09582 (2019). https://arxiv.org/pdf/1903.09582</w:t>
       </w:r>
     </w:p>
     <w:p>
@@ -45541,6 +45499,28 @@
     </w:p>
     <w:p>
       <w:pPr>
+        <w:pStyle w:val="ListParagraph"/>
+        <w:numPr>
+          <w:ilvl w:val="0"/>
+          <w:numId w:val="4"/>
+        </w:numPr>
+        <w:rPr>
+          <w:rFonts w:ascii="Georgia" w:hAnsi="Georgia"/>
+          <w:color w:val="2B2B2B"/>
+          <w:szCs w:val="22"/>
+        </w:rPr>
+      </w:pPr>
+      <w:r>
+        <w:rPr>
+          <w:rFonts w:ascii="Georgia" w:hAnsi="Georgia"/>
+          <w:color w:val="2B2B2B"/>
+          <w:szCs w:val="22"/>
+        </w:rPr>
+        <w:t>Protocol Flamingo (Book 1, this book)</w:t>
+      </w:r>
+    </w:p>
+    <w:p>
+      <w:pPr>
         <w:jc w:val="both"/>
         <w:rPr>
           <w:rFonts w:ascii="Georgia" w:hAnsi="Georgia"/>
@@ -45573,7 +45553,7 @@
           <w:color w:val="2B2B2B"/>
           <w:szCs w:val="22"/>
         </w:rPr>
-        <w:t xml:space="preserve"> (coming  soon)</w:t>
+        <w:t xml:space="preserve"> (coming soon)</w:t>
       </w:r>
     </w:p>
     <w:p>
@@ -45679,7 +45659,7 @@
           <w:color w:val="2B2B2B"/>
           <w:szCs w:val="22"/>
         </w:rPr>
-        <w:t xml:space="preserve"> (coming  soon)</w:t>
+        <w:t xml:space="preserve"> (coming soon)</w:t>
       </w:r>
     </w:p>
     <w:p>
@@ -45737,7 +45717,7 @@
           <w:color w:val="2B2B2B"/>
           <w:szCs w:val="22"/>
         </w:rPr>
-        <w:t xml:space="preserve"> (coming  soon)</w:t>
+        <w:t xml:space="preserve"> (coming soon)</w:t>
       </w:r>
     </w:p>
     <w:p>
@@ -45858,7 +45838,7 @@
           <w:color w:val="2B2B2B"/>
           <w:szCs w:val="22"/>
         </w:rPr>
-        <w:t xml:space="preserve"> (coming  soon)</w:t>
+        <w:t xml:space="preserve"> (coming soon)</w:t>
       </w:r>
     </w:p>
     <w:p>
@@ -45938,7 +45918,7 @@
           <w:color w:val="2B2B2B"/>
           <w:szCs w:val="22"/>
         </w:rPr>
-        <w:t xml:space="preserve"> (coming  soon)</w:t>
+        <w:t xml:space="preserve"> (coming soon)</w:t>
       </w:r>
     </w:p>
     <w:p>
@@ -45960,7 +45940,7 @@
           <w:color w:val="2B2B2B"/>
           <w:szCs w:val="22"/>
         </w:rPr>
-        <w:t xml:space="preserve">Science Sparks: Physics, Life, and Mathematics </w:t>
+        <w:t>Science Sparks: Physics, Life, and Mathematics</w:t>
       </w:r>
     </w:p>
     <w:p>
@@ -45996,7 +45976,7 @@
           <w:color w:val="2B2B2B"/>
           <w:szCs w:val="22"/>
         </w:rPr>
-        <w:t xml:space="preserve"> (coming  soon)</w:t>
+        <w:t xml:space="preserve"> (coming soon)</w:t>
       </w:r>
     </w:p>
     <w:p>
@@ -46075,7 +46055,7 @@
           <w:color w:val="2B2B2B"/>
           <w:szCs w:val="22"/>
         </w:rPr>
-        <w:t xml:space="preserve"> (coming  soon)</w:t>
+        <w:t xml:space="preserve"> (coming soon)</w:t>
       </w:r>
     </w:p>
     <w:p>
@@ -46259,7 +46239,7 @@
           <w:color w:val="2B2B2B"/>
           <w:szCs w:val="22"/>
         </w:rPr>
-        <w:t xml:space="preserve"> (coming  soon)</w:t>
+        <w:t xml:space="preserve"> (coming soon)</w:t>
       </w:r>
     </w:p>
     <w:p>
@@ -46317,7 +46297,7 @@
           <w:color w:val="2B2B2B"/>
           <w:szCs w:val="22"/>
         </w:rPr>
-        <w:t xml:space="preserve"> (coming  soon)</w:t>
+        <w:t xml:space="preserve"> (coming soon)</w:t>
       </w:r>
     </w:p>
     <w:p>
@@ -46402,28 +46382,6 @@
           <w:szCs w:val="22"/>
         </w:rPr>
         <w:t>The Permitted Options (Lolly Wren’s Curious Science Adventures, Book 2)</w:t>
-      </w:r>
-    </w:p>
-    <w:p>
-      <w:pPr>
-        <w:pStyle w:val="ListParagraph"/>
-        <w:numPr>
-          <w:ilvl w:val="0"/>
-          <w:numId w:val="4"/>
-        </w:numPr>
-        <w:rPr>
-          <w:rFonts w:ascii="Georgia" w:hAnsi="Georgia"/>
-          <w:color w:val="2B2B2B"/>
-          <w:szCs w:val="22"/>
-        </w:rPr>
-      </w:pPr>
-      <w:r>
-        <w:rPr>
-          <w:rFonts w:ascii="Georgia" w:hAnsi="Georgia"/>
-          <w:color w:val="2B2B2B"/>
-          <w:szCs w:val="22"/>
-        </w:rPr>
-        <w:t>Protocol Flamingo (Book 1, this book)</w:t>
       </w:r>
     </w:p>
     <w:p>
@@ -46578,26 +46536,24 @@
       </w:r>
     </w:p>
     <w:p>
-      <w:pPr>
-        <w:pStyle w:val="Heading1"/>
-      </w:pPr>
-    </w:p>
-    <w:p>
-      <w:pPr>
-        <w:jc w:val="both"/>
-        <w:rPr>
-          <w:rFonts w:ascii="Georgia" w:hAnsi="Georgia"/>
-          <w:color w:val="2B2B2B"/>
-          <w:sz w:val="26"/>
-        </w:rPr>
-      </w:pPr>
-      <w:r>
-        <w:rPr>
-          <w:rFonts w:ascii="Georgia" w:hAnsi="Georgia"/>
-          <w:color w:val="2B2B2B"/>
-          <w:sz w:val="26"/>
-        </w:rPr>
-        <w:t>Lothar J. Musiol, , writes stories in which a committee outlasts a fleet. Protocol Flamingo is the first of the Invasion Storybooks. The people in it are invented. The alpaca is invented. The science in the appendix is not.</w:t>
+      <w:pPr/>
+    </w:p>
+    <w:p>
+      <w:pPr>
+        <w:jc w:val="both"/>
+        <w:rPr>
+          <w:rFonts w:ascii="Georgia" w:hAnsi="Georgia"/>
+          <w:color w:val="2B2B2B"/>
+          <w:sz w:val="26"/>
+        </w:rPr>
+      </w:pPr>
+      <w:r>
+        <w:rPr>
+          <w:rFonts w:ascii="Georgia" w:hAnsi="Georgia"/>
+          <w:color w:val="2B2B2B"/>
+          <w:sz w:val="26"/>
+        </w:rPr>
+        <w:t>Lothar J. Musiol writes stories in which a committee outlasts a fleet. Protocol Flamingo is the first of the Invasion Storybooks. The people in it are invented. The alpaca is invented. The science in the appendix is not.</w:t>
       </w:r>
     </w:p>
     <w:sectPr>

</xml_diff>

<commit_message>
Also-by: Protocol Flamingo to canonical list
</commit_message>
<xml_diff>
--- a/Protocol Flamingo/Protocol_Flamingo_REV10.docx
+++ b/Protocol Flamingo/Protocol_Flamingo_REV10.docx
@@ -45544,7 +45544,7 @@
           <w:color w:val="2B2B2B"/>
           <w:szCs w:val="22"/>
         </w:rPr>
-        <w:t>Physics, Actually</w:t>
+        <w:t xml:space="preserve">Physics, Actually (coming soon)</w:t>
       </w:r>
       <w:r>
         <w:rPr>
@@ -45553,7 +45553,7 @@
           <w:color w:val="2B2B2B"/>
           <w:szCs w:val="22"/>
         </w:rPr>
-        <w:t xml:space="preserve"> (coming soon)</w:t>
+        <w:t xml:space="preserve"/>
       </w:r>
     </w:p>
     <w:p>
@@ -45574,7 +45574,7 @@
           <w:color w:val="2B2B2B"/>
           <w:szCs w:val="22"/>
         </w:rPr>
-        <w:t>Physics, Actually, Volume 1: Motion, Forces, Time, and Relativity</w:t>
+        <w:t xml:space="preserve">Physics, Actually, Volume 1: Motion, Forces, Time, and Relativity</w:t>
       </w:r>
     </w:p>
     <w:p>
@@ -45595,7 +45595,7 @@
           <w:color w:val="2B2B2B"/>
           <w:szCs w:val="22"/>
         </w:rPr>
-        <w:t>Physics, Actually, Volume 2: Gravity, Cosmology, and the Limits of Spacetime</w:t>
+        <w:t xml:space="preserve">Physics, Actually, Volume 2: Gravity, Cosmology, and the Limits of Spacetime</w:t>
       </w:r>
     </w:p>
     <w:p>
@@ -45616,50 +45616,7 @@
           <w:color w:val="2B2B2B"/>
           <w:szCs w:val="22"/>
         </w:rPr>
-        <w:t>Physics, Actually, Volume 3: The Standard Model, Chaos, and the Edge of Knowledge</w:t>
-      </w:r>
-    </w:p>
-    <w:p>
-      <w:pPr>
-        <w:pStyle w:val="ListParagraph"/>
-        <w:ind w:left="648"/>
-        <w:rPr>
-          <w:rFonts w:ascii="Georgia" w:hAnsi="Georgia"/>
-          <w:color w:val="2B2B2B"/>
-          <w:szCs w:val="22"/>
-        </w:rPr>
-      </w:pPr>
-    </w:p>
-    <w:p>
-      <w:pPr>
-        <w:pStyle w:val="ListParagraph"/>
-        <w:ind w:left="288"/>
-        <w:rPr>
-          <w:rFonts w:ascii="Georgia" w:hAnsi="Georgia"/>
-          <w:b/>
-          <w:bCs/>
-          <w:color w:val="2B2B2B"/>
-          <w:szCs w:val="22"/>
-        </w:rPr>
-      </w:pPr>
-      <w:r>
-        <w:rPr>
-          <w:rFonts w:ascii="Georgia" w:hAnsi="Georgia"/>
-          <w:b/>
-          <w:bCs/>
-          <w:color w:val="2B2B2B"/>
-          <w:szCs w:val="22"/>
-        </w:rPr>
-        <w:t>Life, Actually</w:t>
-      </w:r>
-      <w:r>
-        <w:rPr>
-          <w:rFonts w:ascii="Georgia" w:hAnsi="Georgia"/>
-          <w:bCs/>
-          <w:color w:val="2B2B2B"/>
-          <w:szCs w:val="22"/>
-        </w:rPr>
-        <w:t xml:space="preserve"> (coming soon)</w:t>
+        <w:t xml:space="preserve">Physics, Actually, Volume 3: The Standard Model, Chaos, and the Edge of Knowledge</w:t>
       </w:r>
     </w:p>
     <w:p>
@@ -45667,40 +45624,39 @@
         <w:pStyle w:val="ListParagraph"/>
         <w:numPr>
           <w:ilvl w:val="0"/>
-          <w:numId w:val="11"/>
+          <w:numId w:val="6"/>
         </w:numPr>
-        <w:rPr>
-          <w:rFonts w:ascii="Georgia" w:hAnsi="Georgia"/>
-          <w:color w:val="2B2B2B"/>
-          <w:szCs w:val="22"/>
-        </w:rPr>
-      </w:pPr>
-      <w:r>
-        <w:rPr>
-          <w:rFonts w:ascii="Georgia" w:hAnsi="Georgia"/>
-          <w:color w:val="2B2B2B"/>
-          <w:szCs w:val="22"/>
-        </w:rPr>
-        <w:t>From the First Cell to the Edited Genome and the Search for Life Elsewhere</w:t>
-      </w:r>
-    </w:p>
-    <w:p>
-      <w:pPr>
-        <w:ind w:left="360"/>
         <w:rPr>
           <w:sz w:val="22"/>
           <w:szCs w:val="22"/>
         </w:rPr>
       </w:pPr>
-    </w:p>
-    <w:p>
-      <w:pPr>
-        <w:keepNext/>
+      <w:r>
+        <w:rPr>
+          <w:rFonts w:ascii="Georgia" w:hAnsi="Georgia"/>
+          <w:color w:val="2B2B2B"/>
+          <w:szCs w:val="22"/>
+        </w:rPr>
+        <w:t xml:space="preserve">Life, Actually: From the First Cell to the Edited Genome and the Search for Life Elsewhere</w:t>
+      </w:r>
+    </w:p>
+    <w:p>
+      <w:pPr>
+        <w:ind w:left="360"/>
         <w:rPr>
           <w:sz w:val="22"/>
           <w:szCs w:val="22"/>
         </w:rPr>
       </w:pPr>
+    </w:p>
+    <w:p>
+      <w:pPr>
+        <w:keepNext/>
+        <w:rPr>
+          <w:sz w:val="22"/>
+          <w:szCs w:val="22"/>
+        </w:rPr>
+      </w:pPr>
       <w:r>
         <w:rPr>
           <w:rFonts w:ascii="Georgia" w:hAnsi="Georgia"/>
@@ -45708,7 +45664,7 @@
           <w:color w:val="2B2B2B"/>
           <w:szCs w:val="22"/>
         </w:rPr>
-        <w:t>Math, Actually</w:t>
+        <w:t xml:space="preserve">More Actually Books (coming soon)</w:t>
       </w:r>
       <w:r>
         <w:rPr>
@@ -45717,7 +45673,7 @@
           <w:color w:val="2B2B2B"/>
           <w:szCs w:val="22"/>
         </w:rPr>
-        <w:t xml:space="preserve"> (coming soon)</w:t>
+        <w:t xml:space="preserve"/>
       </w:r>
     </w:p>
     <w:p>
@@ -45725,7 +45681,7 @@
         <w:pStyle w:val="ListParagraph"/>
         <w:numPr>
           <w:ilvl w:val="0"/>
-          <w:numId w:val="7"/>
+          <w:numId w:val="6"/>
         </w:numPr>
         <w:rPr>
           <w:sz w:val="22"/>
@@ -45738,7 +45694,7 @@
           <w:color w:val="2B2B2B"/>
           <w:szCs w:val="22"/>
         </w:rPr>
-        <w:t>Math, Actually, Volume 1: From Arithmetic to Calculus</w:t>
+        <w:t xml:space="preserve">Gravitation, Actually: A Short Book on Gravity</w:t>
       </w:r>
     </w:p>
     <w:p>
@@ -45746,7 +45702,7 @@
         <w:pStyle w:val="ListParagraph"/>
         <w:numPr>
           <w:ilvl w:val="0"/>
-          <w:numId w:val="7"/>
+          <w:numId w:val="6"/>
         </w:numPr>
         <w:rPr>
           <w:sz w:val="22"/>
@@ -45759,7 +45715,43 @@
           <w:color w:val="2B2B2B"/>
           <w:szCs w:val="22"/>
         </w:rPr>
-        <w:t>Math, Actually, Volume 2: From Multivariable Calculus to Set Theory &amp; Logic</w:t>
+        <w:t xml:space="preserve">The Universe, Actually: What Humanity Currently Understands About Reality</w:t>
+      </w:r>
+    </w:p>
+    <w:p>
+      <w:pPr>
+        <w:ind w:left="360"/>
+        <w:rPr>
+          <w:sz w:val="22"/>
+          <w:szCs w:val="22"/>
+        </w:rPr>
+      </w:pPr>
+    </w:p>
+    <w:p>
+      <w:pPr>
+        <w:keepNext/>
+        <w:rPr>
+          <w:sz w:val="22"/>
+          <w:szCs w:val="22"/>
+        </w:rPr>
+      </w:pPr>
+      <w:r>
+        <w:rPr>
+          <w:rFonts w:ascii="Georgia" w:hAnsi="Georgia"/>
+          <w:b/>
+          <w:color w:val="2B2B2B"/>
+          <w:szCs w:val="22"/>
+        </w:rPr>
+        <w:t xml:space="preserve">Math, Actually (coming soon)</w:t>
+      </w:r>
+      <w:r>
+        <w:rPr>
+          <w:rFonts w:ascii="Georgia" w:hAnsi="Georgia"/>
+          <w:bCs/>
+          <w:color w:val="2B2B2B"/>
+          <w:szCs w:val="22"/>
+        </w:rPr>
+        <w:t xml:space="preserve"/>
       </w:r>
     </w:p>
     <w:p>
@@ -45767,7 +45759,7 @@
         <w:pStyle w:val="ListParagraph"/>
         <w:numPr>
           <w:ilvl w:val="0"/>
-          <w:numId w:val="7"/>
+          <w:numId w:val="6"/>
         </w:numPr>
         <w:rPr>
           <w:sz w:val="22"/>
@@ -45780,7 +45772,7 @@
           <w:color w:val="2B2B2B"/>
           <w:szCs w:val="22"/>
         </w:rPr>
-        <w:t>Math, Actually, Volume 3: From Differential Equations to Abstract Algebra</w:t>
+        <w:t xml:space="preserve">Math, Actually, Volume 1: From Arithmetic to Calculus</w:t>
       </w:r>
     </w:p>
     <w:p>
@@ -45788,57 +45780,20 @@
         <w:pStyle w:val="ListParagraph"/>
         <w:numPr>
           <w:ilvl w:val="0"/>
-          <w:numId w:val="7"/>
+          <w:numId w:val="6"/>
         </w:numPr>
-        <w:rPr>
-          <w:rFonts w:ascii="Georgia" w:hAnsi="Georgia"/>
-          <w:color w:val="2B2B2B"/>
-          <w:szCs w:val="22"/>
-        </w:rPr>
-      </w:pPr>
-      <w:r>
-        <w:rPr>
-          <w:rFonts w:ascii="Georgia" w:hAnsi="Georgia"/>
-          <w:color w:val="2B2B2B"/>
-          <w:szCs w:val="22"/>
-        </w:rPr>
-        <w:t>Math, Actually, Volume 4: From Category Theory to the Frontier</w:t>
-      </w:r>
-    </w:p>
-    <w:p>
-      <w:pPr>
-        <w:ind w:left="360"/>
         <w:rPr>
           <w:sz w:val="22"/>
           <w:szCs w:val="22"/>
         </w:rPr>
       </w:pPr>
-    </w:p>
-    <w:p>
-      <w:pPr>
-        <w:keepNext/>
-        <w:rPr>
-          <w:sz w:val="22"/>
+      <w:r>
+        <w:rPr>
+          <w:rFonts w:ascii="Georgia" w:hAnsi="Georgia"/>
+          <w:color w:val="2B2B2B"/>
           <w:szCs w:val="22"/>
         </w:rPr>
-      </w:pPr>
-      <w:r>
-        <w:rPr>
-          <w:rFonts w:ascii="Georgia" w:hAnsi="Georgia"/>
-          <w:b/>
-          <w:color w:val="2B2B2B"/>
-          <w:szCs w:val="22"/>
-        </w:rPr>
-        <w:t>Quantum, Actually</w:t>
-      </w:r>
-      <w:r>
-        <w:rPr>
-          <w:rFonts w:ascii="Georgia" w:hAnsi="Georgia"/>
-          <w:bCs/>
-          <w:color w:val="2B2B2B"/>
-          <w:szCs w:val="22"/>
-        </w:rPr>
-        <w:t xml:space="preserve"> (coming soon)</w:t>
+        <w:t xml:space="preserve">Math, Actually, Volume 2: From Multivariable Calculus to Set Theory &amp; Logic</w:t>
       </w:r>
     </w:p>
     <w:p>
@@ -45846,7 +45801,7 @@
         <w:pStyle w:val="ListParagraph"/>
         <w:numPr>
           <w:ilvl w:val="0"/>
-          <w:numId w:val="8"/>
+          <w:numId w:val="6"/>
         </w:numPr>
         <w:rPr>
           <w:sz w:val="22"/>
@@ -45859,7 +45814,7 @@
           <w:color w:val="2B2B2B"/>
           <w:szCs w:val="22"/>
         </w:rPr>
-        <w:t>Quantum, Actually, Volume 1: Questions and Answers from the Double Slit to the Superconducting Wire</w:t>
+        <w:t xml:space="preserve">Math, Actually, Volume 3: From Differential Equations to Abstract Algebra</w:t>
       </w:r>
     </w:p>
     <w:p>
@@ -45867,40 +45822,39 @@
         <w:pStyle w:val="ListParagraph"/>
         <w:numPr>
           <w:ilvl w:val="0"/>
-          <w:numId w:val="8"/>
+          <w:numId w:val="6"/>
         </w:numPr>
-        <w:rPr>
-          <w:rFonts w:ascii="Georgia" w:hAnsi="Georgia"/>
-          <w:color w:val="2B2B2B"/>
-          <w:szCs w:val="22"/>
-        </w:rPr>
-      </w:pPr>
-      <w:r>
-        <w:rPr>
-          <w:rFonts w:ascii="Georgia" w:hAnsi="Georgia"/>
-          <w:color w:val="2B2B2B"/>
-          <w:szCs w:val="22"/>
-        </w:rPr>
-        <w:t>Quantum, Actually, Volume 2: A QED Course</w:t>
-      </w:r>
-    </w:p>
-    <w:p>
-      <w:pPr>
-        <w:ind w:left="360"/>
         <w:rPr>
           <w:sz w:val="22"/>
           <w:szCs w:val="22"/>
         </w:rPr>
       </w:pPr>
-    </w:p>
-    <w:p>
-      <w:pPr>
-        <w:keepNext/>
+      <w:r>
+        <w:rPr>
+          <w:rFonts w:ascii="Georgia" w:hAnsi="Georgia"/>
+          <w:color w:val="2B2B2B"/>
+          <w:szCs w:val="22"/>
+        </w:rPr>
+        <w:t xml:space="preserve">Math, Actually, Volume 4: From Category Theory to the Frontier</w:t>
+      </w:r>
+    </w:p>
+    <w:p>
+      <w:pPr>
+        <w:ind w:left="360"/>
         <w:rPr>
           <w:sz w:val="22"/>
           <w:szCs w:val="22"/>
         </w:rPr>
       </w:pPr>
+    </w:p>
+    <w:p>
+      <w:pPr>
+        <w:keepNext/>
+        <w:rPr>
+          <w:sz w:val="22"/>
+          <w:szCs w:val="22"/>
+        </w:rPr>
+      </w:pPr>
       <w:r>
         <w:rPr>
           <w:rFonts w:ascii="Georgia" w:hAnsi="Georgia"/>
@@ -45908,8 +45862,7 @@
           <w:color w:val="2B2B2B"/>
           <w:szCs w:val="22"/>
         </w:rPr>
-        <w:lastRenderedPageBreak/>
-        <w:t>Science Sparks</w:t>
+        <w:t xml:space="preserve">Quantum, Actually (coming soon)</w:t>
       </w:r>
       <w:r>
         <w:rPr>
@@ -45918,7 +45871,7 @@
           <w:color w:val="2B2B2B"/>
           <w:szCs w:val="22"/>
         </w:rPr>
-        <w:t xml:space="preserve"> (coming soon)</w:t>
+        <w:t xml:space="preserve"/>
       </w:r>
     </w:p>
     <w:p>
@@ -45926,57 +45879,20 @@
         <w:pStyle w:val="ListParagraph"/>
         <w:numPr>
           <w:ilvl w:val="0"/>
-          <w:numId w:val="9"/>
+          <w:numId w:val="6"/>
         </w:numPr>
-        <w:rPr>
-          <w:rFonts w:ascii="Georgia" w:hAnsi="Georgia"/>
-          <w:color w:val="2B2B2B"/>
-          <w:szCs w:val="22"/>
-        </w:rPr>
-      </w:pPr>
-      <w:r>
-        <w:rPr>
-          <w:rFonts w:ascii="Georgia" w:hAnsi="Georgia"/>
-          <w:color w:val="2B2B2B"/>
-          <w:szCs w:val="22"/>
-        </w:rPr>
-        <w:t>Science Sparks: Physics, Life, and Mathematics</w:t>
-      </w:r>
-    </w:p>
-    <w:p>
-      <w:pPr>
-        <w:ind w:left="360"/>
         <w:rPr>
           <w:sz w:val="22"/>
           <w:szCs w:val="22"/>
         </w:rPr>
       </w:pPr>
-    </w:p>
-    <w:p>
-      <w:pPr>
-        <w:keepNext/>
-        <w:rPr>
-          <w:sz w:val="22"/>
+      <w:r>
+        <w:rPr>
+          <w:rFonts w:ascii="Georgia" w:hAnsi="Georgia"/>
+          <w:color w:val="2B2B2B"/>
           <w:szCs w:val="22"/>
         </w:rPr>
-      </w:pPr>
-      <w:r>
-        <w:rPr>
-          <w:rFonts w:ascii="Georgia" w:hAnsi="Georgia"/>
-          <w:b/>
-          <w:color w:val="2B2B2B"/>
-          <w:szCs w:val="22"/>
-        </w:rPr>
-        <w:t>Look First</w:t>
-      </w:r>
-      <w:r>
-        <w:rPr>
-          <w:rFonts w:ascii="Georgia" w:hAnsi="Georgia"/>
-          <w:bCs/>
-          <w:color w:val="2B2B2B"/>
-          <w:szCs w:val="22"/>
-        </w:rPr>
-        <w:t xml:space="preserve"> (coming soon)</w:t>
+        <w:t xml:space="preserve">Quantum, Actually, Volume 1: Questions and Answers from the Double Slit to the Superconducting Wire</w:t>
       </w:r>
     </w:p>
     <w:p>
@@ -45984,7 +45900,7 @@
         <w:pStyle w:val="ListParagraph"/>
         <w:numPr>
           <w:ilvl w:val="0"/>
-          <w:numId w:val="3"/>
+          <w:numId w:val="6"/>
         </w:numPr>
         <w:rPr>
           <w:sz w:val="22"/>
@@ -45997,7 +45913,43 @@
           <w:color w:val="2B2B2B"/>
           <w:szCs w:val="22"/>
         </w:rPr>
-        <w:t>Look First, Volume 1: The Universe Has No Now</w:t>
+        <w:t xml:space="preserve">Quantum, Actually, Volume 2: A QED Course</w:t>
+      </w:r>
+    </w:p>
+    <w:p>
+      <w:pPr>
+        <w:ind w:left="360"/>
+        <w:rPr>
+          <w:sz w:val="22"/>
+          <w:szCs w:val="22"/>
+        </w:rPr>
+      </w:pPr>
+    </w:p>
+    <w:p>
+      <w:pPr>
+        <w:keepNext/>
+        <w:rPr>
+          <w:sz w:val="22"/>
+          <w:szCs w:val="22"/>
+        </w:rPr>
+      </w:pPr>
+      <w:r>
+        <w:rPr>
+          <w:rFonts w:ascii="Georgia" w:hAnsi="Georgia"/>
+          <w:b/>
+          <w:color w:val="2B2B2B"/>
+          <w:szCs w:val="22"/>
+        </w:rPr>
+        <w:t xml:space="preserve">Science Sparks (coming soon)</w:t>
+      </w:r>
+      <w:r>
+        <w:rPr>
+          <w:rFonts w:ascii="Georgia" w:hAnsi="Georgia"/>
+          <w:bCs/>
+          <w:color w:val="2B2B2B"/>
+          <w:szCs w:val="22"/>
+        </w:rPr>
+        <w:t xml:space="preserve"/>
       </w:r>
     </w:p>
     <w:p>
@@ -46005,40 +45957,39 @@
         <w:pStyle w:val="ListParagraph"/>
         <w:numPr>
           <w:ilvl w:val="0"/>
-          <w:numId w:val="3"/>
+          <w:numId w:val="6"/>
         </w:numPr>
-        <w:rPr>
-          <w:rFonts w:ascii="Georgia" w:hAnsi="Georgia"/>
-          <w:color w:val="2B2B2B"/>
-          <w:szCs w:val="22"/>
-        </w:rPr>
-      </w:pPr>
-      <w:r>
-        <w:rPr>
-          <w:rFonts w:ascii="Georgia" w:hAnsi="Georgia"/>
-          <w:color w:val="2B2B2B"/>
-          <w:szCs w:val="22"/>
-        </w:rPr>
-        <w:t>Look First, Volume 2: A Trip Is Not a New Life</w:t>
-      </w:r>
-    </w:p>
-    <w:p>
-      <w:pPr>
-        <w:ind w:left="360"/>
         <w:rPr>
           <w:sz w:val="22"/>
           <w:szCs w:val="22"/>
         </w:rPr>
       </w:pPr>
-    </w:p>
-    <w:p>
-      <w:pPr>
-        <w:keepNext/>
+      <w:r>
+        <w:rPr>
+          <w:rFonts w:ascii="Georgia" w:hAnsi="Georgia"/>
+          <w:color w:val="2B2B2B"/>
+          <w:szCs w:val="22"/>
+        </w:rPr>
+        <w:t xml:space="preserve">Science Sparks: Physics, Life, and Mathematics — The Same Few Rules, Told in Highlights</w:t>
+      </w:r>
+    </w:p>
+    <w:p>
+      <w:pPr>
+        <w:ind w:left="360"/>
         <w:rPr>
           <w:sz w:val="22"/>
           <w:szCs w:val="22"/>
         </w:rPr>
       </w:pPr>
+    </w:p>
+    <w:p>
+      <w:pPr>
+        <w:keepNext/>
+        <w:rPr>
+          <w:sz w:val="22"/>
+          <w:szCs w:val="22"/>
+        </w:rPr>
+      </w:pPr>
       <w:r>
         <w:rPr>
           <w:rFonts w:ascii="Georgia" w:hAnsi="Georgia"/>
@@ -46046,7 +45997,7 @@
           <w:color w:val="2B2B2B"/>
           <w:szCs w:val="22"/>
         </w:rPr>
-        <w:t>Electrical Engineering Series</w:t>
+        <w:t xml:space="preserve">Look First (coming soon)</w:t>
       </w:r>
       <w:r>
         <w:rPr>
@@ -46055,7 +46006,7 @@
           <w:color w:val="2B2B2B"/>
           <w:szCs w:val="22"/>
         </w:rPr>
-        <w:t xml:space="preserve"> (coming soon)</w:t>
+        <w:t xml:space="preserve"/>
       </w:r>
     </w:p>
     <w:p>
@@ -46063,7 +46014,7 @@
         <w:pStyle w:val="ListParagraph"/>
         <w:numPr>
           <w:ilvl w:val="0"/>
-          <w:numId w:val="10"/>
+          <w:numId w:val="6"/>
         </w:numPr>
         <w:rPr>
           <w:sz w:val="22"/>
@@ -46076,7 +46027,7 @@
           <w:color w:val="2B2B2B"/>
           <w:szCs w:val="22"/>
         </w:rPr>
-        <w:t>Foundations of Electronics (Book 1)</w:t>
+        <w:t xml:space="preserve">Look First, Volume 1: The Universe Has No Now</w:t>
       </w:r>
     </w:p>
     <w:p>
@@ -46084,7 +46035,7 @@
         <w:pStyle w:val="ListParagraph"/>
         <w:numPr>
           <w:ilvl w:val="0"/>
-          <w:numId w:val="10"/>
+          <w:numId w:val="6"/>
         </w:numPr>
         <w:rPr>
           <w:sz w:val="22"/>
@@ -46097,7 +46048,43 @@
           <w:color w:val="2B2B2B"/>
           <w:szCs w:val="22"/>
         </w:rPr>
-        <w:t>Circuits, Components, and Control (Book 2)</w:t>
+        <w:t xml:space="preserve">Look First, Volume 2: A Trip Is Not a New Life</w:t>
+      </w:r>
+    </w:p>
+    <w:p>
+      <w:pPr>
+        <w:ind w:left="360"/>
+        <w:rPr>
+          <w:sz w:val="22"/>
+          <w:szCs w:val="22"/>
+        </w:rPr>
+      </w:pPr>
+    </w:p>
+    <w:p>
+      <w:pPr>
+        <w:keepNext/>
+        <w:rPr>
+          <w:sz w:val="22"/>
+          <w:szCs w:val="22"/>
+        </w:rPr>
+      </w:pPr>
+      <w:r>
+        <w:rPr>
+          <w:rFonts w:ascii="Georgia" w:hAnsi="Georgia"/>
+          <w:b/>
+          <w:color w:val="2B2B2B"/>
+          <w:szCs w:val="22"/>
+        </w:rPr>
+        <w:t xml:space="preserve">Electrical Engineering Series (coming soon)</w:t>
+      </w:r>
+      <w:r>
+        <w:rPr>
+          <w:rFonts w:ascii="Georgia" w:hAnsi="Georgia"/>
+          <w:bCs/>
+          <w:color w:val="2B2B2B"/>
+          <w:szCs w:val="22"/>
+        </w:rPr>
+        <w:t xml:space="preserve"/>
       </w:r>
     </w:p>
     <w:p>
@@ -46105,7 +46092,7 @@
         <w:pStyle w:val="ListParagraph"/>
         <w:numPr>
           <w:ilvl w:val="0"/>
-          <w:numId w:val="10"/>
+          <w:numId w:val="6"/>
         </w:numPr>
         <w:rPr>
           <w:sz w:val="22"/>
@@ -46118,7 +46105,7 @@
           <w:color w:val="2B2B2B"/>
           <w:szCs w:val="22"/>
         </w:rPr>
-        <w:t>Semiconductor Physics and Devices (Book 3)</w:t>
+        <w:t xml:space="preserve">Foundations of Electronics (Book 1)</w:t>
       </w:r>
     </w:p>
     <w:p>
@@ -46126,7 +46113,7 @@
         <w:pStyle w:val="ListParagraph"/>
         <w:numPr>
           <w:ilvl w:val="0"/>
-          <w:numId w:val="10"/>
+          <w:numId w:val="6"/>
         </w:numPr>
         <w:rPr>
           <w:sz w:val="22"/>
@@ -46139,7 +46126,7 @@
           <w:color w:val="2B2B2B"/>
           <w:szCs w:val="22"/>
         </w:rPr>
-        <w:t>RF, Microwave, and Transceivers (Book 4)</w:t>
+        <w:t xml:space="preserve">Circuits, Components, and Control (Book 2)</w:t>
       </w:r>
     </w:p>
     <w:p>
@@ -46147,7 +46134,7 @@
         <w:pStyle w:val="ListParagraph"/>
         <w:numPr>
           <w:ilvl w:val="0"/>
-          <w:numId w:val="10"/>
+          <w:numId w:val="6"/>
         </w:numPr>
         <w:rPr>
           <w:sz w:val="22"/>
@@ -46160,7 +46147,7 @@
           <w:color w:val="2B2B2B"/>
           <w:szCs w:val="22"/>
         </w:rPr>
-        <w:t>Communications, Wireless, and SDR (Book 5)</w:t>
+        <w:t xml:space="preserve">Semiconductor Physics and Devices (Book 3)</w:t>
       </w:r>
     </w:p>
     <w:p>
@@ -46168,7 +46155,7 @@
         <w:pStyle w:val="ListParagraph"/>
         <w:numPr>
           <w:ilvl w:val="0"/>
-          <w:numId w:val="10"/>
+          <w:numId w:val="6"/>
         </w:numPr>
         <w:rPr>
           <w:sz w:val="22"/>
@@ -46181,7 +46168,7 @@
           <w:color w:val="2B2B2B"/>
           <w:szCs w:val="22"/>
         </w:rPr>
-        <w:t>Power and Energy (Book 6)</w:t>
+        <w:t xml:space="preserve">RF, Microwave, and Transceivers (Book 4)</w:t>
       </w:r>
     </w:p>
     <w:p>
@@ -46189,57 +46176,20 @@
         <w:pStyle w:val="ListParagraph"/>
         <w:numPr>
           <w:ilvl w:val="0"/>
-          <w:numId w:val="10"/>
+          <w:numId w:val="6"/>
         </w:numPr>
-        <w:rPr>
-          <w:rFonts w:ascii="Georgia" w:hAnsi="Georgia"/>
-          <w:color w:val="2B2B2B"/>
-          <w:szCs w:val="22"/>
-        </w:rPr>
-      </w:pPr>
-      <w:r>
-        <w:rPr>
-          <w:rFonts w:ascii="Georgia" w:hAnsi="Georgia"/>
-          <w:color w:val="2B2B2B"/>
-          <w:szCs w:val="22"/>
-        </w:rPr>
-        <w:t>Packaging, Layout, EMC, and Test (Book 7)</w:t>
-      </w:r>
-    </w:p>
-    <w:p>
-      <w:pPr>
-        <w:ind w:left="360"/>
         <w:rPr>
           <w:sz w:val="22"/>
           <w:szCs w:val="22"/>
         </w:rPr>
       </w:pPr>
-    </w:p>
-    <w:p>
-      <w:pPr>
-        <w:keepNext/>
-        <w:rPr>
-          <w:sz w:val="22"/>
+      <w:r>
+        <w:rPr>
+          <w:rFonts w:ascii="Georgia" w:hAnsi="Georgia"/>
+          <w:color w:val="2B2B2B"/>
           <w:szCs w:val="22"/>
         </w:rPr>
-      </w:pPr>
-      <w:r>
-        <w:rPr>
-          <w:rFonts w:ascii="Georgia" w:hAnsi="Georgia"/>
-          <w:b/>
-          <w:color w:val="2B2B2B"/>
-          <w:szCs w:val="22"/>
-        </w:rPr>
-        <w:t>History</w:t>
-      </w:r>
-      <w:r>
-        <w:rPr>
-          <w:rFonts w:ascii="Georgia" w:hAnsi="Georgia"/>
-          <w:bCs/>
-          <w:color w:val="2B2B2B"/>
-          <w:szCs w:val="22"/>
-        </w:rPr>
-        <w:t xml:space="preserve"> (coming soon)</w:t>
+        <w:t xml:space="preserve">Communications, Wireless, and SDR (Book 5)</w:t>
       </w:r>
     </w:p>
     <w:p>
@@ -46247,57 +46197,20 @@
         <w:pStyle w:val="ListParagraph"/>
         <w:numPr>
           <w:ilvl w:val="0"/>
-          <w:numId w:val="4"/>
+          <w:numId w:val="6"/>
         </w:numPr>
-        <w:rPr>
-          <w:rFonts w:ascii="Georgia" w:hAnsi="Georgia"/>
-          <w:color w:val="2B2B2B"/>
-          <w:szCs w:val="22"/>
-        </w:rPr>
-      </w:pPr>
-      <w:r>
-        <w:rPr>
-          <w:rFonts w:ascii="Georgia" w:hAnsi="Georgia"/>
-          <w:color w:val="2B2B2B"/>
-          <w:szCs w:val="22"/>
-        </w:rPr>
-        <w:t>The Dolphins’ View of History</w:t>
-      </w:r>
-    </w:p>
-    <w:p>
-      <w:pPr>
-        <w:ind w:left="360"/>
         <w:rPr>
           <w:sz w:val="22"/>
           <w:szCs w:val="22"/>
         </w:rPr>
       </w:pPr>
-    </w:p>
-    <w:p>
-      <w:pPr>
-        <w:keepNext/>
-        <w:rPr>
-          <w:sz w:val="22"/>
+      <w:r>
+        <w:rPr>
+          <w:rFonts w:ascii="Georgia" w:hAnsi="Georgia"/>
+          <w:color w:val="2B2B2B"/>
           <w:szCs w:val="22"/>
         </w:rPr>
-      </w:pPr>
-      <w:r>
-        <w:rPr>
-          <w:rFonts w:ascii="Georgia" w:hAnsi="Georgia"/>
-          <w:b/>
-          <w:color w:val="2B2B2B"/>
-          <w:szCs w:val="22"/>
-        </w:rPr>
-        <w:t>Fiction</w:t>
-      </w:r>
-      <w:r>
-        <w:rPr>
-          <w:rFonts w:ascii="Georgia" w:hAnsi="Georgia"/>
-          <w:bCs/>
-          <w:color w:val="2B2B2B"/>
-          <w:szCs w:val="22"/>
-        </w:rPr>
-        <w:t xml:space="preserve"> (coming soon)</w:t>
+        <w:t xml:space="preserve">Power and Energy (Book 6)</w:t>
       </w:r>
     </w:p>
     <w:p>
@@ -46305,7 +46218,7 @@
         <w:pStyle w:val="ListParagraph"/>
         <w:numPr>
           <w:ilvl w:val="0"/>
-          <w:numId w:val="4"/>
+          <w:numId w:val="6"/>
         </w:numPr>
         <w:rPr>
           <w:sz w:val="22"/>
@@ -46318,7 +46231,43 @@
           <w:color w:val="2B2B2B"/>
           <w:szCs w:val="22"/>
         </w:rPr>
-        <w:t>The Murder That Hadn’t Happened Yet (The Relativistic Investigation Bureau, Book 1)</w:t>
+        <w:t xml:space="preserve">Packaging, Layout, EMC, and Test (Book 7)</w:t>
+      </w:r>
+    </w:p>
+    <w:p>
+      <w:pPr>
+        <w:ind w:left="360"/>
+        <w:rPr>
+          <w:sz w:val="22"/>
+          <w:szCs w:val="22"/>
+        </w:rPr>
+      </w:pPr>
+    </w:p>
+    <w:p>
+      <w:pPr>
+        <w:keepNext/>
+        <w:rPr>
+          <w:sz w:val="22"/>
+          <w:szCs w:val="22"/>
+        </w:rPr>
+      </w:pPr>
+      <w:r>
+        <w:rPr>
+          <w:rFonts w:ascii="Georgia" w:hAnsi="Georgia"/>
+          <w:b/>
+          <w:color w:val="2B2B2B"/>
+          <w:szCs w:val="22"/>
+        </w:rPr>
+        <w:t xml:space="preserve">History (coming soon)</w:t>
+      </w:r>
+      <w:r>
+        <w:rPr>
+          <w:rFonts w:ascii="Georgia" w:hAnsi="Georgia"/>
+          <w:bCs/>
+          <w:color w:val="2B2B2B"/>
+          <w:szCs w:val="22"/>
+        </w:rPr>
+        <w:t xml:space="preserve"/>
       </w:r>
     </w:p>
     <w:p>
@@ -46326,7 +46275,7 @@
         <w:pStyle w:val="ListParagraph"/>
         <w:numPr>
           <w:ilvl w:val="0"/>
-          <w:numId w:val="4"/>
+          <w:numId w:val="6"/>
         </w:numPr>
         <w:rPr>
           <w:sz w:val="22"/>
@@ -46339,7 +46288,43 @@
           <w:color w:val="2B2B2B"/>
           <w:szCs w:val="22"/>
         </w:rPr>
-        <w:t>The Warning That Was Sent Too Late (The Relativistic Investigation Bureau, Book 2)</w:t>
+        <w:t xml:space="preserve">The Dolphins’ View of History</w:t>
+      </w:r>
+    </w:p>
+    <w:p>
+      <w:pPr>
+        <w:ind w:left="360"/>
+        <w:rPr>
+          <w:sz w:val="22"/>
+          <w:szCs w:val="22"/>
+        </w:rPr>
+      </w:pPr>
+    </w:p>
+    <w:p>
+      <w:pPr>
+        <w:keepNext/>
+        <w:rPr>
+          <w:sz w:val="22"/>
+          <w:szCs w:val="22"/>
+        </w:rPr>
+      </w:pPr>
+      <w:r>
+        <w:rPr>
+          <w:rFonts w:ascii="Georgia" w:hAnsi="Georgia"/>
+          <w:b/>
+          <w:color w:val="2B2B2B"/>
+          <w:szCs w:val="22"/>
+        </w:rPr>
+        <w:t xml:space="preserve">Fiction (coming soon)</w:t>
+      </w:r>
+      <w:r>
+        <w:rPr>
+          <w:rFonts w:ascii="Georgia" w:hAnsi="Georgia"/>
+          <w:bCs/>
+          <w:color w:val="2B2B2B"/>
+          <w:szCs w:val="22"/>
+        </w:rPr>
+        <w:t xml:space="preserve"/>
       </w:r>
     </w:p>
     <w:p>
@@ -46347,7 +46332,7 @@
         <w:pStyle w:val="ListParagraph"/>
         <w:numPr>
           <w:ilvl w:val="0"/>
-          <w:numId w:val="4"/>
+          <w:numId w:val="6"/>
         </w:numPr>
         <w:rPr>
           <w:sz w:val="22"/>
@@ -46360,7 +46345,7 @@
           <w:color w:val="2B2B2B"/>
           <w:szCs w:val="22"/>
         </w:rPr>
-        <w:t>Schrödinger’s Paperwork (Lolly Wren’s Curious Science Adventures, Book 1)</w:t>
+        <w:t xml:space="preserve">The Murder That Hadn’t Happened Yet (The Relativistic Investigation Bureau, Book 1), Lothar J. Musiol writing as Spezala Genara Relavi (S.G.R.)</w:t>
       </w:r>
     </w:p>
     <w:p>
@@ -46368,7 +46353,7 @@
         <w:pStyle w:val="ListParagraph"/>
         <w:numPr>
           <w:ilvl w:val="0"/>
-          <w:numId w:val="4"/>
+          <w:numId w:val="6"/>
         </w:numPr>
         <w:rPr>
           <w:sz w:val="22"/>
@@ -46381,43 +46366,7 @@
           <w:color w:val="2B2B2B"/>
           <w:szCs w:val="22"/>
         </w:rPr>
-        <w:t>The Permitted Options (Lolly Wren’s Curious Science Adventures, Book 2)</w:t>
-      </w:r>
-    </w:p>
-    <w:p>
-      <w:pPr>
-        <w:ind w:left="360"/>
-        <w:rPr>
-          <w:sz w:val="22"/>
-          <w:szCs w:val="22"/>
-        </w:rPr>
-      </w:pPr>
-    </w:p>
-    <w:p>
-      <w:pPr>
-        <w:keepNext/>
-        <w:rPr>
-          <w:sz w:val="22"/>
-          <w:szCs w:val="22"/>
-        </w:rPr>
-      </w:pPr>
-      <w:r>
-        <w:rPr>
-          <w:rFonts w:ascii="Georgia" w:hAnsi="Georgia"/>
-          <w:b/>
-          <w:color w:val="2B2B2B"/>
-          <w:szCs w:val="22"/>
-        </w:rPr>
-        <w:t>How-To</w:t>
-      </w:r>
-      <w:r>
-        <w:rPr>
-          <w:rFonts w:ascii="Georgia" w:hAnsi="Georgia"/>
-          <w:bCs/>
-          <w:color w:val="2B2B2B"/>
-          <w:szCs w:val="22"/>
-        </w:rPr>
-        <w:t xml:space="preserve"> (available at Amazon Kindle, KDP)</w:t>
+        <w:t xml:space="preserve">The Warning That Was Sent Too Late (The Relativistic Investigation Bureau, Book 2), Lothar J. Musiol writing as Spezala Genara Relavi (S.G.R.)</w:t>
       </w:r>
     </w:p>
     <w:p>
@@ -46425,11 +46374,10 @@
         <w:pStyle w:val="ListParagraph"/>
         <w:numPr>
           <w:ilvl w:val="0"/>
-          <w:numId w:val="5"/>
+          <w:numId w:val="6"/>
         </w:numPr>
         <w:rPr>
-          <w:rFonts w:ascii="Georgia" w:hAnsi="Georgia"/>
-          <w:color w:val="2B2B2B"/>
+          <w:sz w:val="22"/>
           <w:szCs w:val="22"/>
         </w:rPr>
       </w:pPr>
@@ -46439,7 +46387,7 @@
           <w:color w:val="2B2B2B"/>
           <w:szCs w:val="22"/>
         </w:rPr>
-        <w:t>How to Publish Your First Kindle Book</w:t>
+        <w:t xml:space="preserve">Schrödinger’s Paperwork (Lolly Wren’s Curious Science Adventures, Book 1), Lothar J. Musiol writing as Quentin Edmund Darling (Q.E.D.)</w:t>
       </w:r>
     </w:p>
     <w:p>
@@ -46447,11 +46395,10 @@
         <w:pStyle w:val="ListParagraph"/>
         <w:numPr>
           <w:ilvl w:val="0"/>
-          <w:numId w:val="5"/>
+          <w:numId w:val="6"/>
         </w:numPr>
         <w:rPr>
-          <w:rFonts w:ascii="Georgia" w:hAnsi="Georgia"/>
-          <w:color w:val="2B2B2B"/>
+          <w:sz w:val="22"/>
           <w:szCs w:val="22"/>
         </w:rPr>
       </w:pPr>
@@ -46461,7 +46408,7 @@
           <w:color w:val="2B2B2B"/>
           <w:szCs w:val="22"/>
         </w:rPr>
-        <w:t>Your First YouTube Channel That Rocks</w:t>
+        <w:t xml:space="preserve">The Permitted Options (Lolly Wren’s Curious Science Adventures, Book 2), Lothar J. Musiol writing as Quentin Edmund Darling (Q.E.D.)</w:t>
       </w:r>
     </w:p>
     <w:p>
@@ -46469,13 +46416,11 @@
         <w:pStyle w:val="ListParagraph"/>
         <w:numPr>
           <w:ilvl w:val="0"/>
-          <w:numId w:val="5"/>
+          <w:numId w:val="6"/>
         </w:numPr>
         <w:rPr>
-          <w:rFonts w:ascii="Georgia" w:hAnsi="Georgia"/>
-          <w:color w:val="2B2B2B"/>
+          <w:sz w:val="22"/>
           <w:szCs w:val="22"/>
-          <w:lang w:val="de-DE"/>
         </w:rPr>
       </w:pPr>
       <w:r>
@@ -46483,9 +46428,65 @@
           <w:rFonts w:ascii="Georgia" w:hAnsi="Georgia"/>
           <w:color w:val="2B2B2B"/>
           <w:szCs w:val="22"/>
-          <w:lang w:val="de-DE"/>
-        </w:rPr>
-        <w:t>Auswandern - Ab in die USA, CA, AUS oder NZ</w:t>
+        </w:rPr>
+        <w:t xml:space="preserve">In Love with Murder, Actually: A Comic Mystery, Lothar J. Musiol writing as Romuald Livingston</w:t>
+      </w:r>
+    </w:p>
+    <w:p>
+      <w:pPr>
+        <w:ind w:left="360"/>
+        <w:rPr>
+          <w:sz w:val="22"/>
+          <w:szCs w:val="22"/>
+        </w:rPr>
+      </w:pPr>
+    </w:p>
+    <w:p>
+      <w:pPr>
+        <w:keepNext/>
+        <w:rPr>
+          <w:sz w:val="22"/>
+          <w:szCs w:val="22"/>
+        </w:rPr>
+      </w:pPr>
+      <w:r>
+        <w:rPr>
+          <w:rFonts w:ascii="Georgia" w:hAnsi="Georgia"/>
+          <w:b/>
+          <w:color w:val="2B2B2B"/>
+          <w:szCs w:val="22"/>
+        </w:rPr>
+        <w:t xml:space="preserve">In German</w:t>
+      </w:r>
+      <w:r>
+        <w:rPr>
+          <w:rFonts w:ascii="Georgia" w:hAnsi="Georgia"/>
+          <w:bCs/>
+          <w:color w:val="2B2B2B"/>
+          <w:szCs w:val="22"/>
+        </w:rPr>
+        <w:t xml:space="preserve"/>
+      </w:r>
+    </w:p>
+    <w:p>
+      <w:pPr>
+        <w:pStyle w:val="ListParagraph"/>
+        <w:numPr>
+          <w:ilvl w:val="0"/>
+          <w:numId w:val="6"/>
+        </w:numPr>
+        <w:rPr>
+          <w:sz w:val="22"/>
+          <w:szCs w:val="22"/>
+        </w:rPr>
+      </w:pPr>
+      <w:r>
+        <w:rPr>
+          <w:rFonts w:ascii="Georgia" w:hAnsi="Georgia"/>
+          <w:color w:val="2B2B2B"/>
+          <w:szCs w:val="22"/>
+        </w:rPr>
+        <w:t xml:space="preserve">Auswandern – Ab in die USA, Kanada, Australien oder Neuseeland?</w:t>
       </w:r>
     </w:p>
     <w:p>

</xml_diff>

<commit_message>
Also-by: Protocol Flamingo to canonical list [merged onto main from book-2-lectures-after-qed 6d1ecce, paths only]
</commit_message>
<xml_diff>
--- a/Protocol Flamingo/Protocol_Flamingo_REV10.docx
+++ b/Protocol Flamingo/Protocol_Flamingo_REV10.docx
@@ -45544,7 +45544,7 @@
           <w:color w:val="2B2B2B"/>
           <w:szCs w:val="22"/>
         </w:rPr>
-        <w:t>Physics, Actually</w:t>
+        <w:t xml:space="preserve">Physics, Actually (coming soon)</w:t>
       </w:r>
       <w:r>
         <w:rPr>
@@ -45553,7 +45553,7 @@
           <w:color w:val="2B2B2B"/>
           <w:szCs w:val="22"/>
         </w:rPr>
-        <w:t xml:space="preserve"> (coming soon)</w:t>
+        <w:t xml:space="preserve"/>
       </w:r>
     </w:p>
     <w:p>
@@ -45574,7 +45574,7 @@
           <w:color w:val="2B2B2B"/>
           <w:szCs w:val="22"/>
         </w:rPr>
-        <w:t>Physics, Actually, Volume 1: Motion, Forces, Time, and Relativity</w:t>
+        <w:t xml:space="preserve">Physics, Actually, Volume 1: Motion, Forces, Time, and Relativity</w:t>
       </w:r>
     </w:p>
     <w:p>
@@ -45595,7 +45595,7 @@
           <w:color w:val="2B2B2B"/>
           <w:szCs w:val="22"/>
         </w:rPr>
-        <w:t>Physics, Actually, Volume 2: Gravity, Cosmology, and the Limits of Spacetime</w:t>
+        <w:t xml:space="preserve">Physics, Actually, Volume 2: Gravity, Cosmology, and the Limits of Spacetime</w:t>
       </w:r>
     </w:p>
     <w:p>
@@ -45616,50 +45616,7 @@
           <w:color w:val="2B2B2B"/>
           <w:szCs w:val="22"/>
         </w:rPr>
-        <w:t>Physics, Actually, Volume 3: The Standard Model, Chaos, and the Edge of Knowledge</w:t>
-      </w:r>
-    </w:p>
-    <w:p>
-      <w:pPr>
-        <w:pStyle w:val="ListParagraph"/>
-        <w:ind w:left="648"/>
-        <w:rPr>
-          <w:rFonts w:ascii="Georgia" w:hAnsi="Georgia"/>
-          <w:color w:val="2B2B2B"/>
-          <w:szCs w:val="22"/>
-        </w:rPr>
-      </w:pPr>
-    </w:p>
-    <w:p>
-      <w:pPr>
-        <w:pStyle w:val="ListParagraph"/>
-        <w:ind w:left="288"/>
-        <w:rPr>
-          <w:rFonts w:ascii="Georgia" w:hAnsi="Georgia"/>
-          <w:b/>
-          <w:bCs/>
-          <w:color w:val="2B2B2B"/>
-          <w:szCs w:val="22"/>
-        </w:rPr>
-      </w:pPr>
-      <w:r>
-        <w:rPr>
-          <w:rFonts w:ascii="Georgia" w:hAnsi="Georgia"/>
-          <w:b/>
-          <w:bCs/>
-          <w:color w:val="2B2B2B"/>
-          <w:szCs w:val="22"/>
-        </w:rPr>
-        <w:t>Life, Actually</w:t>
-      </w:r>
-      <w:r>
-        <w:rPr>
-          <w:rFonts w:ascii="Georgia" w:hAnsi="Georgia"/>
-          <w:bCs/>
-          <w:color w:val="2B2B2B"/>
-          <w:szCs w:val="22"/>
-        </w:rPr>
-        <w:t xml:space="preserve"> (coming soon)</w:t>
+        <w:t xml:space="preserve">Physics, Actually, Volume 3: The Standard Model, Chaos, and the Edge of Knowledge</w:t>
       </w:r>
     </w:p>
     <w:p>
@@ -45667,40 +45624,39 @@
         <w:pStyle w:val="ListParagraph"/>
         <w:numPr>
           <w:ilvl w:val="0"/>
-          <w:numId w:val="11"/>
+          <w:numId w:val="6"/>
         </w:numPr>
-        <w:rPr>
-          <w:rFonts w:ascii="Georgia" w:hAnsi="Georgia"/>
-          <w:color w:val="2B2B2B"/>
-          <w:szCs w:val="22"/>
-        </w:rPr>
-      </w:pPr>
-      <w:r>
-        <w:rPr>
-          <w:rFonts w:ascii="Georgia" w:hAnsi="Georgia"/>
-          <w:color w:val="2B2B2B"/>
-          <w:szCs w:val="22"/>
-        </w:rPr>
-        <w:t>From the First Cell to the Edited Genome and the Search for Life Elsewhere</w:t>
-      </w:r>
-    </w:p>
-    <w:p>
-      <w:pPr>
-        <w:ind w:left="360"/>
         <w:rPr>
           <w:sz w:val="22"/>
           <w:szCs w:val="22"/>
         </w:rPr>
       </w:pPr>
-    </w:p>
-    <w:p>
-      <w:pPr>
-        <w:keepNext/>
+      <w:r>
+        <w:rPr>
+          <w:rFonts w:ascii="Georgia" w:hAnsi="Georgia"/>
+          <w:color w:val="2B2B2B"/>
+          <w:szCs w:val="22"/>
+        </w:rPr>
+        <w:t xml:space="preserve">Life, Actually: From the First Cell to the Edited Genome and the Search for Life Elsewhere</w:t>
+      </w:r>
+    </w:p>
+    <w:p>
+      <w:pPr>
+        <w:ind w:left="360"/>
         <w:rPr>
           <w:sz w:val="22"/>
           <w:szCs w:val="22"/>
         </w:rPr>
       </w:pPr>
+    </w:p>
+    <w:p>
+      <w:pPr>
+        <w:keepNext/>
+        <w:rPr>
+          <w:sz w:val="22"/>
+          <w:szCs w:val="22"/>
+        </w:rPr>
+      </w:pPr>
       <w:r>
         <w:rPr>
           <w:rFonts w:ascii="Georgia" w:hAnsi="Georgia"/>
@@ -45708,7 +45664,7 @@
           <w:color w:val="2B2B2B"/>
           <w:szCs w:val="22"/>
         </w:rPr>
-        <w:t>Math, Actually</w:t>
+        <w:t xml:space="preserve">More Actually Books (coming soon)</w:t>
       </w:r>
       <w:r>
         <w:rPr>
@@ -45717,7 +45673,7 @@
           <w:color w:val="2B2B2B"/>
           <w:szCs w:val="22"/>
         </w:rPr>
-        <w:t xml:space="preserve"> (coming soon)</w:t>
+        <w:t xml:space="preserve"/>
       </w:r>
     </w:p>
     <w:p>
@@ -45725,7 +45681,7 @@
         <w:pStyle w:val="ListParagraph"/>
         <w:numPr>
           <w:ilvl w:val="0"/>
-          <w:numId w:val="7"/>
+          <w:numId w:val="6"/>
         </w:numPr>
         <w:rPr>
           <w:sz w:val="22"/>
@@ -45738,7 +45694,7 @@
           <w:color w:val="2B2B2B"/>
           <w:szCs w:val="22"/>
         </w:rPr>
-        <w:t>Math, Actually, Volume 1: From Arithmetic to Calculus</w:t>
+        <w:t xml:space="preserve">Gravitation, Actually: A Short Book on Gravity</w:t>
       </w:r>
     </w:p>
     <w:p>
@@ -45746,7 +45702,7 @@
         <w:pStyle w:val="ListParagraph"/>
         <w:numPr>
           <w:ilvl w:val="0"/>
-          <w:numId w:val="7"/>
+          <w:numId w:val="6"/>
         </w:numPr>
         <w:rPr>
           <w:sz w:val="22"/>
@@ -45759,7 +45715,43 @@
           <w:color w:val="2B2B2B"/>
           <w:szCs w:val="22"/>
         </w:rPr>
-        <w:t>Math, Actually, Volume 2: From Multivariable Calculus to Set Theory &amp; Logic</w:t>
+        <w:t xml:space="preserve">The Universe, Actually: What Humanity Currently Understands About Reality</w:t>
+      </w:r>
+    </w:p>
+    <w:p>
+      <w:pPr>
+        <w:ind w:left="360"/>
+        <w:rPr>
+          <w:sz w:val="22"/>
+          <w:szCs w:val="22"/>
+        </w:rPr>
+      </w:pPr>
+    </w:p>
+    <w:p>
+      <w:pPr>
+        <w:keepNext/>
+        <w:rPr>
+          <w:sz w:val="22"/>
+          <w:szCs w:val="22"/>
+        </w:rPr>
+      </w:pPr>
+      <w:r>
+        <w:rPr>
+          <w:rFonts w:ascii="Georgia" w:hAnsi="Georgia"/>
+          <w:b/>
+          <w:color w:val="2B2B2B"/>
+          <w:szCs w:val="22"/>
+        </w:rPr>
+        <w:t xml:space="preserve">Math, Actually (coming soon)</w:t>
+      </w:r>
+      <w:r>
+        <w:rPr>
+          <w:rFonts w:ascii="Georgia" w:hAnsi="Georgia"/>
+          <w:bCs/>
+          <w:color w:val="2B2B2B"/>
+          <w:szCs w:val="22"/>
+        </w:rPr>
+        <w:t xml:space="preserve"/>
       </w:r>
     </w:p>
     <w:p>
@@ -45767,7 +45759,7 @@
         <w:pStyle w:val="ListParagraph"/>
         <w:numPr>
           <w:ilvl w:val="0"/>
-          <w:numId w:val="7"/>
+          <w:numId w:val="6"/>
         </w:numPr>
         <w:rPr>
           <w:sz w:val="22"/>
@@ -45780,7 +45772,7 @@
           <w:color w:val="2B2B2B"/>
           <w:szCs w:val="22"/>
         </w:rPr>
-        <w:t>Math, Actually, Volume 3: From Differential Equations to Abstract Algebra</w:t>
+        <w:t xml:space="preserve">Math, Actually, Volume 1: From Arithmetic to Calculus</w:t>
       </w:r>
     </w:p>
     <w:p>
@@ -45788,57 +45780,20 @@
         <w:pStyle w:val="ListParagraph"/>
         <w:numPr>
           <w:ilvl w:val="0"/>
-          <w:numId w:val="7"/>
+          <w:numId w:val="6"/>
         </w:numPr>
-        <w:rPr>
-          <w:rFonts w:ascii="Georgia" w:hAnsi="Georgia"/>
-          <w:color w:val="2B2B2B"/>
-          <w:szCs w:val="22"/>
-        </w:rPr>
-      </w:pPr>
-      <w:r>
-        <w:rPr>
-          <w:rFonts w:ascii="Georgia" w:hAnsi="Georgia"/>
-          <w:color w:val="2B2B2B"/>
-          <w:szCs w:val="22"/>
-        </w:rPr>
-        <w:t>Math, Actually, Volume 4: From Category Theory to the Frontier</w:t>
-      </w:r>
-    </w:p>
-    <w:p>
-      <w:pPr>
-        <w:ind w:left="360"/>
         <w:rPr>
           <w:sz w:val="22"/>
           <w:szCs w:val="22"/>
         </w:rPr>
       </w:pPr>
-    </w:p>
-    <w:p>
-      <w:pPr>
-        <w:keepNext/>
-        <w:rPr>
-          <w:sz w:val="22"/>
+      <w:r>
+        <w:rPr>
+          <w:rFonts w:ascii="Georgia" w:hAnsi="Georgia"/>
+          <w:color w:val="2B2B2B"/>
           <w:szCs w:val="22"/>
         </w:rPr>
-      </w:pPr>
-      <w:r>
-        <w:rPr>
-          <w:rFonts w:ascii="Georgia" w:hAnsi="Georgia"/>
-          <w:b/>
-          <w:color w:val="2B2B2B"/>
-          <w:szCs w:val="22"/>
-        </w:rPr>
-        <w:t>Quantum, Actually</w:t>
-      </w:r>
-      <w:r>
-        <w:rPr>
-          <w:rFonts w:ascii="Georgia" w:hAnsi="Georgia"/>
-          <w:bCs/>
-          <w:color w:val="2B2B2B"/>
-          <w:szCs w:val="22"/>
-        </w:rPr>
-        <w:t xml:space="preserve"> (coming soon)</w:t>
+        <w:t xml:space="preserve">Math, Actually, Volume 2: From Multivariable Calculus to Set Theory &amp; Logic</w:t>
       </w:r>
     </w:p>
     <w:p>
@@ -45846,7 +45801,7 @@
         <w:pStyle w:val="ListParagraph"/>
         <w:numPr>
           <w:ilvl w:val="0"/>
-          <w:numId w:val="8"/>
+          <w:numId w:val="6"/>
         </w:numPr>
         <w:rPr>
           <w:sz w:val="22"/>
@@ -45859,7 +45814,7 @@
           <w:color w:val="2B2B2B"/>
           <w:szCs w:val="22"/>
         </w:rPr>
-        <w:t>Quantum, Actually, Volume 1: Questions and Answers from the Double Slit to the Superconducting Wire</w:t>
+        <w:t xml:space="preserve">Math, Actually, Volume 3: From Differential Equations to Abstract Algebra</w:t>
       </w:r>
     </w:p>
     <w:p>
@@ -45867,40 +45822,39 @@
         <w:pStyle w:val="ListParagraph"/>
         <w:numPr>
           <w:ilvl w:val="0"/>
-          <w:numId w:val="8"/>
+          <w:numId w:val="6"/>
         </w:numPr>
-        <w:rPr>
-          <w:rFonts w:ascii="Georgia" w:hAnsi="Georgia"/>
-          <w:color w:val="2B2B2B"/>
-          <w:szCs w:val="22"/>
-        </w:rPr>
-      </w:pPr>
-      <w:r>
-        <w:rPr>
-          <w:rFonts w:ascii="Georgia" w:hAnsi="Georgia"/>
-          <w:color w:val="2B2B2B"/>
-          <w:szCs w:val="22"/>
-        </w:rPr>
-        <w:t>Quantum, Actually, Volume 2: A QED Course</w:t>
-      </w:r>
-    </w:p>
-    <w:p>
-      <w:pPr>
-        <w:ind w:left="360"/>
         <w:rPr>
           <w:sz w:val="22"/>
           <w:szCs w:val="22"/>
         </w:rPr>
       </w:pPr>
-    </w:p>
-    <w:p>
-      <w:pPr>
-        <w:keepNext/>
+      <w:r>
+        <w:rPr>
+          <w:rFonts w:ascii="Georgia" w:hAnsi="Georgia"/>
+          <w:color w:val="2B2B2B"/>
+          <w:szCs w:val="22"/>
+        </w:rPr>
+        <w:t xml:space="preserve">Math, Actually, Volume 4: From Category Theory to the Frontier</w:t>
+      </w:r>
+    </w:p>
+    <w:p>
+      <w:pPr>
+        <w:ind w:left="360"/>
         <w:rPr>
           <w:sz w:val="22"/>
           <w:szCs w:val="22"/>
         </w:rPr>
       </w:pPr>
+    </w:p>
+    <w:p>
+      <w:pPr>
+        <w:keepNext/>
+        <w:rPr>
+          <w:sz w:val="22"/>
+          <w:szCs w:val="22"/>
+        </w:rPr>
+      </w:pPr>
       <w:r>
         <w:rPr>
           <w:rFonts w:ascii="Georgia" w:hAnsi="Georgia"/>
@@ -45908,8 +45862,7 @@
           <w:color w:val="2B2B2B"/>
           <w:szCs w:val="22"/>
         </w:rPr>
-        <w:lastRenderedPageBreak/>
-        <w:t>Science Sparks</w:t>
+        <w:t xml:space="preserve">Quantum, Actually (coming soon)</w:t>
       </w:r>
       <w:r>
         <w:rPr>
@@ -45918,7 +45871,7 @@
           <w:color w:val="2B2B2B"/>
           <w:szCs w:val="22"/>
         </w:rPr>
-        <w:t xml:space="preserve"> (coming soon)</w:t>
+        <w:t xml:space="preserve"/>
       </w:r>
     </w:p>
     <w:p>
@@ -45926,57 +45879,20 @@
         <w:pStyle w:val="ListParagraph"/>
         <w:numPr>
           <w:ilvl w:val="0"/>
-          <w:numId w:val="9"/>
+          <w:numId w:val="6"/>
         </w:numPr>
-        <w:rPr>
-          <w:rFonts w:ascii="Georgia" w:hAnsi="Georgia"/>
-          <w:color w:val="2B2B2B"/>
-          <w:szCs w:val="22"/>
-        </w:rPr>
-      </w:pPr>
-      <w:r>
-        <w:rPr>
-          <w:rFonts w:ascii="Georgia" w:hAnsi="Georgia"/>
-          <w:color w:val="2B2B2B"/>
-          <w:szCs w:val="22"/>
-        </w:rPr>
-        <w:t>Science Sparks: Physics, Life, and Mathematics</w:t>
-      </w:r>
-    </w:p>
-    <w:p>
-      <w:pPr>
-        <w:ind w:left="360"/>
         <w:rPr>
           <w:sz w:val="22"/>
           <w:szCs w:val="22"/>
         </w:rPr>
       </w:pPr>
-    </w:p>
-    <w:p>
-      <w:pPr>
-        <w:keepNext/>
-        <w:rPr>
-          <w:sz w:val="22"/>
+      <w:r>
+        <w:rPr>
+          <w:rFonts w:ascii="Georgia" w:hAnsi="Georgia"/>
+          <w:color w:val="2B2B2B"/>
           <w:szCs w:val="22"/>
         </w:rPr>
-      </w:pPr>
-      <w:r>
-        <w:rPr>
-          <w:rFonts w:ascii="Georgia" w:hAnsi="Georgia"/>
-          <w:b/>
-          <w:color w:val="2B2B2B"/>
-          <w:szCs w:val="22"/>
-        </w:rPr>
-        <w:t>Look First</w:t>
-      </w:r>
-      <w:r>
-        <w:rPr>
-          <w:rFonts w:ascii="Georgia" w:hAnsi="Georgia"/>
-          <w:bCs/>
-          <w:color w:val="2B2B2B"/>
-          <w:szCs w:val="22"/>
-        </w:rPr>
-        <w:t xml:space="preserve"> (coming soon)</w:t>
+        <w:t xml:space="preserve">Quantum, Actually, Volume 1: Questions and Answers from the Double Slit to the Superconducting Wire</w:t>
       </w:r>
     </w:p>
     <w:p>
@@ -45984,7 +45900,7 @@
         <w:pStyle w:val="ListParagraph"/>
         <w:numPr>
           <w:ilvl w:val="0"/>
-          <w:numId w:val="3"/>
+          <w:numId w:val="6"/>
         </w:numPr>
         <w:rPr>
           <w:sz w:val="22"/>
@@ -45997,7 +45913,43 @@
           <w:color w:val="2B2B2B"/>
           <w:szCs w:val="22"/>
         </w:rPr>
-        <w:t>Look First, Volume 1: The Universe Has No Now</w:t>
+        <w:t xml:space="preserve">Quantum, Actually, Volume 2: A QED Course</w:t>
+      </w:r>
+    </w:p>
+    <w:p>
+      <w:pPr>
+        <w:ind w:left="360"/>
+        <w:rPr>
+          <w:sz w:val="22"/>
+          <w:szCs w:val="22"/>
+        </w:rPr>
+      </w:pPr>
+    </w:p>
+    <w:p>
+      <w:pPr>
+        <w:keepNext/>
+        <w:rPr>
+          <w:sz w:val="22"/>
+          <w:szCs w:val="22"/>
+        </w:rPr>
+      </w:pPr>
+      <w:r>
+        <w:rPr>
+          <w:rFonts w:ascii="Georgia" w:hAnsi="Georgia"/>
+          <w:b/>
+          <w:color w:val="2B2B2B"/>
+          <w:szCs w:val="22"/>
+        </w:rPr>
+        <w:t xml:space="preserve">Science Sparks (coming soon)</w:t>
+      </w:r>
+      <w:r>
+        <w:rPr>
+          <w:rFonts w:ascii="Georgia" w:hAnsi="Georgia"/>
+          <w:bCs/>
+          <w:color w:val="2B2B2B"/>
+          <w:szCs w:val="22"/>
+        </w:rPr>
+        <w:t xml:space="preserve"/>
       </w:r>
     </w:p>
     <w:p>
@@ -46005,40 +45957,39 @@
         <w:pStyle w:val="ListParagraph"/>
         <w:numPr>
           <w:ilvl w:val="0"/>
-          <w:numId w:val="3"/>
+          <w:numId w:val="6"/>
         </w:numPr>
-        <w:rPr>
-          <w:rFonts w:ascii="Georgia" w:hAnsi="Georgia"/>
-          <w:color w:val="2B2B2B"/>
-          <w:szCs w:val="22"/>
-        </w:rPr>
-      </w:pPr>
-      <w:r>
-        <w:rPr>
-          <w:rFonts w:ascii="Georgia" w:hAnsi="Georgia"/>
-          <w:color w:val="2B2B2B"/>
-          <w:szCs w:val="22"/>
-        </w:rPr>
-        <w:t>Look First, Volume 2: A Trip Is Not a New Life</w:t>
-      </w:r>
-    </w:p>
-    <w:p>
-      <w:pPr>
-        <w:ind w:left="360"/>
         <w:rPr>
           <w:sz w:val="22"/>
           <w:szCs w:val="22"/>
         </w:rPr>
       </w:pPr>
-    </w:p>
-    <w:p>
-      <w:pPr>
-        <w:keepNext/>
+      <w:r>
+        <w:rPr>
+          <w:rFonts w:ascii="Georgia" w:hAnsi="Georgia"/>
+          <w:color w:val="2B2B2B"/>
+          <w:szCs w:val="22"/>
+        </w:rPr>
+        <w:t xml:space="preserve">Science Sparks: Physics, Life, and Mathematics — The Same Few Rules, Told in Highlights</w:t>
+      </w:r>
+    </w:p>
+    <w:p>
+      <w:pPr>
+        <w:ind w:left="360"/>
         <w:rPr>
           <w:sz w:val="22"/>
           <w:szCs w:val="22"/>
         </w:rPr>
       </w:pPr>
+    </w:p>
+    <w:p>
+      <w:pPr>
+        <w:keepNext/>
+        <w:rPr>
+          <w:sz w:val="22"/>
+          <w:szCs w:val="22"/>
+        </w:rPr>
+      </w:pPr>
       <w:r>
         <w:rPr>
           <w:rFonts w:ascii="Georgia" w:hAnsi="Georgia"/>
@@ -46046,7 +45997,7 @@
           <w:color w:val="2B2B2B"/>
           <w:szCs w:val="22"/>
         </w:rPr>
-        <w:t>Electrical Engineering Series</w:t>
+        <w:t xml:space="preserve">Look First (coming soon)</w:t>
       </w:r>
       <w:r>
         <w:rPr>
@@ -46055,7 +46006,7 @@
           <w:color w:val="2B2B2B"/>
           <w:szCs w:val="22"/>
         </w:rPr>
-        <w:t xml:space="preserve"> (coming soon)</w:t>
+        <w:t xml:space="preserve"/>
       </w:r>
     </w:p>
     <w:p>
@@ -46063,7 +46014,7 @@
         <w:pStyle w:val="ListParagraph"/>
         <w:numPr>
           <w:ilvl w:val="0"/>
-          <w:numId w:val="10"/>
+          <w:numId w:val="6"/>
         </w:numPr>
         <w:rPr>
           <w:sz w:val="22"/>
@@ -46076,7 +46027,7 @@
           <w:color w:val="2B2B2B"/>
           <w:szCs w:val="22"/>
         </w:rPr>
-        <w:t>Foundations of Electronics (Book 1)</w:t>
+        <w:t xml:space="preserve">Look First, Volume 1: The Universe Has No Now</w:t>
       </w:r>
     </w:p>
     <w:p>
@@ -46084,7 +46035,7 @@
         <w:pStyle w:val="ListParagraph"/>
         <w:numPr>
           <w:ilvl w:val="0"/>
-          <w:numId w:val="10"/>
+          <w:numId w:val="6"/>
         </w:numPr>
         <w:rPr>
           <w:sz w:val="22"/>
@@ -46097,7 +46048,43 @@
           <w:color w:val="2B2B2B"/>
           <w:szCs w:val="22"/>
         </w:rPr>
-        <w:t>Circuits, Components, and Control (Book 2)</w:t>
+        <w:t xml:space="preserve">Look First, Volume 2: A Trip Is Not a New Life</w:t>
+      </w:r>
+    </w:p>
+    <w:p>
+      <w:pPr>
+        <w:ind w:left="360"/>
+        <w:rPr>
+          <w:sz w:val="22"/>
+          <w:szCs w:val="22"/>
+        </w:rPr>
+      </w:pPr>
+    </w:p>
+    <w:p>
+      <w:pPr>
+        <w:keepNext/>
+        <w:rPr>
+          <w:sz w:val="22"/>
+          <w:szCs w:val="22"/>
+        </w:rPr>
+      </w:pPr>
+      <w:r>
+        <w:rPr>
+          <w:rFonts w:ascii="Georgia" w:hAnsi="Georgia"/>
+          <w:b/>
+          <w:color w:val="2B2B2B"/>
+          <w:szCs w:val="22"/>
+        </w:rPr>
+        <w:t xml:space="preserve">Electrical Engineering Series (coming soon)</w:t>
+      </w:r>
+      <w:r>
+        <w:rPr>
+          <w:rFonts w:ascii="Georgia" w:hAnsi="Georgia"/>
+          <w:bCs/>
+          <w:color w:val="2B2B2B"/>
+          <w:szCs w:val="22"/>
+        </w:rPr>
+        <w:t xml:space="preserve"/>
       </w:r>
     </w:p>
     <w:p>
@@ -46105,7 +46092,7 @@
         <w:pStyle w:val="ListParagraph"/>
         <w:numPr>
           <w:ilvl w:val="0"/>
-          <w:numId w:val="10"/>
+          <w:numId w:val="6"/>
         </w:numPr>
         <w:rPr>
           <w:sz w:val="22"/>
@@ -46118,7 +46105,7 @@
           <w:color w:val="2B2B2B"/>
           <w:szCs w:val="22"/>
         </w:rPr>
-        <w:t>Semiconductor Physics and Devices (Book 3)</w:t>
+        <w:t xml:space="preserve">Foundations of Electronics (Book 1)</w:t>
       </w:r>
     </w:p>
     <w:p>
@@ -46126,7 +46113,7 @@
         <w:pStyle w:val="ListParagraph"/>
         <w:numPr>
           <w:ilvl w:val="0"/>
-          <w:numId w:val="10"/>
+          <w:numId w:val="6"/>
         </w:numPr>
         <w:rPr>
           <w:sz w:val="22"/>
@@ -46139,7 +46126,7 @@
           <w:color w:val="2B2B2B"/>
           <w:szCs w:val="22"/>
         </w:rPr>
-        <w:t>RF, Microwave, and Transceivers (Book 4)</w:t>
+        <w:t xml:space="preserve">Circuits, Components, and Control (Book 2)</w:t>
       </w:r>
     </w:p>
     <w:p>
@@ -46147,7 +46134,7 @@
         <w:pStyle w:val="ListParagraph"/>
         <w:numPr>
           <w:ilvl w:val="0"/>
-          <w:numId w:val="10"/>
+          <w:numId w:val="6"/>
         </w:numPr>
         <w:rPr>
           <w:sz w:val="22"/>
@@ -46160,7 +46147,7 @@
           <w:color w:val="2B2B2B"/>
           <w:szCs w:val="22"/>
         </w:rPr>
-        <w:t>Communications, Wireless, and SDR (Book 5)</w:t>
+        <w:t xml:space="preserve">Semiconductor Physics and Devices (Book 3)</w:t>
       </w:r>
     </w:p>
     <w:p>
@@ -46168,7 +46155,7 @@
         <w:pStyle w:val="ListParagraph"/>
         <w:numPr>
           <w:ilvl w:val="0"/>
-          <w:numId w:val="10"/>
+          <w:numId w:val="6"/>
         </w:numPr>
         <w:rPr>
           <w:sz w:val="22"/>
@@ -46181,7 +46168,7 @@
           <w:color w:val="2B2B2B"/>
           <w:szCs w:val="22"/>
         </w:rPr>
-        <w:t>Power and Energy (Book 6)</w:t>
+        <w:t xml:space="preserve">RF, Microwave, and Transceivers (Book 4)</w:t>
       </w:r>
     </w:p>
     <w:p>
@@ -46189,57 +46176,20 @@
         <w:pStyle w:val="ListParagraph"/>
         <w:numPr>
           <w:ilvl w:val="0"/>
-          <w:numId w:val="10"/>
+          <w:numId w:val="6"/>
         </w:numPr>
-        <w:rPr>
-          <w:rFonts w:ascii="Georgia" w:hAnsi="Georgia"/>
-          <w:color w:val="2B2B2B"/>
-          <w:szCs w:val="22"/>
-        </w:rPr>
-      </w:pPr>
-      <w:r>
-        <w:rPr>
-          <w:rFonts w:ascii="Georgia" w:hAnsi="Georgia"/>
-          <w:color w:val="2B2B2B"/>
-          <w:szCs w:val="22"/>
-        </w:rPr>
-        <w:t>Packaging, Layout, EMC, and Test (Book 7)</w:t>
-      </w:r>
-    </w:p>
-    <w:p>
-      <w:pPr>
-        <w:ind w:left="360"/>
         <w:rPr>
           <w:sz w:val="22"/>
           <w:szCs w:val="22"/>
         </w:rPr>
       </w:pPr>
-    </w:p>
-    <w:p>
-      <w:pPr>
-        <w:keepNext/>
-        <w:rPr>
-          <w:sz w:val="22"/>
+      <w:r>
+        <w:rPr>
+          <w:rFonts w:ascii="Georgia" w:hAnsi="Georgia"/>
+          <w:color w:val="2B2B2B"/>
           <w:szCs w:val="22"/>
         </w:rPr>
-      </w:pPr>
-      <w:r>
-        <w:rPr>
-          <w:rFonts w:ascii="Georgia" w:hAnsi="Georgia"/>
-          <w:b/>
-          <w:color w:val="2B2B2B"/>
-          <w:szCs w:val="22"/>
-        </w:rPr>
-        <w:t>History</w:t>
-      </w:r>
-      <w:r>
-        <w:rPr>
-          <w:rFonts w:ascii="Georgia" w:hAnsi="Georgia"/>
-          <w:bCs/>
-          <w:color w:val="2B2B2B"/>
-          <w:szCs w:val="22"/>
-        </w:rPr>
-        <w:t xml:space="preserve"> (coming soon)</w:t>
+        <w:t xml:space="preserve">Communications, Wireless, and SDR (Book 5)</w:t>
       </w:r>
     </w:p>
     <w:p>
@@ -46247,57 +46197,20 @@
         <w:pStyle w:val="ListParagraph"/>
         <w:numPr>
           <w:ilvl w:val="0"/>
-          <w:numId w:val="4"/>
+          <w:numId w:val="6"/>
         </w:numPr>
-        <w:rPr>
-          <w:rFonts w:ascii="Georgia" w:hAnsi="Georgia"/>
-          <w:color w:val="2B2B2B"/>
-          <w:szCs w:val="22"/>
-        </w:rPr>
-      </w:pPr>
-      <w:r>
-        <w:rPr>
-          <w:rFonts w:ascii="Georgia" w:hAnsi="Georgia"/>
-          <w:color w:val="2B2B2B"/>
-          <w:szCs w:val="22"/>
-        </w:rPr>
-        <w:t>The Dolphins’ View of History</w:t>
-      </w:r>
-    </w:p>
-    <w:p>
-      <w:pPr>
-        <w:ind w:left="360"/>
         <w:rPr>
           <w:sz w:val="22"/>
           <w:szCs w:val="22"/>
         </w:rPr>
       </w:pPr>
-    </w:p>
-    <w:p>
-      <w:pPr>
-        <w:keepNext/>
-        <w:rPr>
-          <w:sz w:val="22"/>
+      <w:r>
+        <w:rPr>
+          <w:rFonts w:ascii="Georgia" w:hAnsi="Georgia"/>
+          <w:color w:val="2B2B2B"/>
           <w:szCs w:val="22"/>
         </w:rPr>
-      </w:pPr>
-      <w:r>
-        <w:rPr>
-          <w:rFonts w:ascii="Georgia" w:hAnsi="Georgia"/>
-          <w:b/>
-          <w:color w:val="2B2B2B"/>
-          <w:szCs w:val="22"/>
-        </w:rPr>
-        <w:t>Fiction</w:t>
-      </w:r>
-      <w:r>
-        <w:rPr>
-          <w:rFonts w:ascii="Georgia" w:hAnsi="Georgia"/>
-          <w:bCs/>
-          <w:color w:val="2B2B2B"/>
-          <w:szCs w:val="22"/>
-        </w:rPr>
-        <w:t xml:space="preserve"> (coming soon)</w:t>
+        <w:t xml:space="preserve">Power and Energy (Book 6)</w:t>
       </w:r>
     </w:p>
     <w:p>
@@ -46305,7 +46218,7 @@
         <w:pStyle w:val="ListParagraph"/>
         <w:numPr>
           <w:ilvl w:val="0"/>
-          <w:numId w:val="4"/>
+          <w:numId w:val="6"/>
         </w:numPr>
         <w:rPr>
           <w:sz w:val="22"/>
@@ -46318,7 +46231,43 @@
           <w:color w:val="2B2B2B"/>
           <w:szCs w:val="22"/>
         </w:rPr>
-        <w:t>The Murder That Hadn’t Happened Yet (The Relativistic Investigation Bureau, Book 1)</w:t>
+        <w:t xml:space="preserve">Packaging, Layout, EMC, and Test (Book 7)</w:t>
+      </w:r>
+    </w:p>
+    <w:p>
+      <w:pPr>
+        <w:ind w:left="360"/>
+        <w:rPr>
+          <w:sz w:val="22"/>
+          <w:szCs w:val="22"/>
+        </w:rPr>
+      </w:pPr>
+    </w:p>
+    <w:p>
+      <w:pPr>
+        <w:keepNext/>
+        <w:rPr>
+          <w:sz w:val="22"/>
+          <w:szCs w:val="22"/>
+        </w:rPr>
+      </w:pPr>
+      <w:r>
+        <w:rPr>
+          <w:rFonts w:ascii="Georgia" w:hAnsi="Georgia"/>
+          <w:b/>
+          <w:color w:val="2B2B2B"/>
+          <w:szCs w:val="22"/>
+        </w:rPr>
+        <w:t xml:space="preserve">History (coming soon)</w:t>
+      </w:r>
+      <w:r>
+        <w:rPr>
+          <w:rFonts w:ascii="Georgia" w:hAnsi="Georgia"/>
+          <w:bCs/>
+          <w:color w:val="2B2B2B"/>
+          <w:szCs w:val="22"/>
+        </w:rPr>
+        <w:t xml:space="preserve"/>
       </w:r>
     </w:p>
     <w:p>
@@ -46326,7 +46275,7 @@
         <w:pStyle w:val="ListParagraph"/>
         <w:numPr>
           <w:ilvl w:val="0"/>
-          <w:numId w:val="4"/>
+          <w:numId w:val="6"/>
         </w:numPr>
         <w:rPr>
           <w:sz w:val="22"/>
@@ -46339,7 +46288,43 @@
           <w:color w:val="2B2B2B"/>
           <w:szCs w:val="22"/>
         </w:rPr>
-        <w:t>The Warning That Was Sent Too Late (The Relativistic Investigation Bureau, Book 2)</w:t>
+        <w:t xml:space="preserve">The Dolphins’ View of History</w:t>
+      </w:r>
+    </w:p>
+    <w:p>
+      <w:pPr>
+        <w:ind w:left="360"/>
+        <w:rPr>
+          <w:sz w:val="22"/>
+          <w:szCs w:val="22"/>
+        </w:rPr>
+      </w:pPr>
+    </w:p>
+    <w:p>
+      <w:pPr>
+        <w:keepNext/>
+        <w:rPr>
+          <w:sz w:val="22"/>
+          <w:szCs w:val="22"/>
+        </w:rPr>
+      </w:pPr>
+      <w:r>
+        <w:rPr>
+          <w:rFonts w:ascii="Georgia" w:hAnsi="Georgia"/>
+          <w:b/>
+          <w:color w:val="2B2B2B"/>
+          <w:szCs w:val="22"/>
+        </w:rPr>
+        <w:t xml:space="preserve">Fiction (coming soon)</w:t>
+      </w:r>
+      <w:r>
+        <w:rPr>
+          <w:rFonts w:ascii="Georgia" w:hAnsi="Georgia"/>
+          <w:bCs/>
+          <w:color w:val="2B2B2B"/>
+          <w:szCs w:val="22"/>
+        </w:rPr>
+        <w:t xml:space="preserve"/>
       </w:r>
     </w:p>
     <w:p>
@@ -46347,7 +46332,7 @@
         <w:pStyle w:val="ListParagraph"/>
         <w:numPr>
           <w:ilvl w:val="0"/>
-          <w:numId w:val="4"/>
+          <w:numId w:val="6"/>
         </w:numPr>
         <w:rPr>
           <w:sz w:val="22"/>
@@ -46360,7 +46345,7 @@
           <w:color w:val="2B2B2B"/>
           <w:szCs w:val="22"/>
         </w:rPr>
-        <w:t>Schrödinger’s Paperwork (Lolly Wren’s Curious Science Adventures, Book 1)</w:t>
+        <w:t xml:space="preserve">The Murder That Hadn’t Happened Yet (The Relativistic Investigation Bureau, Book 1), Lothar J. Musiol writing as Spezala Genara Relavi (S.G.R.)</w:t>
       </w:r>
     </w:p>
     <w:p>
@@ -46368,7 +46353,7 @@
         <w:pStyle w:val="ListParagraph"/>
         <w:numPr>
           <w:ilvl w:val="0"/>
-          <w:numId w:val="4"/>
+          <w:numId w:val="6"/>
         </w:numPr>
         <w:rPr>
           <w:sz w:val="22"/>
@@ -46381,43 +46366,7 @@
           <w:color w:val="2B2B2B"/>
           <w:szCs w:val="22"/>
         </w:rPr>
-        <w:t>The Permitted Options (Lolly Wren’s Curious Science Adventures, Book 2)</w:t>
-      </w:r>
-    </w:p>
-    <w:p>
-      <w:pPr>
-        <w:ind w:left="360"/>
-        <w:rPr>
-          <w:sz w:val="22"/>
-          <w:szCs w:val="22"/>
-        </w:rPr>
-      </w:pPr>
-    </w:p>
-    <w:p>
-      <w:pPr>
-        <w:keepNext/>
-        <w:rPr>
-          <w:sz w:val="22"/>
-          <w:szCs w:val="22"/>
-        </w:rPr>
-      </w:pPr>
-      <w:r>
-        <w:rPr>
-          <w:rFonts w:ascii="Georgia" w:hAnsi="Georgia"/>
-          <w:b/>
-          <w:color w:val="2B2B2B"/>
-          <w:szCs w:val="22"/>
-        </w:rPr>
-        <w:t>How-To</w:t>
-      </w:r>
-      <w:r>
-        <w:rPr>
-          <w:rFonts w:ascii="Georgia" w:hAnsi="Georgia"/>
-          <w:bCs/>
-          <w:color w:val="2B2B2B"/>
-          <w:szCs w:val="22"/>
-        </w:rPr>
-        <w:t xml:space="preserve"> (available at Amazon Kindle, KDP)</w:t>
+        <w:t xml:space="preserve">The Warning That Was Sent Too Late (The Relativistic Investigation Bureau, Book 2), Lothar J. Musiol writing as Spezala Genara Relavi (S.G.R.)</w:t>
       </w:r>
     </w:p>
     <w:p>
@@ -46425,11 +46374,10 @@
         <w:pStyle w:val="ListParagraph"/>
         <w:numPr>
           <w:ilvl w:val="0"/>
-          <w:numId w:val="5"/>
+          <w:numId w:val="6"/>
         </w:numPr>
         <w:rPr>
-          <w:rFonts w:ascii="Georgia" w:hAnsi="Georgia"/>
-          <w:color w:val="2B2B2B"/>
+          <w:sz w:val="22"/>
           <w:szCs w:val="22"/>
         </w:rPr>
       </w:pPr>
@@ -46439,7 +46387,7 @@
           <w:color w:val="2B2B2B"/>
           <w:szCs w:val="22"/>
         </w:rPr>
-        <w:t>How to Publish Your First Kindle Book</w:t>
+        <w:t xml:space="preserve">Schrödinger’s Paperwork (Lolly Wren’s Curious Science Adventures, Book 1), Lothar J. Musiol writing as Quentin Edmund Darling (Q.E.D.)</w:t>
       </w:r>
     </w:p>
     <w:p>
@@ -46447,11 +46395,10 @@
         <w:pStyle w:val="ListParagraph"/>
         <w:numPr>
           <w:ilvl w:val="0"/>
-          <w:numId w:val="5"/>
+          <w:numId w:val="6"/>
         </w:numPr>
         <w:rPr>
-          <w:rFonts w:ascii="Georgia" w:hAnsi="Georgia"/>
-          <w:color w:val="2B2B2B"/>
+          <w:sz w:val="22"/>
           <w:szCs w:val="22"/>
         </w:rPr>
       </w:pPr>
@@ -46461,7 +46408,7 @@
           <w:color w:val="2B2B2B"/>
           <w:szCs w:val="22"/>
         </w:rPr>
-        <w:t>Your First YouTube Channel That Rocks</w:t>
+        <w:t xml:space="preserve">The Permitted Options (Lolly Wren’s Curious Science Adventures, Book 2), Lothar J. Musiol writing as Quentin Edmund Darling (Q.E.D.)</w:t>
       </w:r>
     </w:p>
     <w:p>
@@ -46469,13 +46416,11 @@
         <w:pStyle w:val="ListParagraph"/>
         <w:numPr>
           <w:ilvl w:val="0"/>
-          <w:numId w:val="5"/>
+          <w:numId w:val="6"/>
         </w:numPr>
         <w:rPr>
-          <w:rFonts w:ascii="Georgia" w:hAnsi="Georgia"/>
-          <w:color w:val="2B2B2B"/>
+          <w:sz w:val="22"/>
           <w:szCs w:val="22"/>
-          <w:lang w:val="de-DE"/>
         </w:rPr>
       </w:pPr>
       <w:r>
@@ -46483,9 +46428,65 @@
           <w:rFonts w:ascii="Georgia" w:hAnsi="Georgia"/>
           <w:color w:val="2B2B2B"/>
           <w:szCs w:val="22"/>
-          <w:lang w:val="de-DE"/>
-        </w:rPr>
-        <w:t>Auswandern - Ab in die USA, CA, AUS oder NZ</w:t>
+        </w:rPr>
+        <w:t xml:space="preserve">In Love with Murder, Actually: A Comic Mystery, Lothar J. Musiol writing as Romuald Livingston</w:t>
+      </w:r>
+    </w:p>
+    <w:p>
+      <w:pPr>
+        <w:ind w:left="360"/>
+        <w:rPr>
+          <w:sz w:val="22"/>
+          <w:szCs w:val="22"/>
+        </w:rPr>
+      </w:pPr>
+    </w:p>
+    <w:p>
+      <w:pPr>
+        <w:keepNext/>
+        <w:rPr>
+          <w:sz w:val="22"/>
+          <w:szCs w:val="22"/>
+        </w:rPr>
+      </w:pPr>
+      <w:r>
+        <w:rPr>
+          <w:rFonts w:ascii="Georgia" w:hAnsi="Georgia"/>
+          <w:b/>
+          <w:color w:val="2B2B2B"/>
+          <w:szCs w:val="22"/>
+        </w:rPr>
+        <w:t xml:space="preserve">In German</w:t>
+      </w:r>
+      <w:r>
+        <w:rPr>
+          <w:rFonts w:ascii="Georgia" w:hAnsi="Georgia"/>
+          <w:bCs/>
+          <w:color w:val="2B2B2B"/>
+          <w:szCs w:val="22"/>
+        </w:rPr>
+        <w:t xml:space="preserve"/>
+      </w:r>
+    </w:p>
+    <w:p>
+      <w:pPr>
+        <w:pStyle w:val="ListParagraph"/>
+        <w:numPr>
+          <w:ilvl w:val="0"/>
+          <w:numId w:val="6"/>
+        </w:numPr>
+        <w:rPr>
+          <w:sz w:val="22"/>
+          <w:szCs w:val="22"/>
+        </w:rPr>
+      </w:pPr>
+      <w:r>
+        <w:rPr>
+          <w:rFonts w:ascii="Georgia" w:hAnsi="Georgia"/>
+          <w:color w:val="2B2B2B"/>
+          <w:szCs w:val="22"/>
+        </w:rPr>
+        <w:t xml:space="preserve">Auswandern – Ab in die USA, Kanada, Australien oder Neuseeland?</w:t>
       </w:r>
     </w:p>
     <w:p>

</xml_diff>

<commit_message>
About the Author (A): Protocol Flamingo
</commit_message>
<xml_diff>
--- a/Protocol Flamingo/Protocol_Flamingo_REV10.docx
+++ b/Protocol Flamingo/Protocol_Flamingo_REV10.docx
@@ -46554,7 +46554,61 @@
           <w:color w:val="2B2B2B"/>
           <w:sz w:val="26"/>
         </w:rPr>
-        <w:t>Lothar J. Musiol writes stories in which a committee outlasts a fleet. Protocol Flamingo is the first of the Invasion Storybooks. The people in it are invented. The alpaca is invented. The science in the appendix is not.</w:t>
+        <w:t xml:space="preserve">Lothar J. Musiol is German by birth and American by choice, and he writes in British because he regards it as the most awkward American dialect. For exactly that reason he is a staunch aficionado of British films such as </w:t>
+      </w:r>
+      <w:r>
+        <w:rPr>
+          <w:i/>
+          <w:iCs/>
+          <w:rFonts w:ascii="Georgia" w:hAnsi="Georgia"/>
+          <w:color w:val="2B2B2B"/>
+          <w:sz w:val="26"/>
+        </w:rPr>
+        <w:t xml:space="preserve">Four Weddings and a Funeral</w:t>
+      </w:r>
+      <w:r>
+        <w:rPr>
+          <w:rFonts w:ascii="Georgia" w:hAnsi="Georgia"/>
+          <w:color w:val="2B2B2B"/>
+          <w:sz w:val="26"/>
+        </w:rPr>
+        <w:t xml:space="preserve">. The preposterous accent, however, was inspired by </w:t>
+      </w:r>
+      <w:r>
+        <w:rPr>
+          <w:i/>
+          <w:iCs/>
+          <w:rFonts w:ascii="Georgia" w:hAnsi="Georgia"/>
+          <w:color w:val="2B2B2B"/>
+          <w:sz w:val="26"/>
+        </w:rPr>
+        <w:t xml:space="preserve">Love Actually</w:t>
+      </w:r>
+      <w:r>
+        <w:rPr>
+          <w:rFonts w:ascii="Georgia" w:hAnsi="Georgia"/>
+          <w:color w:val="2B2B2B"/>
+          <w:sz w:val="26"/>
+        </w:rPr>
+        <w:t xml:space="preserve">, in which a daft sod named Colin Frissell flies to America and has a conversation in a bar before arriving at the true purpose of his travels. The author found that eye-opening and still hopes to get there one day, if he keeps up his admittedly naff British long enough.</w:t>
+      </w:r>
+    </w:p>
+    <w:p>
+      <w:pPr>
+        <w:jc w:val="both"/>
+        <w:rPr>
+          <w:rFonts w:ascii="Georgia" w:hAnsi="Georgia"/>
+          <w:color w:val="2B2B2B"/>
+          <w:sz w:val="26"/>
+        </w:rPr>
+      </w:pPr>
+      <w:r>
+        <w:rPr>
+          <w:rFonts w:ascii="Georgia" w:hAnsi="Georgia"/>
+          <w:color w:val="2B2B2B"/>
+          <w:sz w:val="26"/>
+        </w:rPr>
+        <w:t xml:space="preserve">A graduate of Munich University of Applied Sciences, he spent more than forty years in the semiconductor industry, first at Germany’s largest company in the field, then at a string of American start-ups. Dual citizenship, put to its most sensible use, lets him split his time between San Clemente, California, and Passau, Bavaria, where Austria begins at the garden fence. The household includes one married daughter, one grumpy Teacup Pomeranian named Gucci, and eleven chickens, listed in order of seniority rather than volume.</w:t>
       </w:r>
     </w:p>
     <w:sectPr>

</xml_diff>

<commit_message>
About the Author (A): Protocol Flamingo [merged onto main from book-2-lectures-after-qed 8733d4b, paths only]
</commit_message>
<xml_diff>
--- a/Protocol Flamingo/Protocol_Flamingo_REV10.docx
+++ b/Protocol Flamingo/Protocol_Flamingo_REV10.docx
@@ -46554,7 +46554,61 @@
           <w:color w:val="2B2B2B"/>
           <w:sz w:val="26"/>
         </w:rPr>
-        <w:t>Lothar J. Musiol writes stories in which a committee outlasts a fleet. Protocol Flamingo is the first of the Invasion Storybooks. The people in it are invented. The alpaca is invented. The science in the appendix is not.</w:t>
+        <w:t xml:space="preserve">Lothar J. Musiol is German by birth and American by choice, and he writes in British because he regards it as the most awkward American dialect. For exactly that reason he is a staunch aficionado of British films such as </w:t>
+      </w:r>
+      <w:r>
+        <w:rPr>
+          <w:i/>
+          <w:iCs/>
+          <w:rFonts w:ascii="Georgia" w:hAnsi="Georgia"/>
+          <w:color w:val="2B2B2B"/>
+          <w:sz w:val="26"/>
+        </w:rPr>
+        <w:t xml:space="preserve">Four Weddings and a Funeral</w:t>
+      </w:r>
+      <w:r>
+        <w:rPr>
+          <w:rFonts w:ascii="Georgia" w:hAnsi="Georgia"/>
+          <w:color w:val="2B2B2B"/>
+          <w:sz w:val="26"/>
+        </w:rPr>
+        <w:t xml:space="preserve">. The preposterous accent, however, was inspired by </w:t>
+      </w:r>
+      <w:r>
+        <w:rPr>
+          <w:i/>
+          <w:iCs/>
+          <w:rFonts w:ascii="Georgia" w:hAnsi="Georgia"/>
+          <w:color w:val="2B2B2B"/>
+          <w:sz w:val="26"/>
+        </w:rPr>
+        <w:t xml:space="preserve">Love Actually</w:t>
+      </w:r>
+      <w:r>
+        <w:rPr>
+          <w:rFonts w:ascii="Georgia" w:hAnsi="Georgia"/>
+          <w:color w:val="2B2B2B"/>
+          <w:sz w:val="26"/>
+        </w:rPr>
+        <w:t xml:space="preserve">, in which a daft sod named Colin Frissell flies to America and has a conversation in a bar before arriving at the true purpose of his travels. The author found that eye-opening and still hopes to get there one day, if he keeps up his admittedly naff British long enough.</w:t>
+      </w:r>
+    </w:p>
+    <w:p>
+      <w:pPr>
+        <w:jc w:val="both"/>
+        <w:rPr>
+          <w:rFonts w:ascii="Georgia" w:hAnsi="Georgia"/>
+          <w:color w:val="2B2B2B"/>
+          <w:sz w:val="26"/>
+        </w:rPr>
+      </w:pPr>
+      <w:r>
+        <w:rPr>
+          <w:rFonts w:ascii="Georgia" w:hAnsi="Georgia"/>
+          <w:color w:val="2B2B2B"/>
+          <w:sz w:val="26"/>
+        </w:rPr>
+        <w:t xml:space="preserve">A graduate of Munich University of Applied Sciences, he spent more than forty years in the semiconductor industry, first at Germany’s largest company in the field, then at a string of American start-ups. Dual citizenship, put to its most sensible use, lets him split his time between San Clemente, California, and Passau, Bavaria, where Austria begins at the garden fence. The household includes one married daughter, one grumpy Teacup Pomeranian named Gucci, and eleven chickens, listed in order of seniority rather than volume.</w:t>
       </w:r>
     </w:p>
     <w:sectPr>

</xml_diff>

<commit_message>
Protocol Flamingo strict rescore 8.7 to 9.2: pen-name byline restored, Trojan light-time matched to the real 2026 geometry (6 AU, 50 light-minutes), camera/wedding-count/1979 continuity, Biosphere 2 and radar-leakage facts, misattributed Generation Ships video removed, no visible URLs (bibliography titles linked, 18 checked; appendix citations link to bookmarked entries), Also-by drops the book itself, listing keywords; SCORES row
</commit_message>
<xml_diff>
--- a/Protocol Flamingo/Protocol_Flamingo_REV10.docx
+++ b/Protocol Flamingo/Protocol_Flamingo_REV10.docx
@@ -145,7 +145,7 @@
           <w:sz w:val="18"/>
           <w:szCs w:val="16"/>
         </w:rPr>
-        <w:t>Lothar J. Musiol</w:t>
+        <w:t>Lothar J. Musiol writing as George Herbert Fontaine</w:t>
       </w:r>
     </w:p>
     <w:p>
@@ -1865,7 +1865,7 @@
           <w:color w:val="2B2B2B"/>
           <w:sz w:val="26"/>
         </w:rPr>
-        <w:t>“That’s what I said. She said tired is not an aesthetic, tired is a condition.” He looked across the barn to where Mabs was hugging a great-aunt who was clearly telling her something about childbirth. His face did something then that Nora caught out of habit and kept: a softening, a stillness, the look of a man who could not believe his luck and had stopped trying to. She had shot forty weddings. She knew that look and how rare it was.</w:t>
+        <w:t>“That’s what I said. She said tired is not an aesthetic, tired is a condition.” He looked across the barn to where Mabs was hugging a great-aunt who was clearly telling her something about childbirth. His face did something then that Nora caught out of habit and kept: a softening, a stillness, the look of a man who could not believe his luck and had stopped trying to. She had shot forty-one weddings. She knew that look and how rare it was.</w:t>
       </w:r>
     </w:p>
     <w:p>
@@ -2202,7 +2202,7 @@
           <w:color w:val="2B2B2B"/>
           <w:sz w:val="26"/>
         </w:rPr>
-        <w:t>After the last toast Nora packed in the order she always packed: cards, batteries, the A-camera last, because it had seen the thing and she did not want it rattling in the trunk like groceries. A groomsman asked if she’d gotten the alpaca. She said she had gotten everything. On the county road a sheriff’s cruiser passed going the other way, no lights, in no hurry, which was how Lissome preferred its mysteries.</w:t>
+        <w:t>After the last toast Nora packed in the order she always packed: cards, batteries, the B-camera last, because it had seen the thing and she did not want it rattling in the trunk like groceries. A groomsman asked if she’d gotten the alpaca. She said she had gotten everything. On the county road a sheriff’s cruiser passed going the other way, no lights, in no hurry, which was how Lissome preferred its mysteries.</w:t>
       </w:r>
     </w:p>
     <w:p>
@@ -17692,7 +17692,7 @@
           <w:color w:val="2B2B2B"/>
           <w:sz w:val="26"/>
         </w:rPr>
-        <w:t>They sat on the back step until the fireflies thinned out, two people holding hands in the dark in a small town in Indiana, and above them, invisible, a dark thing four kilometers wide went on keeping its station sixty degrees ahead of Jupiter, the way it had for forty-six years, waiting.</w:t>
+        <w:t>They sat on the back step until the fireflies thinned out, two people holding hands in the dark in a small town in Indiana, and above them, invisible, a dark thing four kilometers wide went on keeping its station sixty degrees ahead of Jupiter, the way it had since 1979, waiting.</w:t>
       </w:r>
     </w:p>
     <w:p>
@@ -19678,9 +19678,7 @@
           <w:color w:val="auto"/>
           <w:sz w:val="26"/>
         </w:rPr>
-        <w:t xml:space="preserve">Once in the Solar System, distance remained distance. Earth to the Jupiter Trojans is not a phone call. In August the Boat sat about sixty degrees ahead of Jupiter, and the long way around the geometry put it a little under five astronomical units from Zaragoza: forty minutes, one way, on a good day, and closer to an hour when the angle soured. A question asked in the bowl could not be argued on the Boat before the sun came back. The tender existed to hide that fact from anyone who needed a human reaction time. It hung in </w:t>
-        <w:lastRenderedPageBreak/>
-        <w:t>geosynchronous orbit, thirty-six thousand kilometers up, an eighth of a second from a Halo gateway in Nevada. It cached instructions, authenticated old ones, and waited. Anything that happened inside the eighty-four seconds would be decided there, or it would not be decided at all.</w:t>
+        <w:t>Once in the Solar System, distance remained distance. Earth to the Jupiter Trojans is not a phone call. In August the Boat sat about sixty degrees ahead of Jupiter, and the long way around the geometry put it about six astronomical units from Zaragoza: some fifty minutes one way, and as long again for any answer. A question asked in the bowl could not be argued on the Boat before the sun came back. The tender existed to hide that fact from anyone who needed a human reaction time. It hung in geosynchronous orbit, thirty-six thousand kilometers up, an eighth of a second from a Halo gateway in Nevada. It cached instructions, authenticated old ones, and waited. Anything that happened inside the eighty-four seconds would be decided there, or it would not be decided at all.</w:t>
       </w:r>
     </w:p>
     <w:p>
@@ -19966,7 +19964,7 @@
           <w:color w:val="2B2B2B"/>
           <w:sz w:val="26"/>
         </w:rPr>
-        <w:t>“About thirty-six thousand kilometers above the equator, over the Amazon,” said a voice from the doorway, “turning at the same rate as the Earth, so that if you could see out, which you can’t, you’d see the same face of it all day.” A man stepped in. He was ordinary to look at: medium height, a runner’s build, a voice pitched to be forgettable in a crowd, which Nora would understand, by the end of the night, to be the entire design brief. “You’re aboard the tender, the shore boat, and not the ship. The ship is out in the Trojans, about forty-eight light-minutes from here this month. Years away at any speed this hull still has. Nobody’s taking you there. Nobody’s taking you anywhere except back.” He paused. “I’m sorry about the sedative. I argued against it. I lost.”</w:t>
+        <w:t>“About thirty-six thousand kilometers above the equator, over the Amazon,” said a voice from the doorway, “turning at the same rate as the Earth, so that if you could see out, which you can’t, you’d see the same face of it all day.” A man stepped in. He was ordinary to look at: medium height, a runner’s build, a voice pitched to be forgettable in a crowd, which Nora would understand, by the end of the night, to be the entire design brief. “You’re aboard the tender, the shore boat, and not the ship. The ship is out in the Trojans, about forty-nine light-minutes from here this month. Years away at any speed this hull still has. Nobody’s taking you there. Nobody’s taking you anywhere except back.” He paused. “I’m sorry about the sedative. I argued against it. I lost.”</w:t>
       </w:r>
     </w:p>
     <w:p>
@@ -30632,7 +30630,7 @@
           <w:color w:val="2B2B2B"/>
           <w:sz w:val="26"/>
         </w:rPr>
-        <w:t>He stood there. Above them, the sky over the plain was enormous and full of stars, and somewhere low in the west-south-west, fixed, invisible, a small old craft hung over the curve of the world, and somewhere far beyond it, forty-odd light-minutes out, sixty degrees ahead of a Jupiter they could not see, a dark hull four kilometers wide was keeping its station, and somewhere in a hotel in the old town, on a doormat balcony, a man stood barefoot holding an iron rail, looking west, not moving at all, while his wife lay in the bed behind him with her eyes open, letting him have one more night.</w:t>
+        <w:t>He stood there. Above them, the sky over the plain was enormous and full of stars, and somewhere low in the west-south-west, fixed, invisible, a small old craft hung over the curve of the world, and somewhere far beyond it, fifty light-minutes out, sixty degrees ahead of a Jupiter they could not see, a dark hull four kilometers wide was keeping its station, and somewhere in a hotel in the old town, on a doormat balcony, a man stood barefoot holding an iron rail, looking west, not moving at all, while his wife lay in the bed behind him with her eyes open, letting him have one more night.</w:t>
       </w:r>
     </w:p>
     <w:p>
@@ -35292,7 +35290,7 @@
           <w:color w:val="2B2B2B"/>
           <w:sz w:val="26"/>
         </w:rPr>
-        <w:t>“Clock,” said Priya, and she did not mean the eclipse. A second timer had come up on her screen under the muster, small and rude, counting down toward nothing. “The conditional is armed. It dies at third contact minus four seconds. If the carried sentence isn’t in the latch by then, the signature doesn’t fire. The Boat cannot help us. They are forty minutes away on a good day. This is the only switch that knows the clause, and it is already leaving.”</w:t>
+        <w:t>“Clock,” said Priya, and she did not mean the eclipse. A second timer had come up on her screen under the muster, small and rude, counting down toward nothing. “The conditional is armed. It dies at third contact minus four seconds. If the carried sentence isn’t in the latch by then, the signature doesn’t fire. The Boat cannot help us. They are fifty minutes away. This is the only switch that knows the clause, and it is already leaving.”</w:t>
       </w:r>
     </w:p>
     <w:p>
@@ -44077,9 +44075,7 @@
           <w:color w:val="2B2B2B"/>
           <w:sz w:val="26"/>
         </w:rPr>
-        <w:t xml:space="preserve">In 2022 the United States really did open an office to study objects seen in the sky and gave it a name only a committee could love: the All-domain Anomaly Resolution Office. Real allied governments really do run joint intelligence liaisons out of buildings near NATO </w:t>
-        <w:lastRenderedPageBreak/>
-        <w:t>headquarters that have nothing to do with any of this. This book does not belong to any of them, does not speak for them, and does not know anything they don’t. It invents a smaller office, a more anxious committee, and a satellite company that is, regrettably, more competent than several real ones.</w:t>
+        <w:t>In 2022 the United States really did open an office to study objects seen in the sky and gave it a name only a committee could love: the All-domain Anomaly Resolution Office. NATO’s headquarters in Brussels is real too, and has nothing to do with any of this. This book does not belong to any of them, does not speak for them, and does not know anything they don’t. It invents a smaller office, a more anxious committee, and a satellite company that is, regrettably, more competent than several real ones.</w:t>
       </w:r>
     </w:p>
     <w:p>
@@ -44309,7 +44305,7 @@
           <w:sz w:val="26"/>
           <w:szCs w:val="26"/>
         </w:rPr>
-        <w:t>The shore boat. An old tender in geosynchronous orbit, thirty-six thousand kilometers up, over the Amazon, about sixty degrees west: an eighth of a second from a Halo gateway. It caches instructions and can decide inside a human minute. The Boat, this August, is the better part of an hour away, a little under five astronomical units out among the Jupiter Trojans, and cannot reach a switch during totality.</w:t>
+        <w:t>The shore boat. An old tender in geosynchronous orbit, thirty-six thousand kilometers up, over the Amazon, about sixty degrees west: an eighth of a second from a Halo gateway. It caches instructions and can decide inside a human minute. The Boat, this August, is the better part of an hour away, about six astronomical units out among the Jupiter Trojans, and cannot reach a switch during totality.</w:t>
       </w:r>
     </w:p>
     <w:p>
@@ -44491,7 +44487,7 @@
         </w:rPr>
         <w:t xml:space="preserve">A ship that travels for forty thousand years rather than build something faster than light is not a fantasy so much as a concession: nothing in known physics outruns light, which leaves slow and enormous as the only honest option for crossing interstellar distance with a living crew. The concept has a name, </w:t>
       </w:r>
-      <w:hyperlink r:id="rId7">
+      <w:hyperlink w:anchor="bib_genship" w:history="1">
         <w:r>
           <w:rPr>
             <w:rStyle w:val="Hyperlink"/>
@@ -44499,7 +44495,7 @@
             <w:color w:val="2B2B2B"/>
             <w:sz w:val="26"/>
           </w:rPr>
-          <w:t>a generation ship</w:t>
+          <w:t xml:space="preserve">a generation ship</w:t>
         </w:r>
       </w:hyperlink>
       <w:r>
@@ -44508,11 +44504,9 @@
           <w:color w:val="2B2B2B"/>
           <w:sz w:val="26"/>
         </w:rPr>
-        <w:t xml:space="preserve">, and a real engineering literature, including Hein, Pak, Pütz, </w:t>
-        <w:lastRenderedPageBreak/>
-        <w:t>Bühler, and Reiss, “</w:t>
-      </w:r>
-      <w:hyperlink r:id="rId8">
+        <w:t xml:space="preserve">, and a real engineering literature, including Hein, Pak, Pütz, Bühler, and Reiss, “</w:t>
+      </w:r>
+      <w:hyperlink w:anchor="bib_hein" w:history="1">
         <w:r>
           <w:rPr>
             <w:rStyle w:val="Hyperlink"/>
@@ -44520,7 +44514,7 @@
             <w:color w:val="2B2B2B"/>
             <w:sz w:val="26"/>
           </w:rPr>
-          <w:t>World Ships — Architectures &amp; Feasibility Revisited</w:t>
+          <w:t xml:space="preserve">World Ships — Architectures &amp; Feasibility Revisited</w:t>
         </w:r>
       </w:hyperlink>
       <w:r>
@@ -44529,9 +44523,9 @@
           <w:color w:val="2B2B2B"/>
           <w:sz w:val="26"/>
         </w:rPr>
-        <w:t xml:space="preserve">,” Journal of the British Interplanetary Society (2012). Kurzgesagt’s YouTube film </w:t>
-      </w:r>
-      <w:hyperlink r:id="rId9">
+        <w:t xml:space="preserve">,” Journal of the British Interplanetary Society (2012). It is worth remembering, reading this book’s forty-thousand-year vessel held together by duct tape and committee, that humanity’s actual attempt at a small sealed biosphere, </w:t>
+      </w:r>
+      <w:hyperlink w:anchor="bib_biosphere2" w:history="1">
         <w:r>
           <w:rPr>
             <w:rStyle w:val="Hyperlink"/>
@@ -44539,7 +44533,7 @@
             <w:color w:val="2B2B2B"/>
             <w:sz w:val="26"/>
           </w:rPr>
-          <w:t>Generation Ships — The Hardest Part Is Not Distance</w:t>
+          <w:t xml:space="preserve">Biosphere 2</w:t>
         </w:r>
       </w:hyperlink>
       <w:r>
@@ -44548,9 +44542,47 @@
           <w:color w:val="2B2B2B"/>
           <w:sz w:val="26"/>
         </w:rPr>
-        <w:t xml:space="preserve"> treats the ship as a closed-world survival problem rather than a set piece. It is worth remembering, reading this book’s forty-thousand-year vessel held together by duct tape and committee, that humanity’s actual attempt at a small sealed biosphere, </w:t>
-      </w:r>
-      <w:hyperlink r:id="rId10">
+        <w:t xml:space="preserve">, sealed in Arizona in 1991, could not keep eight people supplied inside a fully sealed system for two years. Oxygen fell from 21 percent to about 14.5, crops failed, and outside oxygen had to be pumped in before the mission ended. All eight came out alive. The air did not hold. This book’s ship is not that. It is the version where the engineering problem gets solved, imperfectly, by people who had two thousand generations and no alternative. The solving is the fiction. The difficulty is not.</w:t>
+      </w:r>
+    </w:p>
+    <w:p>
+      <w:pPr>
+        <w:jc w:val="both"/>
+        <w:rPr>
+          <w:rFonts w:ascii="Georgia" w:hAnsi="Georgia"/>
+          <w:color w:val="2B2B2B"/>
+          <w:sz w:val="26"/>
+        </w:rPr>
+      </w:pPr>
+      <w:r>
+        <w:rPr>
+          <w:rFonts w:ascii="Georgia" w:hAnsi="Georgia"/>
+          <w:bCs/>
+          <w:color w:val="2B2B2B"/>
+          <w:sz w:val="26"/>
+          <w:szCs w:val="25"/>
+        </w:rPr>
+        <w:t>The Genetics Problem</w:t>
+      </w:r>
+    </w:p>
+    <w:p>
+      <w:pPr>
+        <w:jc w:val="both"/>
+        <w:rPr>
+          <w:rFonts w:ascii="Georgia" w:hAnsi="Georgia"/>
+          <w:color w:val="2B2B2B"/>
+          <w:sz w:val="26"/>
+        </w:rPr>
+      </w:pPr>
+      <w:r>
+        <w:rPr>
+          <w:rFonts w:ascii="Georgia" w:hAnsi="Georgia"/>
+          <w:color w:val="2B2B2B"/>
+          <w:sz w:val="26"/>
+        </w:rPr>
+        <w:t xml:space="preserve">The ship’s need for outside genetic material is not a decoration. A sealed population loses genetic diversity every generation. Conservation biology calls the floor under that loss a </w:t>
+      </w:r>
+      <w:hyperlink w:anchor="bib_mvp" w:history="1">
         <w:r>
           <w:rPr>
             <w:rStyle w:val="Hyperlink"/>
@@ -44558,7 +44590,7 @@
             <w:color w:val="2B2B2B"/>
             <w:sz w:val="26"/>
           </w:rPr>
-          <w:t>Biosphere 2</w:t>
+          <w:t xml:space="preserve">minimum viable population</w:t>
         </w:r>
       </w:hyperlink>
       <w:r>
@@ -44567,47 +44599,9 @@
           <w:color w:val="2B2B2B"/>
           <w:sz w:val="26"/>
         </w:rPr>
-        <w:t>, built in Arizona in 1991, could not keep eight people supplied inside a fully sealed system for two years. Oxygen fell from 21 percent to about 14.5, crops failed, and outside oxygen had to be pumped in before the mission ended. All eight came out alive. The air did not hold. This book’s ship is not that. It is the version where the engineering problem gets solved, imperfectly, by people who had two thousand generations and no alternative. The solving is the fiction. The difficulty is not.</w:t>
-      </w:r>
-    </w:p>
-    <w:p>
-      <w:pPr>
-        <w:jc w:val="both"/>
-        <w:rPr>
-          <w:rFonts w:ascii="Georgia" w:hAnsi="Georgia"/>
-          <w:color w:val="2B2B2B"/>
-          <w:sz w:val="26"/>
-        </w:rPr>
-      </w:pPr>
-      <w:r>
-        <w:rPr>
-          <w:rFonts w:ascii="Georgia" w:hAnsi="Georgia"/>
-          <w:bCs/>
-          <w:color w:val="2B2B2B"/>
-          <w:sz w:val="26"/>
-          <w:szCs w:val="25"/>
-        </w:rPr>
-        <w:t>The Genetics Problem</w:t>
-      </w:r>
-    </w:p>
-    <w:p>
-      <w:pPr>
-        <w:jc w:val="both"/>
-        <w:rPr>
-          <w:rFonts w:ascii="Georgia" w:hAnsi="Georgia"/>
-          <w:color w:val="2B2B2B"/>
-          <w:sz w:val="26"/>
-        </w:rPr>
-      </w:pPr>
-      <w:r>
-        <w:rPr>
-          <w:rFonts w:ascii="Georgia" w:hAnsi="Georgia"/>
-          <w:color w:val="2B2B2B"/>
-          <w:sz w:val="26"/>
-        </w:rPr>
-        <w:t xml:space="preserve">The ship’s need for outside genetic material is not a decoration. A sealed population loses genetic diversity every generation. Conservation biology calls the floor under that loss a </w:t>
-      </w:r>
-      <w:hyperlink r:id="rId11">
+        <w:t xml:space="preserve">, and the numbers argued for a wild species over evolutionary time are often in the thousands. </w:t>
+      </w:r>
+      <w:hyperlink w:anchor="bib_marin" w:history="1">
         <w:r>
           <w:rPr>
             <w:rStyle w:val="Hyperlink"/>
@@ -44615,7 +44609,7 @@
             <w:color w:val="2B2B2B"/>
             <w:sz w:val="26"/>
           </w:rPr>
-          <w:t>minimum viable population</w:t>
+          <w:t xml:space="preserve">Marin and Beluffi’s 2018 simulation</w:t>
         </w:r>
       </w:hyperlink>
       <w:r>
@@ -44624,9 +44618,7 @@
           <w:color w:val="2B2B2B"/>
           <w:sz w:val="26"/>
         </w:rPr>
-        <w:t xml:space="preserve">, and the numbers argued for a wild species over evolutionary time are often in the thousands. Marin and Beluffi’s 2018 simulation is more generous to the engineers than that folklore: under strict breeding rules, a founding crew of 98 can hold for a 6,300-year trip. Forty thousand years is not 6,300, and this book’s ship did not have those rules. That is the shopping trip. The story’s request, at the end, is for consented passage and consented samples, because taking infants without asking does not repair a crew, and </w:t>
-        <w:lastRenderedPageBreak/>
-        <w:t>children born on Earth to hybrid parents do not fly home by themselves.</w:t>
+        <w:t xml:space="preserve"> is more generous to the engineers than that folklore: under strict breeding rules, a founding crew of 98 can hold for a 6,300-year trip. Forty thousand years is not 6,300, and this book’s ship did not have those rules. That is the shopping trip. The story’s request, at the end, is for consented passage and consented samples, because taking infants without asking does not repair a crew, and children born on Earth to hybrid parents do not fly home by themselves.</w:t>
       </w:r>
     </w:p>
     <w:p>
@@ -44667,7 +44659,7 @@
         </w:rPr>
         <w:t xml:space="preserve">A dormant, waiting probe is an old idea in serious astronomy, not a storybook invention. Ronald Bracewell proposed in 1960 that a patient civilization might send automated observers ahead of itself to watch a young species rather than announce itself outright — the concept still carries his name, the </w:t>
       </w:r>
-      <w:hyperlink r:id="rId12" w:history="1">
+      <w:hyperlink w:anchor="bib_bracewell" w:history="1">
         <w:r>
           <w:rPr>
             <w:rStyle w:val="Hyperlink"/>
@@ -44676,7 +44668,7 @@
             <w:sz w:val="26"/>
             <w:szCs w:val="23"/>
           </w:rPr>
-          <w:t>Bracewell probe</w:t>
+          <w:t xml:space="preserve">Bracewell probe</w:t>
         </w:r>
       </w:hyperlink>
       <w:r>
@@ -44686,9 +44678,9 @@
           <w:sz w:val="26"/>
           <w:szCs w:val="23"/>
         </w:rPr>
-        <w:t xml:space="preserve"> — and modern SETI researchers have taken the idea seriously enough to plan where to look for one, including James Benford’s 2019 proposal to search the small asteroids that share Earth’s own orbit, written up as </w:t>
-      </w:r>
-      <w:hyperlink r:id="rId13" w:history="1">
+        <w:t xml:space="preserve"> — and modern SETI researchers have taken the idea seriously enough to plan where to look for one, including James Benford’s 2019 proposal to search the small asteroids that share Earth’s own orbit, written up as “</w:t>
+      </w:r>
+      <w:hyperlink w:anchor="bib_benford" w:history="1">
         <w:r>
           <w:rPr>
             <w:rStyle w:val="Hyperlink"/>
@@ -44697,7 +44689,7 @@
             <w:sz w:val="26"/>
             <w:szCs w:val="23"/>
           </w:rPr>
-          <w:t>“Looking for Lurkers”</w:t>
+          <w:t xml:space="preserve">Looking for Lurkers</w:t>
         </w:r>
       </w:hyperlink>
       <w:r>
@@ -44707,7 +44699,7 @@
           <w:sz w:val="26"/>
           <w:szCs w:val="23"/>
         </w:rPr>
-        <w:t>. Nobody has found one. That is, as this book’s Directorate would be the first to point out, exactly what you would also expect if there were nothing there.</w:t>
+        <w:t xml:space="preserve">”. Nobody has found one. That is, as this book’s Directorate would be the first to point out, exactly what you would also expect if there were nothing there.</w:t>
       </w:r>
     </w:p>
     <w:p>
@@ -44746,9 +44738,9 @@
           <w:sz w:val="26"/>
           <w:szCs w:val="23"/>
         </w:rPr>
-        <w:t xml:space="preserve">The idea that 1947-era radar was loud enough to be noticed is not this book’s invention either. Earth has been leaking electromagnetic evidence of itself since the first powerful transmitters went up, and the classic paper on the subject — Sullivan, Brown, and Wetherill’s </w:t>
-      </w:r>
-      <w:hyperlink r:id="rId14" w:history="1">
+        <w:t xml:space="preserve">The idea that 1947-era radar was loud enough to be noticed is not this book’s invention either. Earth has been leaking electromagnetic evidence of itself since the first powerful transmitters went up, and the classic paper on the subject — Sullivan, Brown, and Wetherill’s “</w:t>
+      </w:r>
+      <w:hyperlink w:anchor="bib_sullivan" w:history="1">
         <w:r>
           <w:rPr>
             <w:rStyle w:val="Hyperlink"/>
@@ -44757,7 +44749,7 @@
             <w:sz w:val="26"/>
             <w:szCs w:val="23"/>
           </w:rPr>
-          <w:t>“Eavesdropping: The Radio Signature of the Earth”</w:t>
+          <w:t xml:space="preserve">Eavesdropping: The Radio Signature of the Earth</w:t>
         </w:r>
       </w:hyperlink>
       <w:r>
@@ -44767,9 +44759,9 @@
           <w:sz w:val="26"/>
           <w:szCs w:val="23"/>
         </w:rPr>
-        <w:t xml:space="preserve">, Science, 1978 — first worked out how far our own military and civilian radar could plausibly be detected. Later analysis of the same leakage has been given the (much better) name </w:t>
-      </w:r>
-      <w:hyperlink r:id="rId15" w:history="1">
+        <w:t xml:space="preserve">”, Science, 1978 — first worked out how far our own television and radar signals could plausibly be detected. Astronomers now file such leakage under a (much better) name, </w:t>
+      </w:r>
+      <w:hyperlink w:anchor="bib_saide" w:history="1">
         <w:r>
           <w:rPr>
             <w:rStyle w:val="Hyperlink"/>
@@ -44778,7 +44770,7 @@
             <w:sz w:val="26"/>
             <w:szCs w:val="23"/>
           </w:rPr>
-          <w:t>technosignatures</w:t>
+          <w:t xml:space="preserve">technosignatures</w:t>
         </w:r>
       </w:hyperlink>
       <w:r>
@@ -44788,7 +44780,7 @@
           <w:sz w:val="26"/>
           <w:szCs w:val="23"/>
         </w:rPr>
-        <w:t>, and puts our more powerful broadcasts as detectable across a genuinely startling amount of the galaxy. This book borrows the year. The physics was already sitting there.</w:t>
+        <w:t xml:space="preserve">, and a 2025 study of airport and military radar put that leakage within reach of a telescope like Green Bank out to about two hundred light-years. This book borrows the year. The physics was already sitting there.</w:t>
       </w:r>
     </w:p>
     <w:p>
@@ -44828,7 +44820,7 @@
         </w:rPr>
         <w:t xml:space="preserve">Kade’s worry that Halo’s satellites might accidentally spot the ship is not hand-waved either. The real </w:t>
       </w:r>
-      <w:hyperlink r:id="rId16">
+      <w:hyperlink w:anchor="bib_rubin" w:history="1">
         <w:r>
           <w:rPr>
             <w:rStyle w:val="Hyperlink"/>
@@ -44836,9 +44828,7 @@
             <w:color w:val="2B2B2B"/>
             <w:sz w:val="26"/>
           </w:rPr>
-          <w:t xml:space="preserve">Vera C. </w:t>
-          <w:lastRenderedPageBreak/>
-          <w:t>Rubin Observatory</w:t>
+          <w:t xml:space="preserve">Vera C. Rubin Observatory</w:t>
         </w:r>
       </w:hyperlink>
       <w:r>
@@ -44887,7 +44877,7 @@
         </w:rPr>
         <w:t xml:space="preserve">A mote on the scale of a grain of rice is not pure invention. Seo, Neely, Shen, and colleagues showed, in </w:t>
       </w:r>
-      <w:hyperlink r:id="rId17">
+      <w:hyperlink w:anchor="bib_seo" w:history="1">
         <w:r>
           <w:rPr>
             <w:rStyle w:val="Hyperlink"/>
@@ -44895,7 +44885,7 @@
             <w:color w:val="2B2B2B"/>
             <w:sz w:val="26"/>
           </w:rPr>
-          <w:t>Neuron in 2016</w:t>
+          <w:t xml:space="preserve">Neuron in 2016</w:t>
         </w:r>
       </w:hyperlink>
       <w:r>
@@ -44904,7 +44894,7 @@
           <w:color w:val="2B2B2B"/>
           <w:sz w:val="26"/>
         </w:rPr>
-        <w:t>, that ultrasonic neural dust — wireless, dust-sized sensors — can record from a nerve at that size. What this book adds, and does not pretend has been demonstrated, is the second hop. The mote talks to a tender or a ground relay close enough to hear it. It does not stream a life to Jupiter. The constant signal in the novel is a dog tag: alive, located, unharmed. The occasional signal is a visit, at a range of hours missing from an ordinary afternoon, not a radio conversation with the Trojan swarm. A coin-sized commercial brain implant that talks to hardware worn on the body is a different machine, and it is not the one in this story.</w:t>
+        <w:t xml:space="preserve">, that ultrasonic neural dust — wireless, dust-sized sensors — can record from a nerve at that size. What this book adds, and does not pretend has been demonstrated, is the second hop. The mote talks to a tender or a ground relay close enough to hear it. It does not stream a life to Jupiter. The constant signal in the novel is a dog tag: alive, located, unharmed. The occasional signal is a visit, at a range of hours missing from an ordinary afternoon, not a radio conversation with the Trojan swarm. A coin-sized commercial brain implant that talks to hardware worn on the body is a different machine, and it is not the one in this story.</w:t>
       </w:r>
     </w:p>
     <w:p>
@@ -44944,7 +44934,7 @@
         </w:rPr>
         <w:t xml:space="preserve">Halo Systems is not much of an exaggeration. A real satellite internet constellation, </w:t>
       </w:r>
-      <w:hyperlink r:id="rId18">
+      <w:hyperlink w:anchor="bib_starlink" w:history="1">
         <w:r>
           <w:rPr>
             <w:rStyle w:val="Hyperlink"/>
@@ -44952,7 +44942,7 @@
             <w:color w:val="2B2B2B"/>
             <w:sz w:val="26"/>
           </w:rPr>
-          <w:t>Starlink</w:t>
+          <w:t xml:space="preserve">Starlink</w:t>
         </w:r>
       </w:hyperlink>
       <w:r>
@@ -44961,9 +44951,7 @@
           <w:color w:val="2B2B2B"/>
           <w:sz w:val="26"/>
         </w:rPr>
-        <w:t xml:space="preserve">, had, as of September 2026, more than eleven thousand working satellites in orbit, with public filings and stated ambitions running well past that. The idea of a company quietly running capable eyes on the solar system out of the same budget line as a consumer internet product is, on the </w:t>
-        <w:lastRenderedPageBreak/>
-        <w:t>public record of that constellation’s scale, not speculative. It is Tuesday.</w:t>
+        <w:t xml:space="preserve">, had, as of September 2026, more than eleven thousand working satellites in orbit, with public filings and stated ambitions running well past that. The idea of a company quietly running capable eyes on the solar system out of the same budget line as a consumer internet product is, on the public record of that constellation’s scale, not speculative. It is Tuesday.</w:t>
       </w:r>
     </w:p>
     <w:p>
@@ -45001,7 +44989,26 @@
           <w:color w:val="2B2B2B"/>
           <w:sz w:val="26"/>
         </w:rPr>
-        <w:t>The total solar eclipse of 12 August 2026 is real, and so are its numbers in this book. The Moon’s shadow crosses Greenland, Iceland and northern Spain in the early evening, and at Zaragoza totality lasts about a minute and twenty-four seconds, beginning at about 20:29 local summer time, with the Sun only about six degrees up, a little north of due west (azimuth about 285°). The Sun then sets still partly eclipsed, at about 21:07. The story’s second and third contacts, 20:28:58 and 20:30:22, agree with published predictions to within a few seconds; the exact figures move by a second or two with the observer’s position and the profile of the Moon’s limb. The times used here follow Fred Espenak’s path tables for NASA, which are worth reading for their own sake. The eighty-thousand-seat bowl on the plain west of the city is invented; the low, brief, sunset totality that made it worth building is not. The next total eclipse, on 2 August 2027, does cross the far south of Spain and gives about six minutes of totality near Luxor.</w:t>
+        <w:t xml:space="preserve">The total solar eclipse of 12 August 2026 is real, and so are its numbers in this book. The Moon’s shadow crosses Greenland, Iceland and northern Spain in the early evening, and at Zaragoza totality lasts about a minute and twenty-four seconds, beginning at about 20:29 local summer time, with the Sun only about six degrees up, a little north of due west (azimuth about 285°). The Sun then sets still partly eclipsed, at about 21:07. The story’s second and third contacts, 20:28:58 and 20:30:22, agree with published predictions to within a few seconds; the exact figures move by a second or two with the observer’s position and the profile of the Moon’s limb. The times used here follow </w:t>
+      </w:r>
+      <w:hyperlink w:anchor="bib_espenak" w:history="1">
+        <w:r>
+          <w:rPr>
+            <w:rStyle w:val="Hyperlink"/>
+            <w:rFonts w:ascii="Georgia" w:hAnsi="Georgia"/>
+            <w:color w:val="2B2B2B"/>
+            <w:sz w:val="26"/>
+          </w:rPr>
+          <w:t xml:space="preserve">Fred Espenak’s path tables for NASA</w:t>
+        </w:r>
+      </w:hyperlink>
+      <w:r>
+        <w:rPr>
+          <w:rFonts w:ascii="Georgia" w:hAnsi="Georgia"/>
+          <w:color w:val="2B2B2B"/>
+          <w:sz w:val="26"/>
+        </w:rPr>
+        <w:t xml:space="preserve">, which are worth reading for their own sake. The eighty-thousand-seat bowl on the plain west of the city is invented; the low, brief, sunset totality that made it worth building is not. The next total eclipse, on 2 August 2027, does cross the far south of Spain and gives about six minutes of totality near Luxor.</w:t>
       </w:r>
     </w:p>
     <w:p>
@@ -45079,7 +45086,45 @@
           <w:color w:val="2B2B2B"/>
           <w:sz w:val="26"/>
         </w:rPr>
-        <w:t>Fetal microchimerism is real. During pregnancy, cells and DNA from the fetus cross into the mother’s bloodstream; free fetal DNA in maternal blood is the basis of routine prenatal screening, and fetal cells have been found in mothers decades after giving birth. That is the true part. Using those cells to clone the baby — to grow a genetic twin in a tank in nine months, fit it with an implant, and swap it into a hospital cot — is entirely this book’s invention. Real mammalian cloning starts from a donor cell, an emptied egg and a surrogate mother, and rarely works even then; nothing in current biology comes close to what the ship does.</w:t>
+        <w:t xml:space="preserve">Fetal microchimerism is real. During pregnancy, cells and DNA from the fetus cross into the mother’s bloodstream; </w:t>
+      </w:r>
+      <w:hyperlink w:anchor="bib_lo" w:history="1">
+        <w:r>
+          <w:rPr>
+            <w:rStyle w:val="Hyperlink"/>
+            <w:rFonts w:ascii="Georgia" w:hAnsi="Georgia"/>
+            <w:color w:val="2B2B2B"/>
+            <w:sz w:val="26"/>
+          </w:rPr>
+          <w:t xml:space="preserve">free fetal DNA in maternal blood</w:t>
+        </w:r>
+      </w:hyperlink>
+      <w:r>
+        <w:rPr>
+          <w:rFonts w:ascii="Georgia" w:hAnsi="Georgia"/>
+          <w:color w:val="2B2B2B"/>
+          <w:sz w:val="26"/>
+        </w:rPr>
+        <w:t xml:space="preserve"> is the basis of routine prenatal screening, and </w:t>
+      </w:r>
+      <w:hyperlink w:anchor="bib_bianchi" w:history="1">
+        <w:r>
+          <w:rPr>
+            <w:rStyle w:val="Hyperlink"/>
+            <w:rFonts w:ascii="Georgia" w:hAnsi="Georgia"/>
+            <w:color w:val="2B2B2B"/>
+            <w:sz w:val="26"/>
+          </w:rPr>
+          <w:t xml:space="preserve">fetal cells have been found in mothers decades after giving birth</w:t>
+        </w:r>
+      </w:hyperlink>
+      <w:r>
+        <w:rPr>
+          <w:rFonts w:ascii="Georgia" w:hAnsi="Georgia"/>
+          <w:color w:val="2B2B2B"/>
+          <w:sz w:val="26"/>
+        </w:rPr>
+        <w:t xml:space="preserve">. That is the true part. Using those cells to clone the baby — to grow a genetic twin in a tank in nine months, fit it with an implant, and swap it into a hospital cot — is entirely this book’s invention. Real mammalian cloning starts from a donor cell, an emptied egg and a surrogate mother, and rarely works even then; nothing in current biology comes close to what the ship does.</w:t>
       </w:r>
     </w:p>
     <w:p>
@@ -45156,8 +45201,26 @@
           <w:color w:val="2B2B2B"/>
           <w:sz w:val="26"/>
         </w:rPr>
-        <w:lastRenderedPageBreak/>
-        <w:t>Eclipses really do change shortwave radio: as the Moon’s shadow passes, the ionosphere above it behaves briefly as if night had fallen, and amateur radio operators have taken part in organized eclipse experiments to measure the effect. Old, badly shielded transmitters really do leak faint spurious signals onto bands they were never meant to use. A tender in geosynchronous orbit leaking onto Huff’s receiver is fiction built from those two facts.</w:t>
+        <w:t xml:space="preserve">Eclipses really do change shortwave radio: as the Moon’s shadow passes, the ionosphere above it behaves briefly as if night had fallen, and amateur radio operators have taken part in </w:t>
+      </w:r>
+      <w:hyperlink w:anchor="bib_hamsci" w:history="1">
+        <w:r>
+          <w:rPr>
+            <w:rStyle w:val="Hyperlink"/>
+            <w:rFonts w:ascii="Georgia" w:hAnsi="Georgia"/>
+            <w:color w:val="2B2B2B"/>
+            <w:sz w:val="26"/>
+          </w:rPr>
+          <w:t xml:space="preserve">organized eclipse experiments</w:t>
+        </w:r>
+      </w:hyperlink>
+      <w:r>
+        <w:rPr>
+          <w:rFonts w:ascii="Georgia" w:hAnsi="Georgia"/>
+          <w:color w:val="2B2B2B"/>
+          <w:sz w:val="26"/>
+        </w:rPr>
+        <w:t xml:space="preserve"> to measure the effect. Old, badly shielded transmitters really do leak faint spurious signals onto bands they were never meant to use. A tender in geosynchronous orbit leaking onto Huff’s receiver is fiction built from those two facts.</w:t>
       </w:r>
     </w:p>
     <w:p>
@@ -45310,7 +45373,7 @@
         </w:rPr>
         <w:t xml:space="preserve">For readers who want the Fermi Paradox itself — the much older, much bigger question of why a galaxy old enough to be full of neighbors looks so empty — Kurzgesagt’s two-part explainer remains the clearest short version available: </w:t>
       </w:r>
-      <w:hyperlink r:id="rId19" w:history="1">
+      <w:hyperlink w:anchor="bib_kz_fermi" w:history="1">
         <w:r>
           <w:rPr>
             <w:rStyle w:val="Hyperlink"/>
@@ -45319,7 +45382,7 @@
             <w:sz w:val="26"/>
             <w:szCs w:val="23"/>
           </w:rPr>
-          <w:t>Part One</w:t>
+          <w:t xml:space="preserve">Part One and Part Two</w:t>
         </w:r>
       </w:hyperlink>
       <w:r>
@@ -45329,28 +45392,7 @@
           <w:sz w:val="26"/>
           <w:szCs w:val="23"/>
         </w:rPr>
-        <w:t xml:space="preserve"> and </w:t>
-      </w:r>
-      <w:hyperlink r:id="rId20" w:history="1">
-        <w:r>
-          <w:rPr>
-            <w:rStyle w:val="Hyperlink"/>
-            <w:rFonts w:ascii="Georgia" w:hAnsi="Georgia"/>
-            <w:color w:val="2B2B2B"/>
-            <w:sz w:val="26"/>
-            <w:szCs w:val="23"/>
-          </w:rPr>
-          <w:t>Part Two</w:t>
-        </w:r>
-      </w:hyperlink>
-      <w:r>
-        <w:rPr>
-          <w:rFonts w:ascii="Georgia" w:hAnsi="Georgia"/>
-          <w:color w:val="2B2B2B"/>
-          <w:sz w:val="26"/>
-          <w:szCs w:val="23"/>
-        </w:rPr>
-        <w:t>. This book’s answer — a species that solved the paradox by leaving early and being extremely patient — is one of dozens the video covers, and arguably not even the most likely one.</w:t>
+        <w:t xml:space="preserve">. This book’s answer — a species that solved the paradox by leaving early and being extremely patient — is one of dozens the video covers, and arguably not even the most likely one.</w:t>
       </w:r>
     </w:p>
     <w:p>
@@ -45388,25 +45430,16 @@
       </w:r>
     </w:p>
     <w:p>
+      <w:bookmarkStart w:id="9001" w:name="bib_hein"/>
       <w:r>
         <w:rPr>
           <w:rFonts w:ascii="Georgia" w:hAnsi="Georgia"/>
           <w:sz w:val="26"/>
           <w:szCs w:val="26"/>
         </w:rPr>
-        <w:t>Hein, A. M., Pak, M., Pütz, D., Bühler, C., and Reiss, P. “World Ships — Architectures &amp; Feasibility Revisited.” Journal of the British Interplanetary Society 65 (2012): 119–133. https://ui.adsabs.harvard.edu/abs/2012JBIS...65..119H/abstract</w:t>
-      </w:r>
-    </w:p>
-    <w:p>
-      <w:r>
-        <w:rPr>
-          <w:rFonts w:ascii="Georgia" w:hAnsi="Georgia"/>
-          <w:sz w:val="26"/>
-          <w:szCs w:val="26"/>
-        </w:rPr>
-        <w:t xml:space="preserve">Marin, F., and Beluffi, C. “Computing the Minimal Crew for a Multi-Generational Space Travel towards Proxima Centauri b.” </w:t>
-      </w:r>
-      <w:hyperlink r:id="rId21">
+        <w:t xml:space="preserve">Hein, A. M., Pak, M., Pütz, D., Bühler, C., and Reiss, P. “</w:t>
+      </w:r>
+      <w:hyperlink r:id="rId8" w:history="1">
         <w:r>
           <w:rPr>
             <w:rStyle w:val="Hyperlink"/>
@@ -45414,7 +45447,7 @@
             <w:sz w:val="26"/>
             <w:szCs w:val="26"/>
           </w:rPr>
-          <w:t>arXiv:1806.03856</w:t>
+          <w:t xml:space="preserve">World Ships — Architectures &amp; Feasibility Revisited</w:t>
         </w:r>
       </w:hyperlink>
       <w:r>
@@ -45423,69 +45456,21 @@
           <w:sz w:val="26"/>
           <w:szCs w:val="26"/>
         </w:rPr>
-        <w:t xml:space="preserve"> (2018). https://arxiv.org/abs/1806.03856</w:t>
-      </w:r>
-    </w:p>
-    <w:p>
+        <w:t xml:space="preserve">.” Journal of the British Interplanetary Society 65 (2012): 119–133.</w:t>
+      </w:r>
+      <w:bookmarkEnd w:id="9001"/>
+    </w:p>
+    <w:p>
+      <w:bookmarkStart w:id="9002" w:name="bib_marin"/>
       <w:r>
         <w:rPr>
           <w:rFonts w:ascii="Georgia" w:hAnsi="Georgia"/>
           <w:sz w:val="26"/>
           <w:szCs w:val="26"/>
         </w:rPr>
-        <w:t>Seo, D., Neely, R. M., Shen, K., et al. “Wireless Recording in the Peripheral Nervous System with Ultrasonic Neural Dust.” Neuron 91 (2016). https://doi.org/10.1016/j.neuron.2016.06.034</w:t>
-      </w:r>
-    </w:p>
-    <w:p>
-      <w:r>
-        <w:rPr>
-          <w:rFonts w:ascii="Georgia" w:hAnsi="Georgia"/>
-          <w:sz w:val="26"/>
-          <w:szCs w:val="26"/>
-        </w:rPr>
-        <w:t>Sullivan, W. T., Brown, S., and Wetherill, C. “Eavesdropping: The Radio Signature of the Earth.” Science 199 (1978): 377–388. https://www.science.org/doi/10.1126/science.199.4327.377</w:t>
-      </w:r>
-    </w:p>
-    <w:p>
-      <w:r>
-        <w:rPr>
-          <w:rFonts w:ascii="Georgia" w:hAnsi="Georgia"/>
-          <w:sz w:val="26"/>
-          <w:szCs w:val="26"/>
-        </w:rPr>
-        <w:t>Caisse Saide, R., and Garrett, M. Airport civilian and military radar leakage as a marker for extraterrestrial detection, presented at the Royal Astronomical Society National Astronomy Meeting 2025; reported by Sci.News. https://www.sci.news/astronomy/civilian-military-radar-leakage-alien-civilizations-14055.html</w:t>
-      </w:r>
-    </w:p>
-    <w:p>
-      <w:r>
-        <w:rPr>
-          <w:rFonts w:ascii="Georgia" w:hAnsi="Georgia"/>
-          <w:sz w:val="26"/>
-          <w:szCs w:val="26"/>
-        </w:rPr>
-        <w:t>Bracewell, R. N. “Communications from Superior Galactic Communities.” Nature 186 (1960): 670. https://doi.org/10.1038/186670a0</w:t>
-      </w:r>
-    </w:p>
-    <w:p>
-      <w:r>
-        <w:rPr>
-          <w:rFonts w:ascii="Georgia" w:hAnsi="Georgia"/>
-          <w:sz w:val="26"/>
-          <w:szCs w:val="26"/>
-        </w:rPr>
-        <w:t>Benford, J. “Looking for Lurkers.” arXiv:1903.09582 (2019). https://arxiv.org/pdf/1903.09582</w:t>
-      </w:r>
-    </w:p>
-    <w:p>
-      <w:r>
-        <w:rPr>
-          <w:rFonts w:ascii="Georgia" w:hAnsi="Georgia"/>
-          <w:sz w:val="26"/>
-          <w:szCs w:val="26"/>
-        </w:rPr>
-        <w:t xml:space="preserve">Kurzgesagt. </w:t>
-      </w:r>
-      <w:hyperlink r:id="rId22">
+        <w:t xml:space="preserve">Marin, F., and Beluffi, C. “</w:t>
+      </w:r>
+      <w:hyperlink r:id="rId21" w:history="1">
         <w:r>
           <w:rPr>
             <w:rStyle w:val="Hyperlink"/>
@@ -45493,7 +45478,7 @@
             <w:sz w:val="26"/>
             <w:szCs w:val="26"/>
           </w:rPr>
-          <w:t>Generation Ships — The Hardest Part Is Not Distance</w:t>
+          <w:t xml:space="preserve">Computing the Minimal Crew for a Multi-Generational Space Travel towards Proxima Centauri b</w:t>
         </w:r>
       </w:hyperlink>
       <w:r>
@@ -45502,63 +45487,21 @@
           <w:sz w:val="26"/>
           <w:szCs w:val="26"/>
         </w:rPr>
-        <w:t>. https://www.youtube.com/watch?v=Uxp8ZVkMUFk</w:t>
-      </w:r>
-    </w:p>
-    <w:p>
+        <w:t xml:space="preserve">.” arXiv:1806.03856 (2018).</w:t>
+      </w:r>
+      <w:bookmarkEnd w:id="9002"/>
+    </w:p>
+    <w:p>
+      <w:bookmarkStart w:id="9003" w:name="bib_seo"/>
       <w:r>
         <w:rPr>
           <w:rFonts w:ascii="Georgia" w:hAnsi="Georgia"/>
           <w:sz w:val="26"/>
           <w:szCs w:val="26"/>
         </w:rPr>
-        <w:t>Kurzgesagt. The Fermi Paradox, parts one and two. https://www.youtube.com/watch?v=sNhhvQGsMEc and https://www.youtube.com/watch?v=1fQkVqno-uI</w:t>
-      </w:r>
-    </w:p>
-    <w:p>
-      <w:r>
-        <w:rPr>
-          <w:rFonts w:ascii="Georgia" w:hAnsi="Georgia"/>
-          <w:sz w:val="26"/>
-          <w:szCs w:val="26"/>
-        </w:rPr>
-        <w:t xml:space="preserve">Espenak, F. “Path of Total Solar Eclipse of 2026 Aug 12.” NASA Goddard Space Flight Center. </w:t>
-        <w:lastRenderedPageBreak/>
-        <w:t>https://eclipse.gsfc.nasa.gov/SEpath/SEpath2001/SE2026Aug12Tpath.html</w:t>
-      </w:r>
-    </w:p>
-    <w:p>
-      <w:r>
-        <w:rPr>
-          <w:rFonts w:ascii="Georgia" w:hAnsi="Georgia"/>
-          <w:sz w:val="26"/>
-          <w:szCs w:val="26"/>
-        </w:rPr>
-        <w:t>Bianchi, D. W., Zickwolf, G. K., Weil, G. J., Sylvester, S., and DeMaria, M. A. “Male Fetal Progenitor Cells Persist in Maternal Blood for as Long as 27 Years Postpartum.” Proceedings of the National Academy of Sciences 93 (1996): 705–708. https://doi.org/10.1073/pnas.93.2.705</w:t>
-      </w:r>
-    </w:p>
-    <w:p>
-      <w:r>
-        <w:rPr>
-          <w:rFonts w:ascii="Georgia" w:hAnsi="Georgia"/>
-          <w:sz w:val="26"/>
-          <w:szCs w:val="26"/>
-        </w:rPr>
-        <w:t>Lo, Y. M. D., Corbetta, N., Chamberlain, P. F., et al. “Presence of Fetal DNA in Maternal Plasma and Serum.” The Lancet 350 (1997): 485–487. https://doi.org/10.1016/S0140-6736(97)02174-0</w:t>
-      </w:r>
-    </w:p>
-    <w:p>
-      <w:r>
-        <w:rPr>
-          <w:rFonts w:ascii="Georgia" w:hAnsi="Georgia"/>
-          <w:sz w:val="26"/>
-          <w:szCs w:val="26"/>
-        </w:rPr>
-        <w:t>HamSCI, the Ham Radio Science Citizen Investigation, eclipse ionosphere experiments. https://hamsci.org</w:t>
-      </w:r>
-    </w:p>
-    <w:p>
-      <w:hyperlink r:id="rId23">
+        <w:t xml:space="preserve">Seo, D., Neely, R. M., Shen, K., et al. “</w:t>
+      </w:r>
+      <w:hyperlink r:id="rId17" w:history="1">
         <w:r>
           <w:rPr>
             <w:rStyle w:val="Hyperlink"/>
@@ -45566,7 +45509,7 @@
             <w:sz w:val="26"/>
             <w:szCs w:val="26"/>
           </w:rPr>
-          <w:t>Biosphere 2</w:t>
+          <w:t xml:space="preserve">Wireless Recording in the Peripheral Nervous System with Ultrasonic Neural Dust</w:t>
         </w:r>
       </w:hyperlink>
       <w:r>
@@ -45575,41 +45518,21 @@
           <w:sz w:val="26"/>
           <w:szCs w:val="26"/>
         </w:rPr>
-        <w:t>. https://en.wikipedia.org/wiki/Biosphere_2</w:t>
-      </w:r>
-    </w:p>
-    <w:p>
+        <w:t xml:space="preserve">.” Neuron 91 (2016).</w:t>
+      </w:r>
+      <w:bookmarkEnd w:id="9003"/>
+    </w:p>
+    <w:p>
+      <w:bookmarkStart w:id="9004" w:name="bib_sullivan"/>
       <w:r>
         <w:rPr>
           <w:rFonts w:ascii="Georgia" w:hAnsi="Georgia"/>
           <w:sz w:val="26"/>
           <w:szCs w:val="26"/>
         </w:rPr>
-        <w:t>Minimum viable population. https://en.wikipedia.org/wiki/Minimum_viable_population</w:t>
-      </w:r>
-    </w:p>
-    <w:p>
-      <w:r>
-        <w:rPr>
-          <w:rFonts w:ascii="Georgia" w:hAnsi="Georgia"/>
-          <w:sz w:val="26"/>
-          <w:szCs w:val="26"/>
-        </w:rPr>
-        <w:t>Generation ship, overview. https://en.wikipedia.org/wiki/Generation_ship</w:t>
-      </w:r>
-    </w:p>
-    <w:p>
-      <w:r>
-        <w:rPr>
-          <w:rFonts w:ascii="Georgia" w:hAnsi="Georgia"/>
-          <w:sz w:val="26"/>
-          <w:szCs w:val="26"/>
-        </w:rPr>
-        <w:t>Vera C. Rubin Observatory and the Trojan surveys. https://arxiv.org/abs/2506.02487</w:t>
-      </w:r>
-    </w:p>
-    <w:p>
-      <w:hyperlink r:id="rId24">
+        <w:t xml:space="preserve">Sullivan, W. T., Brown, S., and Wetherill, C. “</w:t>
+      </w:r>
+      <w:hyperlink r:id="rId33" w:history="1">
         <w:r>
           <w:rPr>
             <w:rStyle w:val="Hyperlink"/>
@@ -45617,7 +45540,7 @@
             <w:sz w:val="26"/>
             <w:szCs w:val="26"/>
           </w:rPr>
-          <w:t>Starlink</w:t>
+          <w:t xml:space="preserve">Eavesdropping: The Radio Signature of the Earth</w:t>
         </w:r>
       </w:hyperlink>
       <w:r>
@@ -45626,8 +45549,423 @@
           <w:sz w:val="26"/>
           <w:szCs w:val="26"/>
         </w:rPr>
-        <w:t>, public reporting on scale, consulted September 2026. https://www.space.com/spacex-starlink-satellites.html</w:t>
-      </w:r>
+        <w:t xml:space="preserve">.” Science 199 (1978): 377–388.</w:t>
+      </w:r>
+      <w:bookmarkEnd w:id="9004"/>
+    </w:p>
+    <w:p>
+      <w:bookmarkStart w:id="9005" w:name="bib_saide"/>
+      <w:r>
+        <w:rPr>
+          <w:rFonts w:ascii="Georgia" w:hAnsi="Georgia"/>
+          <w:sz w:val="26"/>
+          <w:szCs w:val="26"/>
+        </w:rPr>
+        <w:t xml:space="preserve">Caisse Saide, R., Garrett, M., et al. “Examining Airport Civilian and Military Radar Leakage as a Detectable Marker for Extraterrestrial Civilizations.” Royal Astronomical Society National Astronomy Meeting 2025; reported by Sci.News as “</w:t>
+      </w:r>
+      <w:hyperlink r:id="rId15" w:history="1">
+        <w:r>
+          <w:rPr>
+            <w:rStyle w:val="Hyperlink"/>
+            <w:rFonts w:ascii="Georgia" w:hAnsi="Georgia"/>
+            <w:sz w:val="26"/>
+            <w:szCs w:val="26"/>
+          </w:rPr>
+          <w:t xml:space="preserve">Civilian and Military Radar Leakage Is Revealing Our Existence to Alien Civilizations</w:t>
+        </w:r>
+      </w:hyperlink>
+      <w:r>
+        <w:rPr>
+          <w:rFonts w:ascii="Georgia" w:hAnsi="Georgia"/>
+          <w:sz w:val="26"/>
+          <w:szCs w:val="26"/>
+        </w:rPr>
+        <w:t xml:space="preserve">.”</w:t>
+      </w:r>
+      <w:bookmarkEnd w:id="9005"/>
+    </w:p>
+    <w:p>
+      <w:bookmarkStart w:id="9006" w:name="bib_bracewell"/>
+      <w:r>
+        <w:rPr>
+          <w:rFonts w:ascii="Georgia" w:hAnsi="Georgia"/>
+          <w:sz w:val="26"/>
+          <w:szCs w:val="26"/>
+        </w:rPr>
+        <w:t xml:space="preserve">Bracewell, R. N. “</w:t>
+      </w:r>
+      <w:hyperlink r:id="rId12" w:history="1">
+        <w:r>
+          <w:rPr>
+            <w:rStyle w:val="Hyperlink"/>
+            <w:rFonts w:ascii="Georgia" w:hAnsi="Georgia"/>
+            <w:sz w:val="26"/>
+            <w:szCs w:val="26"/>
+          </w:rPr>
+          <w:t xml:space="preserve">Communications from Superior Galactic Communities</w:t>
+        </w:r>
+      </w:hyperlink>
+      <w:r>
+        <w:rPr>
+          <w:rFonts w:ascii="Georgia" w:hAnsi="Georgia"/>
+          <w:sz w:val="26"/>
+          <w:szCs w:val="26"/>
+        </w:rPr>
+        <w:t xml:space="preserve">.” Nature 186 (1960): 670.</w:t>
+      </w:r>
+      <w:bookmarkEnd w:id="9006"/>
+    </w:p>
+    <w:p>
+      <w:bookmarkStart w:id="9007" w:name="bib_benford"/>
+      <w:r>
+        <w:rPr>
+          <w:rFonts w:ascii="Georgia" w:hAnsi="Georgia"/>
+          <w:sz w:val="26"/>
+          <w:szCs w:val="26"/>
+        </w:rPr>
+        <w:t xml:space="preserve">Benford, J. “</w:t>
+      </w:r>
+      <w:hyperlink r:id="rId34" w:history="1">
+        <w:r>
+          <w:rPr>
+            <w:rStyle w:val="Hyperlink"/>
+            <w:rFonts w:ascii="Georgia" w:hAnsi="Georgia"/>
+            <w:sz w:val="26"/>
+            <w:szCs w:val="26"/>
+          </w:rPr>
+          <w:t xml:space="preserve">Looking for Lurkers</w:t>
+        </w:r>
+      </w:hyperlink>
+      <w:r>
+        <w:rPr>
+          <w:rFonts w:ascii="Georgia" w:hAnsi="Georgia"/>
+          <w:sz w:val="26"/>
+          <w:szCs w:val="26"/>
+        </w:rPr>
+        <w:t xml:space="preserve">.” arXiv:1903.09582 (2019).</w:t>
+      </w:r>
+      <w:bookmarkEnd w:id="9007"/>
+    </w:p>
+    <w:p>
+      <w:bookmarkStart w:id="9008" w:name="bib_kz_fermi"/>
+      <w:r>
+        <w:rPr>
+          <w:rFonts w:ascii="Georgia" w:hAnsi="Georgia"/>
+          <w:sz w:val="26"/>
+          <w:szCs w:val="26"/>
+        </w:rPr>
+        <w:t xml:space="preserve">Kurzgesagt – In a Nutshell. “</w:t>
+      </w:r>
+      <w:hyperlink r:id="rId19" w:history="1">
+        <w:r>
+          <w:rPr>
+            <w:rStyle w:val="Hyperlink"/>
+            <w:rFonts w:ascii="Georgia" w:hAnsi="Georgia"/>
+            <w:sz w:val="26"/>
+            <w:szCs w:val="26"/>
+          </w:rPr>
+          <w:t xml:space="preserve">The Fermi Paradox — Where Are All the Aliens? (1/2)</w:t>
+        </w:r>
+      </w:hyperlink>
+      <w:r>
+        <w:rPr>
+          <w:rFonts w:ascii="Georgia" w:hAnsi="Georgia"/>
+          <w:sz w:val="26"/>
+          <w:szCs w:val="26"/>
+        </w:rPr>
+        <w:t xml:space="preserve">” and “</w:t>
+      </w:r>
+      <w:hyperlink r:id="rId20" w:history="1">
+        <w:r>
+          <w:rPr>
+            <w:rStyle w:val="Hyperlink"/>
+            <w:rFonts w:ascii="Georgia" w:hAnsi="Georgia"/>
+            <w:sz w:val="26"/>
+            <w:szCs w:val="26"/>
+          </w:rPr>
+          <w:t xml:space="preserve">The Fermi Paradox II — Solutions and Ideas</w:t>
+        </w:r>
+      </w:hyperlink>
+      <w:r>
+        <w:rPr>
+          <w:rFonts w:ascii="Georgia" w:hAnsi="Georgia"/>
+          <w:sz w:val="26"/>
+          <w:szCs w:val="26"/>
+        </w:rPr>
+        <w:t xml:space="preserve">.” YouTube.</w:t>
+      </w:r>
+      <w:bookmarkEnd w:id="9008"/>
+    </w:p>
+    <w:p>
+      <w:bookmarkStart w:id="9009" w:name="bib_espenak"/>
+      <w:r>
+        <w:rPr>
+          <w:rFonts w:ascii="Georgia" w:hAnsi="Georgia"/>
+          <w:sz w:val="26"/>
+          <w:szCs w:val="26"/>
+        </w:rPr>
+        <w:t xml:space="preserve">Espenak, F. “</w:t>
+      </w:r>
+      <w:hyperlink r:id="rId35" w:history="1">
+        <w:r>
+          <w:rPr>
+            <w:rStyle w:val="Hyperlink"/>
+            <w:rFonts w:ascii="Georgia" w:hAnsi="Georgia"/>
+            <w:sz w:val="26"/>
+            <w:szCs w:val="26"/>
+          </w:rPr>
+          <w:t xml:space="preserve">Path of Total Solar Eclipse of 2026 Aug 12</w:t>
+        </w:r>
+      </w:hyperlink>
+      <w:r>
+        <w:rPr>
+          <w:rFonts w:ascii="Georgia" w:hAnsi="Georgia"/>
+          <w:sz w:val="26"/>
+          <w:szCs w:val="26"/>
+        </w:rPr>
+        <w:t xml:space="preserve">.” NASA Goddard Space Flight Center.</w:t>
+      </w:r>
+      <w:bookmarkEnd w:id="9009"/>
+    </w:p>
+    <w:p>
+      <w:bookmarkStart w:id="9010" w:name="bib_bianchi"/>
+      <w:r>
+        <w:rPr>
+          <w:rFonts w:ascii="Georgia" w:hAnsi="Georgia"/>
+          <w:sz w:val="26"/>
+          <w:szCs w:val="26"/>
+        </w:rPr>
+        <w:t xml:space="preserve">Bianchi, D. W., Zickwolf, G. K., Weil, G. J., Sylvester, S., and DeMaria, M. A. “</w:t>
+      </w:r>
+      <w:hyperlink r:id="rId36" w:history="1">
+        <w:r>
+          <w:rPr>
+            <w:rStyle w:val="Hyperlink"/>
+            <w:rFonts w:ascii="Georgia" w:hAnsi="Georgia"/>
+            <w:sz w:val="26"/>
+            <w:szCs w:val="26"/>
+          </w:rPr>
+          <w:t xml:space="preserve">Male Fetal Progenitor Cells Persist in Maternal Blood for as Long as 27 Years Postpartum</w:t>
+        </w:r>
+      </w:hyperlink>
+      <w:r>
+        <w:rPr>
+          <w:rFonts w:ascii="Georgia" w:hAnsi="Georgia"/>
+          <w:sz w:val="26"/>
+          <w:szCs w:val="26"/>
+        </w:rPr>
+        <w:t xml:space="preserve">.” Proceedings of the National Academy of Sciences 93 (1996): 705–708.</w:t>
+      </w:r>
+      <w:bookmarkEnd w:id="9010"/>
+    </w:p>
+    <w:p>
+      <w:bookmarkStart w:id="9011" w:name="bib_lo"/>
+      <w:r>
+        <w:rPr>
+          <w:rFonts w:ascii="Georgia" w:hAnsi="Georgia"/>
+          <w:sz w:val="26"/>
+          <w:szCs w:val="26"/>
+        </w:rPr>
+        <w:t xml:space="preserve">Lo, Y. M. D., Corbetta, N., Chamberlain, P. F., et al. “</w:t>
+      </w:r>
+      <w:hyperlink r:id="rId37" w:history="1">
+        <w:r>
+          <w:rPr>
+            <w:rStyle w:val="Hyperlink"/>
+            <w:rFonts w:ascii="Georgia" w:hAnsi="Georgia"/>
+            <w:sz w:val="26"/>
+            <w:szCs w:val="26"/>
+          </w:rPr>
+          <w:t xml:space="preserve">Presence of Fetal DNA in Maternal Plasma and Serum</w:t>
+        </w:r>
+      </w:hyperlink>
+      <w:r>
+        <w:rPr>
+          <w:rFonts w:ascii="Georgia" w:hAnsi="Georgia"/>
+          <w:sz w:val="26"/>
+          <w:szCs w:val="26"/>
+        </w:rPr>
+        <w:t xml:space="preserve">.” The Lancet 350 (1997): 485–487.</w:t>
+      </w:r>
+      <w:bookmarkEnd w:id="9011"/>
+    </w:p>
+    <w:p>
+      <w:bookmarkStart w:id="9012" w:name="bib_hamsci"/>
+      <w:hyperlink r:id="rId38" w:history="1">
+        <w:r>
+          <w:rPr>
+            <w:rStyle w:val="Hyperlink"/>
+            <w:rFonts w:ascii="Georgia" w:hAnsi="Georgia"/>
+            <w:sz w:val="26"/>
+            <w:szCs w:val="26"/>
+          </w:rPr>
+          <w:t xml:space="preserve">HamSCI</w:t>
+        </w:r>
+      </w:hyperlink>
+      <w:r>
+        <w:rPr>
+          <w:rFonts w:ascii="Georgia" w:hAnsi="Georgia"/>
+          <w:sz w:val="26"/>
+          <w:szCs w:val="26"/>
+        </w:rPr>
+        <w:t xml:space="preserve">, the Ham Radio Science Citizen Investigation: eclipse ionosphere experiments.</w:t>
+      </w:r>
+      <w:bookmarkEnd w:id="9012"/>
+    </w:p>
+    <w:p>
+      <w:bookmarkStart w:id="9013" w:name="bib_biosphere2"/>
+      <w:r>
+        <w:rPr>
+          <w:rFonts w:ascii="Georgia" w:hAnsi="Georgia"/>
+          <w:sz w:val="26"/>
+          <w:szCs w:val="26"/>
+        </w:rPr>
+        <w:t xml:space="preserve">“</w:t>
+      </w:r>
+      <w:hyperlink r:id="rId23" w:history="1">
+        <w:r>
+          <w:rPr>
+            <w:rStyle w:val="Hyperlink"/>
+            <w:rFonts w:ascii="Georgia" w:hAnsi="Georgia"/>
+            <w:sz w:val="26"/>
+            <w:szCs w:val="26"/>
+          </w:rPr>
+          <w:t xml:space="preserve">Biosphere 2</w:t>
+        </w:r>
+      </w:hyperlink>
+      <w:r>
+        <w:rPr>
+          <w:rFonts w:ascii="Georgia" w:hAnsi="Georgia"/>
+          <w:sz w:val="26"/>
+          <w:szCs w:val="26"/>
+        </w:rPr>
+        <w:t xml:space="preserve">.” Wikipedia.</w:t>
+      </w:r>
+      <w:bookmarkEnd w:id="9013"/>
+    </w:p>
+    <w:p>
+      <w:bookmarkStart w:id="9014" w:name="bib_mvp"/>
+      <w:r>
+        <w:rPr>
+          <w:rFonts w:ascii="Georgia" w:hAnsi="Georgia"/>
+          <w:sz w:val="26"/>
+          <w:szCs w:val="26"/>
+        </w:rPr>
+        <w:t xml:space="preserve">“</w:t>
+      </w:r>
+      <w:hyperlink r:id="rId39" w:history="1">
+        <w:r>
+          <w:rPr>
+            <w:rStyle w:val="Hyperlink"/>
+            <w:rFonts w:ascii="Georgia" w:hAnsi="Georgia"/>
+            <w:sz w:val="26"/>
+            <w:szCs w:val="26"/>
+          </w:rPr>
+          <w:t xml:space="preserve">Minimum viable population</w:t>
+        </w:r>
+      </w:hyperlink>
+      <w:r>
+        <w:rPr>
+          <w:rFonts w:ascii="Georgia" w:hAnsi="Georgia"/>
+          <w:sz w:val="26"/>
+          <w:szCs w:val="26"/>
+        </w:rPr>
+        <w:t xml:space="preserve">.” Wikipedia.</w:t>
+      </w:r>
+      <w:bookmarkEnd w:id="9014"/>
+    </w:p>
+    <w:p>
+      <w:bookmarkStart w:id="9015" w:name="bib_genship"/>
+      <w:r>
+        <w:rPr>
+          <w:rFonts w:ascii="Georgia" w:hAnsi="Georgia"/>
+          <w:sz w:val="26"/>
+          <w:szCs w:val="26"/>
+        </w:rPr>
+        <w:t xml:space="preserve">“</w:t>
+      </w:r>
+      <w:hyperlink r:id="rId40" w:history="1">
+        <w:r>
+          <w:rPr>
+            <w:rStyle w:val="Hyperlink"/>
+            <w:rFonts w:ascii="Georgia" w:hAnsi="Georgia"/>
+            <w:sz w:val="26"/>
+            <w:szCs w:val="26"/>
+          </w:rPr>
+          <w:t xml:space="preserve">Generation ship</w:t>
+        </w:r>
+      </w:hyperlink>
+      <w:r>
+        <w:rPr>
+          <w:rFonts w:ascii="Georgia" w:hAnsi="Georgia"/>
+          <w:sz w:val="26"/>
+          <w:szCs w:val="26"/>
+        </w:rPr>
+        <w:t xml:space="preserve">.” Wikipedia.</w:t>
+      </w:r>
+      <w:bookmarkEnd w:id="9015"/>
+    </w:p>
+    <w:p>
+      <w:bookmarkStart w:id="9016" w:name="bib_rubin"/>
+      <w:r>
+        <w:rPr>
+          <w:rFonts w:ascii="Georgia" w:hAnsi="Georgia"/>
+          <w:sz w:val="26"/>
+          <w:szCs w:val="26"/>
+        </w:rPr>
+        <w:t xml:space="preserve">Kurlander, J. A., Bernardinelli, P. H., Schwamb, M. E., et al. “</w:t>
+      </w:r>
+      <w:hyperlink r:id="rId16" w:history="1">
+        <w:r>
+          <w:rPr>
+            <w:rStyle w:val="Hyperlink"/>
+            <w:rFonts w:ascii="Georgia" w:hAnsi="Georgia"/>
+            <w:sz w:val="26"/>
+            <w:szCs w:val="26"/>
+          </w:rPr>
+          <w:t xml:space="preserve">Predictions of the LSST Solar System Yield: Near-Earth Objects, Main Belt Asteroids, Jupiter Trojans, and Trans-Neptunian Objects</w:t>
+        </w:r>
+      </w:hyperlink>
+      <w:r>
+        <w:rPr>
+          <w:rFonts w:ascii="Georgia" w:hAnsi="Georgia"/>
+          <w:sz w:val="26"/>
+          <w:szCs w:val="26"/>
+        </w:rPr>
+        <w:t xml:space="preserve">.” arXiv:2506.02487 (2025). The Vera C. Rubin Observatory forecast.</w:t>
+      </w:r>
+      <w:bookmarkEnd w:id="9016"/>
+    </w:p>
+    <w:p>
+      <w:bookmarkStart w:id="9017" w:name="bib_starlink"/>
+      <w:r>
+        <w:rPr>
+          <w:rFonts w:ascii="Georgia" w:hAnsi="Georgia"/>
+          <w:sz w:val="26"/>
+          <w:szCs w:val="26"/>
+        </w:rPr>
+        <w:t xml:space="preserve">Space.com. “</w:t>
+      </w:r>
+      <w:hyperlink r:id="rId18" w:history="1">
+        <w:r>
+          <w:rPr>
+            <w:rStyle w:val="Hyperlink"/>
+            <w:rFonts w:ascii="Georgia" w:hAnsi="Georgia"/>
+            <w:sz w:val="26"/>
+            <w:szCs w:val="26"/>
+          </w:rPr>
+          <w:t xml:space="preserve">Starlink satellites: Facts, tracking and impact on astronomy</w:t>
+        </w:r>
+      </w:hyperlink>
+      <w:r>
+        <w:rPr>
+          <w:rFonts w:ascii="Georgia" w:hAnsi="Georgia"/>
+          <w:sz w:val="26"/>
+          <w:szCs w:val="26"/>
+        </w:rPr>
+        <w:t xml:space="preserve">.” Consulted September 2026.</w:t>
+      </w:r>
+      <w:bookmarkEnd w:id="9017"/>
     </w:p>
     <w:p>
       <w:pPr>
@@ -45678,29 +46016,7 @@
           <w:color w:val="2B2B2B"/>
           <w:szCs w:val="22"/>
         </w:rPr>
-        <w:t>The Invasion Storybooks begin with this book. The nine cousins named in the note are films and television series, not titles you can buy under this name. Prose retellings of those nine are still to come, and each of them will have to keep its hands off dialogue that belongs to someone else. When a retelling is finished, its title will be printed on this page. Until then, this is the shelf.</w:t>
-      </w:r>
-    </w:p>
-    <w:p>
-      <w:pPr>
-        <w:pStyle w:val="ListParagraph"/>
-        <w:numPr>
-          <w:ilvl w:val="0"/>
-          <w:numId w:val="4"/>
-        </w:numPr>
-        <w:rPr>
-          <w:rFonts w:ascii="Georgia" w:hAnsi="Georgia"/>
-          <w:color w:val="2B2B2B"/>
-          <w:szCs w:val="22"/>
-        </w:rPr>
-      </w:pPr>
-      <w:r>
-        <w:rPr>
-          <w:rFonts w:ascii="Georgia" w:hAnsi="Georgia"/>
-          <w:color w:val="2B2B2B"/>
-          <w:szCs w:val="22"/>
-        </w:rPr>
-        <w:t>Protocol Flamingo (Book 1, this book)</w:t>
+        <w:t>The Invasion Storybooks begin with this book. The nine cousins named in the note are films and television series, not titles you can buy under this name. When a prose retelling of one of them is finished, its title will be printed on this page.</w:t>
       </w:r>
     </w:p>
     <w:p>

</xml_diff>

<commit_message>
Protocol Flamingo strict rescore 8.7 to 9.2 and links rule (per-path from book-2-lectures-after-qed 7673f54)
</commit_message>
<xml_diff>
--- a/Protocol Flamingo/Protocol_Flamingo_REV10.docx
+++ b/Protocol Flamingo/Protocol_Flamingo_REV10.docx
@@ -145,7 +145,7 @@
           <w:sz w:val="18"/>
           <w:szCs w:val="16"/>
         </w:rPr>
-        <w:t>Lothar J. Musiol</w:t>
+        <w:t>Lothar J. Musiol writing as George Herbert Fontaine</w:t>
       </w:r>
     </w:p>
     <w:p>
@@ -1865,7 +1865,7 @@
           <w:color w:val="2B2B2B"/>
           <w:sz w:val="26"/>
         </w:rPr>
-        <w:t>“That’s what I said. She said tired is not an aesthetic, tired is a condition.” He looked across the barn to where Mabs was hugging a great-aunt who was clearly telling her something about childbirth. His face did something then that Nora caught out of habit and kept: a softening, a stillness, the look of a man who could not believe his luck and had stopped trying to. She had shot forty weddings. She knew that look and how rare it was.</w:t>
+        <w:t>“That’s what I said. She said tired is not an aesthetic, tired is a condition.” He looked across the barn to where Mabs was hugging a great-aunt who was clearly telling her something about childbirth. His face did something then that Nora caught out of habit and kept: a softening, a stillness, the look of a man who could not believe his luck and had stopped trying to. She had shot forty-one weddings. She knew that look and how rare it was.</w:t>
       </w:r>
     </w:p>
     <w:p>
@@ -2202,7 +2202,7 @@
           <w:color w:val="2B2B2B"/>
           <w:sz w:val="26"/>
         </w:rPr>
-        <w:t>After the last toast Nora packed in the order she always packed: cards, batteries, the A-camera last, because it had seen the thing and she did not want it rattling in the trunk like groceries. A groomsman asked if she’d gotten the alpaca. She said she had gotten everything. On the county road a sheriff’s cruiser passed going the other way, no lights, in no hurry, which was how Lissome preferred its mysteries.</w:t>
+        <w:t>After the last toast Nora packed in the order she always packed: cards, batteries, the B-camera last, because it had seen the thing and she did not want it rattling in the trunk like groceries. A groomsman asked if she’d gotten the alpaca. She said she had gotten everything. On the county road a sheriff’s cruiser passed going the other way, no lights, in no hurry, which was how Lissome preferred its mysteries.</w:t>
       </w:r>
     </w:p>
     <w:p>
@@ -17692,7 +17692,7 @@
           <w:color w:val="2B2B2B"/>
           <w:sz w:val="26"/>
         </w:rPr>
-        <w:t>They sat on the back step until the fireflies thinned out, two people holding hands in the dark in a small town in Indiana, and above them, invisible, a dark thing four kilometers wide went on keeping its station sixty degrees ahead of Jupiter, the way it had for forty-six years, waiting.</w:t>
+        <w:t>They sat on the back step until the fireflies thinned out, two people holding hands in the dark in a small town in Indiana, and above them, invisible, a dark thing four kilometers wide went on keeping its station sixty degrees ahead of Jupiter, the way it had since 1979, waiting.</w:t>
       </w:r>
     </w:p>
     <w:p>
@@ -19678,9 +19678,7 @@
           <w:color w:val="auto"/>
           <w:sz w:val="26"/>
         </w:rPr>
-        <w:t xml:space="preserve">Once in the Solar System, distance remained distance. Earth to the Jupiter Trojans is not a phone call. In August the Boat sat about sixty degrees ahead of Jupiter, and the long way around the geometry put it a little under five astronomical units from Zaragoza: forty minutes, one way, on a good day, and closer to an hour when the angle soured. A question asked in the bowl could not be argued on the Boat before the sun came back. The tender existed to hide that fact from anyone who needed a human reaction time. It hung in </w:t>
-        <w:lastRenderedPageBreak/>
-        <w:t>geosynchronous orbit, thirty-six thousand kilometers up, an eighth of a second from a Halo gateway in Nevada. It cached instructions, authenticated old ones, and waited. Anything that happened inside the eighty-four seconds would be decided there, or it would not be decided at all.</w:t>
+        <w:t>Once in the Solar System, distance remained distance. Earth to the Jupiter Trojans is not a phone call. In August the Boat sat about sixty degrees ahead of Jupiter, and the long way around the geometry put it about six astronomical units from Zaragoza: some fifty minutes one way, and as long again for any answer. A question asked in the bowl could not be argued on the Boat before the sun came back. The tender existed to hide that fact from anyone who needed a human reaction time. It hung in geosynchronous orbit, thirty-six thousand kilometers up, an eighth of a second from a Halo gateway in Nevada. It cached instructions, authenticated old ones, and waited. Anything that happened inside the eighty-four seconds would be decided there, or it would not be decided at all.</w:t>
       </w:r>
     </w:p>
     <w:p>
@@ -19966,7 +19964,7 @@
           <w:color w:val="2B2B2B"/>
           <w:sz w:val="26"/>
         </w:rPr>
-        <w:t>“About thirty-six thousand kilometers above the equator, over the Amazon,” said a voice from the doorway, “turning at the same rate as the Earth, so that if you could see out, which you can’t, you’d see the same face of it all day.” A man stepped in. He was ordinary to look at: medium height, a runner’s build, a voice pitched to be forgettable in a crowd, which Nora would understand, by the end of the night, to be the entire design brief. “You’re aboard the tender, the shore boat, and not the ship. The ship is out in the Trojans, about forty-eight light-minutes from here this month. Years away at any speed this hull still has. Nobody’s taking you there. Nobody’s taking you anywhere except back.” He paused. “I’m sorry about the sedative. I argued against it. I lost.”</w:t>
+        <w:t>“About thirty-six thousand kilometers above the equator, over the Amazon,” said a voice from the doorway, “turning at the same rate as the Earth, so that if you could see out, which you can’t, you’d see the same face of it all day.” A man stepped in. He was ordinary to look at: medium height, a runner’s build, a voice pitched to be forgettable in a crowd, which Nora would understand, by the end of the night, to be the entire design brief. “You’re aboard the tender, the shore boat, and not the ship. The ship is out in the Trojans, about forty-nine light-minutes from here this month. Years away at any speed this hull still has. Nobody’s taking you there. Nobody’s taking you anywhere except back.” He paused. “I’m sorry about the sedative. I argued against it. I lost.”</w:t>
       </w:r>
     </w:p>
     <w:p>
@@ -30632,7 +30630,7 @@
           <w:color w:val="2B2B2B"/>
           <w:sz w:val="26"/>
         </w:rPr>
-        <w:t>He stood there. Above them, the sky over the plain was enormous and full of stars, and somewhere low in the west-south-west, fixed, invisible, a small old craft hung over the curve of the world, and somewhere far beyond it, forty-odd light-minutes out, sixty degrees ahead of a Jupiter they could not see, a dark hull four kilometers wide was keeping its station, and somewhere in a hotel in the old town, on a doormat balcony, a man stood barefoot holding an iron rail, looking west, not moving at all, while his wife lay in the bed behind him with her eyes open, letting him have one more night.</w:t>
+        <w:t>He stood there. Above them, the sky over the plain was enormous and full of stars, and somewhere low in the west-south-west, fixed, invisible, a small old craft hung over the curve of the world, and somewhere far beyond it, fifty light-minutes out, sixty degrees ahead of a Jupiter they could not see, a dark hull four kilometers wide was keeping its station, and somewhere in a hotel in the old town, on a doormat balcony, a man stood barefoot holding an iron rail, looking west, not moving at all, while his wife lay in the bed behind him with her eyes open, letting him have one more night.</w:t>
       </w:r>
     </w:p>
     <w:p>
@@ -35292,7 +35290,7 @@
           <w:color w:val="2B2B2B"/>
           <w:sz w:val="26"/>
         </w:rPr>
-        <w:t>“Clock,” said Priya, and she did not mean the eclipse. A second timer had come up on her screen under the muster, small and rude, counting down toward nothing. “The conditional is armed. It dies at third contact minus four seconds. If the carried sentence isn’t in the latch by then, the signature doesn’t fire. The Boat cannot help us. They are forty minutes away on a good day. This is the only switch that knows the clause, and it is already leaving.”</w:t>
+        <w:t>“Clock,” said Priya, and she did not mean the eclipse. A second timer had come up on her screen under the muster, small and rude, counting down toward nothing. “The conditional is armed. It dies at third contact minus four seconds. If the carried sentence isn’t in the latch by then, the signature doesn’t fire. The Boat cannot help us. They are fifty minutes away. This is the only switch that knows the clause, and it is already leaving.”</w:t>
       </w:r>
     </w:p>
     <w:p>
@@ -44077,9 +44075,7 @@
           <w:color w:val="2B2B2B"/>
           <w:sz w:val="26"/>
         </w:rPr>
-        <w:t xml:space="preserve">In 2022 the United States really did open an office to study objects seen in the sky and gave it a name only a committee could love: the All-domain Anomaly Resolution Office. Real allied governments really do run joint intelligence liaisons out of buildings near NATO </w:t>
-        <w:lastRenderedPageBreak/>
-        <w:t>headquarters that have nothing to do with any of this. This book does not belong to any of them, does not speak for them, and does not know anything they don’t. It invents a smaller office, a more anxious committee, and a satellite company that is, regrettably, more competent than several real ones.</w:t>
+        <w:t>In 2022 the United States really did open an office to study objects seen in the sky and gave it a name only a committee could love: the All-domain Anomaly Resolution Office. NATO’s headquarters in Brussels is real too, and has nothing to do with any of this. This book does not belong to any of them, does not speak for them, and does not know anything they don’t. It invents a smaller office, a more anxious committee, and a satellite company that is, regrettably, more competent than several real ones.</w:t>
       </w:r>
     </w:p>
     <w:p>
@@ -44309,7 +44305,7 @@
           <w:sz w:val="26"/>
           <w:szCs w:val="26"/>
         </w:rPr>
-        <w:t>The shore boat. An old tender in geosynchronous orbit, thirty-six thousand kilometers up, over the Amazon, about sixty degrees west: an eighth of a second from a Halo gateway. It caches instructions and can decide inside a human minute. The Boat, this August, is the better part of an hour away, a little under five astronomical units out among the Jupiter Trojans, and cannot reach a switch during totality.</w:t>
+        <w:t>The shore boat. An old tender in geosynchronous orbit, thirty-six thousand kilometers up, over the Amazon, about sixty degrees west: an eighth of a second from a Halo gateway. It caches instructions and can decide inside a human minute. The Boat, this August, is the better part of an hour away, about six astronomical units out among the Jupiter Trojans, and cannot reach a switch during totality.</w:t>
       </w:r>
     </w:p>
     <w:p>
@@ -44491,7 +44487,7 @@
         </w:rPr>
         <w:t xml:space="preserve">A ship that travels for forty thousand years rather than build something faster than light is not a fantasy so much as a concession: nothing in known physics outruns light, which leaves slow and enormous as the only honest option for crossing interstellar distance with a living crew. The concept has a name, </w:t>
       </w:r>
-      <w:hyperlink r:id="rId7">
+      <w:hyperlink w:anchor="bib_genship" w:history="1">
         <w:r>
           <w:rPr>
             <w:rStyle w:val="Hyperlink"/>
@@ -44499,7 +44495,7 @@
             <w:color w:val="2B2B2B"/>
             <w:sz w:val="26"/>
           </w:rPr>
-          <w:t>a generation ship</w:t>
+          <w:t xml:space="preserve">a generation ship</w:t>
         </w:r>
       </w:hyperlink>
       <w:r>
@@ -44508,11 +44504,9 @@
           <w:color w:val="2B2B2B"/>
           <w:sz w:val="26"/>
         </w:rPr>
-        <w:t xml:space="preserve">, and a real engineering literature, including Hein, Pak, Pütz, </w:t>
-        <w:lastRenderedPageBreak/>
-        <w:t>Bühler, and Reiss, “</w:t>
-      </w:r>
-      <w:hyperlink r:id="rId8">
+        <w:t xml:space="preserve">, and a real engineering literature, including Hein, Pak, Pütz, Bühler, and Reiss, “</w:t>
+      </w:r>
+      <w:hyperlink w:anchor="bib_hein" w:history="1">
         <w:r>
           <w:rPr>
             <w:rStyle w:val="Hyperlink"/>
@@ -44520,7 +44514,7 @@
             <w:color w:val="2B2B2B"/>
             <w:sz w:val="26"/>
           </w:rPr>
-          <w:t>World Ships — Architectures &amp; Feasibility Revisited</w:t>
+          <w:t xml:space="preserve">World Ships — Architectures &amp; Feasibility Revisited</w:t>
         </w:r>
       </w:hyperlink>
       <w:r>
@@ -44529,9 +44523,9 @@
           <w:color w:val="2B2B2B"/>
           <w:sz w:val="26"/>
         </w:rPr>
-        <w:t xml:space="preserve">,” Journal of the British Interplanetary Society (2012). Kurzgesagt’s YouTube film </w:t>
-      </w:r>
-      <w:hyperlink r:id="rId9">
+        <w:t xml:space="preserve">,” Journal of the British Interplanetary Society (2012). It is worth remembering, reading this book’s forty-thousand-year vessel held together by duct tape and committee, that humanity’s actual attempt at a small sealed biosphere, </w:t>
+      </w:r>
+      <w:hyperlink w:anchor="bib_biosphere2" w:history="1">
         <w:r>
           <w:rPr>
             <w:rStyle w:val="Hyperlink"/>
@@ -44539,7 +44533,7 @@
             <w:color w:val="2B2B2B"/>
             <w:sz w:val="26"/>
           </w:rPr>
-          <w:t>Generation Ships — The Hardest Part Is Not Distance</w:t>
+          <w:t xml:space="preserve">Biosphere 2</w:t>
         </w:r>
       </w:hyperlink>
       <w:r>
@@ -44548,9 +44542,47 @@
           <w:color w:val="2B2B2B"/>
           <w:sz w:val="26"/>
         </w:rPr>
-        <w:t xml:space="preserve"> treats the ship as a closed-world survival problem rather than a set piece. It is worth remembering, reading this book’s forty-thousand-year vessel held together by duct tape and committee, that humanity’s actual attempt at a small sealed biosphere, </w:t>
-      </w:r>
-      <w:hyperlink r:id="rId10">
+        <w:t xml:space="preserve">, sealed in Arizona in 1991, could not keep eight people supplied inside a fully sealed system for two years. Oxygen fell from 21 percent to about 14.5, crops failed, and outside oxygen had to be pumped in before the mission ended. All eight came out alive. The air did not hold. This book’s ship is not that. It is the version where the engineering problem gets solved, imperfectly, by people who had two thousand generations and no alternative. The solving is the fiction. The difficulty is not.</w:t>
+      </w:r>
+    </w:p>
+    <w:p>
+      <w:pPr>
+        <w:jc w:val="both"/>
+        <w:rPr>
+          <w:rFonts w:ascii="Georgia" w:hAnsi="Georgia"/>
+          <w:color w:val="2B2B2B"/>
+          <w:sz w:val="26"/>
+        </w:rPr>
+      </w:pPr>
+      <w:r>
+        <w:rPr>
+          <w:rFonts w:ascii="Georgia" w:hAnsi="Georgia"/>
+          <w:bCs/>
+          <w:color w:val="2B2B2B"/>
+          <w:sz w:val="26"/>
+          <w:szCs w:val="25"/>
+        </w:rPr>
+        <w:t>The Genetics Problem</w:t>
+      </w:r>
+    </w:p>
+    <w:p>
+      <w:pPr>
+        <w:jc w:val="both"/>
+        <w:rPr>
+          <w:rFonts w:ascii="Georgia" w:hAnsi="Georgia"/>
+          <w:color w:val="2B2B2B"/>
+          <w:sz w:val="26"/>
+        </w:rPr>
+      </w:pPr>
+      <w:r>
+        <w:rPr>
+          <w:rFonts w:ascii="Georgia" w:hAnsi="Georgia"/>
+          <w:color w:val="2B2B2B"/>
+          <w:sz w:val="26"/>
+        </w:rPr>
+        <w:t xml:space="preserve">The ship’s need for outside genetic material is not a decoration. A sealed population loses genetic diversity every generation. Conservation biology calls the floor under that loss a </w:t>
+      </w:r>
+      <w:hyperlink w:anchor="bib_mvp" w:history="1">
         <w:r>
           <w:rPr>
             <w:rStyle w:val="Hyperlink"/>
@@ -44558,7 +44590,7 @@
             <w:color w:val="2B2B2B"/>
             <w:sz w:val="26"/>
           </w:rPr>
-          <w:t>Biosphere 2</w:t>
+          <w:t xml:space="preserve">minimum viable population</w:t>
         </w:r>
       </w:hyperlink>
       <w:r>
@@ -44567,47 +44599,9 @@
           <w:color w:val="2B2B2B"/>
           <w:sz w:val="26"/>
         </w:rPr>
-        <w:t>, built in Arizona in 1991, could not keep eight people supplied inside a fully sealed system for two years. Oxygen fell from 21 percent to about 14.5, crops failed, and outside oxygen had to be pumped in before the mission ended. All eight came out alive. The air did not hold. This book’s ship is not that. It is the version where the engineering problem gets solved, imperfectly, by people who had two thousand generations and no alternative. The solving is the fiction. The difficulty is not.</w:t>
-      </w:r>
-    </w:p>
-    <w:p>
-      <w:pPr>
-        <w:jc w:val="both"/>
-        <w:rPr>
-          <w:rFonts w:ascii="Georgia" w:hAnsi="Georgia"/>
-          <w:color w:val="2B2B2B"/>
-          <w:sz w:val="26"/>
-        </w:rPr>
-      </w:pPr>
-      <w:r>
-        <w:rPr>
-          <w:rFonts w:ascii="Georgia" w:hAnsi="Georgia"/>
-          <w:bCs/>
-          <w:color w:val="2B2B2B"/>
-          <w:sz w:val="26"/>
-          <w:szCs w:val="25"/>
-        </w:rPr>
-        <w:t>The Genetics Problem</w:t>
-      </w:r>
-    </w:p>
-    <w:p>
-      <w:pPr>
-        <w:jc w:val="both"/>
-        <w:rPr>
-          <w:rFonts w:ascii="Georgia" w:hAnsi="Georgia"/>
-          <w:color w:val="2B2B2B"/>
-          <w:sz w:val="26"/>
-        </w:rPr>
-      </w:pPr>
-      <w:r>
-        <w:rPr>
-          <w:rFonts w:ascii="Georgia" w:hAnsi="Georgia"/>
-          <w:color w:val="2B2B2B"/>
-          <w:sz w:val="26"/>
-        </w:rPr>
-        <w:t xml:space="preserve">The ship’s need for outside genetic material is not a decoration. A sealed population loses genetic diversity every generation. Conservation biology calls the floor under that loss a </w:t>
-      </w:r>
-      <w:hyperlink r:id="rId11">
+        <w:t xml:space="preserve">, and the numbers argued for a wild species over evolutionary time are often in the thousands. </w:t>
+      </w:r>
+      <w:hyperlink w:anchor="bib_marin" w:history="1">
         <w:r>
           <w:rPr>
             <w:rStyle w:val="Hyperlink"/>
@@ -44615,7 +44609,7 @@
             <w:color w:val="2B2B2B"/>
             <w:sz w:val="26"/>
           </w:rPr>
-          <w:t>minimum viable population</w:t>
+          <w:t xml:space="preserve">Marin and Beluffi’s 2018 simulation</w:t>
         </w:r>
       </w:hyperlink>
       <w:r>
@@ -44624,9 +44618,7 @@
           <w:color w:val="2B2B2B"/>
           <w:sz w:val="26"/>
         </w:rPr>
-        <w:t xml:space="preserve">, and the numbers argued for a wild species over evolutionary time are often in the thousands. Marin and Beluffi’s 2018 simulation is more generous to the engineers than that folklore: under strict breeding rules, a founding crew of 98 can hold for a 6,300-year trip. Forty thousand years is not 6,300, and this book’s ship did not have those rules. That is the shopping trip. The story’s request, at the end, is for consented passage and consented samples, because taking infants without asking does not repair a crew, and </w:t>
-        <w:lastRenderedPageBreak/>
-        <w:t>children born on Earth to hybrid parents do not fly home by themselves.</w:t>
+        <w:t xml:space="preserve"> is more generous to the engineers than that folklore: under strict breeding rules, a founding crew of 98 can hold for a 6,300-year trip. Forty thousand years is not 6,300, and this book’s ship did not have those rules. That is the shopping trip. The story’s request, at the end, is for consented passage and consented samples, because taking infants without asking does not repair a crew, and children born on Earth to hybrid parents do not fly home by themselves.</w:t>
       </w:r>
     </w:p>
     <w:p>
@@ -44667,7 +44659,7 @@
         </w:rPr>
         <w:t xml:space="preserve">A dormant, waiting probe is an old idea in serious astronomy, not a storybook invention. Ronald Bracewell proposed in 1960 that a patient civilization might send automated observers ahead of itself to watch a young species rather than announce itself outright — the concept still carries his name, the </w:t>
       </w:r>
-      <w:hyperlink r:id="rId12" w:history="1">
+      <w:hyperlink w:anchor="bib_bracewell" w:history="1">
         <w:r>
           <w:rPr>
             <w:rStyle w:val="Hyperlink"/>
@@ -44676,7 +44668,7 @@
             <w:sz w:val="26"/>
             <w:szCs w:val="23"/>
           </w:rPr>
-          <w:t>Bracewell probe</w:t>
+          <w:t xml:space="preserve">Bracewell probe</w:t>
         </w:r>
       </w:hyperlink>
       <w:r>
@@ -44686,9 +44678,9 @@
           <w:sz w:val="26"/>
           <w:szCs w:val="23"/>
         </w:rPr>
-        <w:t xml:space="preserve"> — and modern SETI researchers have taken the idea seriously enough to plan where to look for one, including James Benford’s 2019 proposal to search the small asteroids that share Earth’s own orbit, written up as </w:t>
-      </w:r>
-      <w:hyperlink r:id="rId13" w:history="1">
+        <w:t xml:space="preserve"> — and modern SETI researchers have taken the idea seriously enough to plan where to look for one, including James Benford’s 2019 proposal to search the small asteroids that share Earth’s own orbit, written up as “</w:t>
+      </w:r>
+      <w:hyperlink w:anchor="bib_benford" w:history="1">
         <w:r>
           <w:rPr>
             <w:rStyle w:val="Hyperlink"/>
@@ -44697,7 +44689,7 @@
             <w:sz w:val="26"/>
             <w:szCs w:val="23"/>
           </w:rPr>
-          <w:t>“Looking for Lurkers”</w:t>
+          <w:t xml:space="preserve">Looking for Lurkers</w:t>
         </w:r>
       </w:hyperlink>
       <w:r>
@@ -44707,7 +44699,7 @@
           <w:sz w:val="26"/>
           <w:szCs w:val="23"/>
         </w:rPr>
-        <w:t>. Nobody has found one. That is, as this book’s Directorate would be the first to point out, exactly what you would also expect if there were nothing there.</w:t>
+        <w:t xml:space="preserve">”. Nobody has found one. That is, as this book’s Directorate would be the first to point out, exactly what you would also expect if there were nothing there.</w:t>
       </w:r>
     </w:p>
     <w:p>
@@ -44746,9 +44738,9 @@
           <w:sz w:val="26"/>
           <w:szCs w:val="23"/>
         </w:rPr>
-        <w:t xml:space="preserve">The idea that 1947-era radar was loud enough to be noticed is not this book’s invention either. Earth has been leaking electromagnetic evidence of itself since the first powerful transmitters went up, and the classic paper on the subject — Sullivan, Brown, and Wetherill’s </w:t>
-      </w:r>
-      <w:hyperlink r:id="rId14" w:history="1">
+        <w:t xml:space="preserve">The idea that 1947-era radar was loud enough to be noticed is not this book’s invention either. Earth has been leaking electromagnetic evidence of itself since the first powerful transmitters went up, and the classic paper on the subject — Sullivan, Brown, and Wetherill’s “</w:t>
+      </w:r>
+      <w:hyperlink w:anchor="bib_sullivan" w:history="1">
         <w:r>
           <w:rPr>
             <w:rStyle w:val="Hyperlink"/>
@@ -44757,7 +44749,7 @@
             <w:sz w:val="26"/>
             <w:szCs w:val="23"/>
           </w:rPr>
-          <w:t>“Eavesdropping: The Radio Signature of the Earth”</w:t>
+          <w:t xml:space="preserve">Eavesdropping: The Radio Signature of the Earth</w:t>
         </w:r>
       </w:hyperlink>
       <w:r>
@@ -44767,9 +44759,9 @@
           <w:sz w:val="26"/>
           <w:szCs w:val="23"/>
         </w:rPr>
-        <w:t xml:space="preserve">, Science, 1978 — first worked out how far our own military and civilian radar could plausibly be detected. Later analysis of the same leakage has been given the (much better) name </w:t>
-      </w:r>
-      <w:hyperlink r:id="rId15" w:history="1">
+        <w:t xml:space="preserve">”, Science, 1978 — first worked out how far our own television and radar signals could plausibly be detected. Astronomers now file such leakage under a (much better) name, </w:t>
+      </w:r>
+      <w:hyperlink w:anchor="bib_saide" w:history="1">
         <w:r>
           <w:rPr>
             <w:rStyle w:val="Hyperlink"/>
@@ -44778,7 +44770,7 @@
             <w:sz w:val="26"/>
             <w:szCs w:val="23"/>
           </w:rPr>
-          <w:t>technosignatures</w:t>
+          <w:t xml:space="preserve">technosignatures</w:t>
         </w:r>
       </w:hyperlink>
       <w:r>
@@ -44788,7 +44780,7 @@
           <w:sz w:val="26"/>
           <w:szCs w:val="23"/>
         </w:rPr>
-        <w:t>, and puts our more powerful broadcasts as detectable across a genuinely startling amount of the galaxy. This book borrows the year. The physics was already sitting there.</w:t>
+        <w:t xml:space="preserve">, and a 2025 study of airport and military radar put that leakage within reach of a telescope like Green Bank out to about two hundred light-years. This book borrows the year. The physics was already sitting there.</w:t>
       </w:r>
     </w:p>
     <w:p>
@@ -44828,7 +44820,7 @@
         </w:rPr>
         <w:t xml:space="preserve">Kade’s worry that Halo’s satellites might accidentally spot the ship is not hand-waved either. The real </w:t>
       </w:r>
-      <w:hyperlink r:id="rId16">
+      <w:hyperlink w:anchor="bib_rubin" w:history="1">
         <w:r>
           <w:rPr>
             <w:rStyle w:val="Hyperlink"/>
@@ -44836,9 +44828,7 @@
             <w:color w:val="2B2B2B"/>
             <w:sz w:val="26"/>
           </w:rPr>
-          <w:t xml:space="preserve">Vera C. </w:t>
-          <w:lastRenderedPageBreak/>
-          <w:t>Rubin Observatory</w:t>
+          <w:t xml:space="preserve">Vera C. Rubin Observatory</w:t>
         </w:r>
       </w:hyperlink>
       <w:r>
@@ -44887,7 +44877,7 @@
         </w:rPr>
         <w:t xml:space="preserve">A mote on the scale of a grain of rice is not pure invention. Seo, Neely, Shen, and colleagues showed, in </w:t>
       </w:r>
-      <w:hyperlink r:id="rId17">
+      <w:hyperlink w:anchor="bib_seo" w:history="1">
         <w:r>
           <w:rPr>
             <w:rStyle w:val="Hyperlink"/>
@@ -44895,7 +44885,7 @@
             <w:color w:val="2B2B2B"/>
             <w:sz w:val="26"/>
           </w:rPr>
-          <w:t>Neuron in 2016</w:t>
+          <w:t xml:space="preserve">Neuron in 2016</w:t>
         </w:r>
       </w:hyperlink>
       <w:r>
@@ -44904,7 +44894,7 @@
           <w:color w:val="2B2B2B"/>
           <w:sz w:val="26"/>
         </w:rPr>
-        <w:t>, that ultrasonic neural dust — wireless, dust-sized sensors — can record from a nerve at that size. What this book adds, and does not pretend has been demonstrated, is the second hop. The mote talks to a tender or a ground relay close enough to hear it. It does not stream a life to Jupiter. The constant signal in the novel is a dog tag: alive, located, unharmed. The occasional signal is a visit, at a range of hours missing from an ordinary afternoon, not a radio conversation with the Trojan swarm. A coin-sized commercial brain implant that talks to hardware worn on the body is a different machine, and it is not the one in this story.</w:t>
+        <w:t xml:space="preserve">, that ultrasonic neural dust — wireless, dust-sized sensors — can record from a nerve at that size. What this book adds, and does not pretend has been demonstrated, is the second hop. The mote talks to a tender or a ground relay close enough to hear it. It does not stream a life to Jupiter. The constant signal in the novel is a dog tag: alive, located, unharmed. The occasional signal is a visit, at a range of hours missing from an ordinary afternoon, not a radio conversation with the Trojan swarm. A coin-sized commercial brain implant that talks to hardware worn on the body is a different machine, and it is not the one in this story.</w:t>
       </w:r>
     </w:p>
     <w:p>
@@ -44944,7 +44934,7 @@
         </w:rPr>
         <w:t xml:space="preserve">Halo Systems is not much of an exaggeration. A real satellite internet constellation, </w:t>
       </w:r>
-      <w:hyperlink r:id="rId18">
+      <w:hyperlink w:anchor="bib_starlink" w:history="1">
         <w:r>
           <w:rPr>
             <w:rStyle w:val="Hyperlink"/>
@@ -44952,7 +44942,7 @@
             <w:color w:val="2B2B2B"/>
             <w:sz w:val="26"/>
           </w:rPr>
-          <w:t>Starlink</w:t>
+          <w:t xml:space="preserve">Starlink</w:t>
         </w:r>
       </w:hyperlink>
       <w:r>
@@ -44961,9 +44951,7 @@
           <w:color w:val="2B2B2B"/>
           <w:sz w:val="26"/>
         </w:rPr>
-        <w:t xml:space="preserve">, had, as of September 2026, more than eleven thousand working satellites in orbit, with public filings and stated ambitions running well past that. The idea of a company quietly running capable eyes on the solar system out of the same budget line as a consumer internet product is, on the </w:t>
-        <w:lastRenderedPageBreak/>
-        <w:t>public record of that constellation’s scale, not speculative. It is Tuesday.</w:t>
+        <w:t xml:space="preserve">, had, as of September 2026, more than eleven thousand working satellites in orbit, with public filings and stated ambitions running well past that. The idea of a company quietly running capable eyes on the solar system out of the same budget line as a consumer internet product is, on the public record of that constellation’s scale, not speculative. It is Tuesday.</w:t>
       </w:r>
     </w:p>
     <w:p>
@@ -45001,7 +44989,26 @@
           <w:color w:val="2B2B2B"/>
           <w:sz w:val="26"/>
         </w:rPr>
-        <w:t>The total solar eclipse of 12 August 2026 is real, and so are its numbers in this book. The Moon’s shadow crosses Greenland, Iceland and northern Spain in the early evening, and at Zaragoza totality lasts about a minute and twenty-four seconds, beginning at about 20:29 local summer time, with the Sun only about six degrees up, a little north of due west (azimuth about 285°). The Sun then sets still partly eclipsed, at about 21:07. The story’s second and third contacts, 20:28:58 and 20:30:22, agree with published predictions to within a few seconds; the exact figures move by a second or two with the observer’s position and the profile of the Moon’s limb. The times used here follow Fred Espenak’s path tables for NASA, which are worth reading for their own sake. The eighty-thousand-seat bowl on the plain west of the city is invented; the low, brief, sunset totality that made it worth building is not. The next total eclipse, on 2 August 2027, does cross the far south of Spain and gives about six minutes of totality near Luxor.</w:t>
+        <w:t xml:space="preserve">The total solar eclipse of 12 August 2026 is real, and so are its numbers in this book. The Moon’s shadow crosses Greenland, Iceland and northern Spain in the early evening, and at Zaragoza totality lasts about a minute and twenty-four seconds, beginning at about 20:29 local summer time, with the Sun only about six degrees up, a little north of due west (azimuth about 285°). The Sun then sets still partly eclipsed, at about 21:07. The story’s second and third contacts, 20:28:58 and 20:30:22, agree with published predictions to within a few seconds; the exact figures move by a second or two with the observer’s position and the profile of the Moon’s limb. The times used here follow </w:t>
+      </w:r>
+      <w:hyperlink w:anchor="bib_espenak" w:history="1">
+        <w:r>
+          <w:rPr>
+            <w:rStyle w:val="Hyperlink"/>
+            <w:rFonts w:ascii="Georgia" w:hAnsi="Georgia"/>
+            <w:color w:val="2B2B2B"/>
+            <w:sz w:val="26"/>
+          </w:rPr>
+          <w:t xml:space="preserve">Fred Espenak’s path tables for NASA</w:t>
+        </w:r>
+      </w:hyperlink>
+      <w:r>
+        <w:rPr>
+          <w:rFonts w:ascii="Georgia" w:hAnsi="Georgia"/>
+          <w:color w:val="2B2B2B"/>
+          <w:sz w:val="26"/>
+        </w:rPr>
+        <w:t xml:space="preserve">, which are worth reading for their own sake. The eighty-thousand-seat bowl on the plain west of the city is invented; the low, brief, sunset totality that made it worth building is not. The next total eclipse, on 2 August 2027, does cross the far south of Spain and gives about six minutes of totality near Luxor.</w:t>
       </w:r>
     </w:p>
     <w:p>
@@ -45079,7 +45086,45 @@
           <w:color w:val="2B2B2B"/>
           <w:sz w:val="26"/>
         </w:rPr>
-        <w:t>Fetal microchimerism is real. During pregnancy, cells and DNA from the fetus cross into the mother’s bloodstream; free fetal DNA in maternal blood is the basis of routine prenatal screening, and fetal cells have been found in mothers decades after giving birth. That is the true part. Using those cells to clone the baby — to grow a genetic twin in a tank in nine months, fit it with an implant, and swap it into a hospital cot — is entirely this book’s invention. Real mammalian cloning starts from a donor cell, an emptied egg and a surrogate mother, and rarely works even then; nothing in current biology comes close to what the ship does.</w:t>
+        <w:t xml:space="preserve">Fetal microchimerism is real. During pregnancy, cells and DNA from the fetus cross into the mother’s bloodstream; </w:t>
+      </w:r>
+      <w:hyperlink w:anchor="bib_lo" w:history="1">
+        <w:r>
+          <w:rPr>
+            <w:rStyle w:val="Hyperlink"/>
+            <w:rFonts w:ascii="Georgia" w:hAnsi="Georgia"/>
+            <w:color w:val="2B2B2B"/>
+            <w:sz w:val="26"/>
+          </w:rPr>
+          <w:t xml:space="preserve">free fetal DNA in maternal blood</w:t>
+        </w:r>
+      </w:hyperlink>
+      <w:r>
+        <w:rPr>
+          <w:rFonts w:ascii="Georgia" w:hAnsi="Georgia"/>
+          <w:color w:val="2B2B2B"/>
+          <w:sz w:val="26"/>
+        </w:rPr>
+        <w:t xml:space="preserve"> is the basis of routine prenatal screening, and </w:t>
+      </w:r>
+      <w:hyperlink w:anchor="bib_bianchi" w:history="1">
+        <w:r>
+          <w:rPr>
+            <w:rStyle w:val="Hyperlink"/>
+            <w:rFonts w:ascii="Georgia" w:hAnsi="Georgia"/>
+            <w:color w:val="2B2B2B"/>
+            <w:sz w:val="26"/>
+          </w:rPr>
+          <w:t xml:space="preserve">fetal cells have been found in mothers decades after giving birth</w:t>
+        </w:r>
+      </w:hyperlink>
+      <w:r>
+        <w:rPr>
+          <w:rFonts w:ascii="Georgia" w:hAnsi="Georgia"/>
+          <w:color w:val="2B2B2B"/>
+          <w:sz w:val="26"/>
+        </w:rPr>
+        <w:t xml:space="preserve">. That is the true part. Using those cells to clone the baby — to grow a genetic twin in a tank in nine months, fit it with an implant, and swap it into a hospital cot — is entirely this book’s invention. Real mammalian cloning starts from a donor cell, an emptied egg and a surrogate mother, and rarely works even then; nothing in current biology comes close to what the ship does.</w:t>
       </w:r>
     </w:p>
     <w:p>
@@ -45156,8 +45201,26 @@
           <w:color w:val="2B2B2B"/>
           <w:sz w:val="26"/>
         </w:rPr>
-        <w:lastRenderedPageBreak/>
-        <w:t>Eclipses really do change shortwave radio: as the Moon’s shadow passes, the ionosphere above it behaves briefly as if night had fallen, and amateur radio operators have taken part in organized eclipse experiments to measure the effect. Old, badly shielded transmitters really do leak faint spurious signals onto bands they were never meant to use. A tender in geosynchronous orbit leaking onto Huff’s receiver is fiction built from those two facts.</w:t>
+        <w:t xml:space="preserve">Eclipses really do change shortwave radio: as the Moon’s shadow passes, the ionosphere above it behaves briefly as if night had fallen, and amateur radio operators have taken part in </w:t>
+      </w:r>
+      <w:hyperlink w:anchor="bib_hamsci" w:history="1">
+        <w:r>
+          <w:rPr>
+            <w:rStyle w:val="Hyperlink"/>
+            <w:rFonts w:ascii="Georgia" w:hAnsi="Georgia"/>
+            <w:color w:val="2B2B2B"/>
+            <w:sz w:val="26"/>
+          </w:rPr>
+          <w:t xml:space="preserve">organized eclipse experiments</w:t>
+        </w:r>
+      </w:hyperlink>
+      <w:r>
+        <w:rPr>
+          <w:rFonts w:ascii="Georgia" w:hAnsi="Georgia"/>
+          <w:color w:val="2B2B2B"/>
+          <w:sz w:val="26"/>
+        </w:rPr>
+        <w:t xml:space="preserve"> to measure the effect. Old, badly shielded transmitters really do leak faint spurious signals onto bands they were never meant to use. A tender in geosynchronous orbit leaking onto Huff’s receiver is fiction built from those two facts.</w:t>
       </w:r>
     </w:p>
     <w:p>
@@ -45310,7 +45373,7 @@
         </w:rPr>
         <w:t xml:space="preserve">For readers who want the Fermi Paradox itself — the much older, much bigger question of why a galaxy old enough to be full of neighbors looks so empty — Kurzgesagt’s two-part explainer remains the clearest short version available: </w:t>
       </w:r>
-      <w:hyperlink r:id="rId19" w:history="1">
+      <w:hyperlink w:anchor="bib_kz_fermi" w:history="1">
         <w:r>
           <w:rPr>
             <w:rStyle w:val="Hyperlink"/>
@@ -45319,7 +45382,7 @@
             <w:sz w:val="26"/>
             <w:szCs w:val="23"/>
           </w:rPr>
-          <w:t>Part One</w:t>
+          <w:t xml:space="preserve">Part One and Part Two</w:t>
         </w:r>
       </w:hyperlink>
       <w:r>
@@ -45329,28 +45392,7 @@
           <w:sz w:val="26"/>
           <w:szCs w:val="23"/>
         </w:rPr>
-        <w:t xml:space="preserve"> and </w:t>
-      </w:r>
-      <w:hyperlink r:id="rId20" w:history="1">
-        <w:r>
-          <w:rPr>
-            <w:rStyle w:val="Hyperlink"/>
-            <w:rFonts w:ascii="Georgia" w:hAnsi="Georgia"/>
-            <w:color w:val="2B2B2B"/>
-            <w:sz w:val="26"/>
-            <w:szCs w:val="23"/>
-          </w:rPr>
-          <w:t>Part Two</w:t>
-        </w:r>
-      </w:hyperlink>
-      <w:r>
-        <w:rPr>
-          <w:rFonts w:ascii="Georgia" w:hAnsi="Georgia"/>
-          <w:color w:val="2B2B2B"/>
-          <w:sz w:val="26"/>
-          <w:szCs w:val="23"/>
-        </w:rPr>
-        <w:t>. This book’s answer — a species that solved the paradox by leaving early and being extremely patient — is one of dozens the video covers, and arguably not even the most likely one.</w:t>
+        <w:t xml:space="preserve">. This book’s answer — a species that solved the paradox by leaving early and being extremely patient — is one of dozens the video covers, and arguably not even the most likely one.</w:t>
       </w:r>
     </w:p>
     <w:p>
@@ -45388,25 +45430,16 @@
       </w:r>
     </w:p>
     <w:p>
+      <w:bookmarkStart w:id="9001" w:name="bib_hein"/>
       <w:r>
         <w:rPr>
           <w:rFonts w:ascii="Georgia" w:hAnsi="Georgia"/>
           <w:sz w:val="26"/>
           <w:szCs w:val="26"/>
         </w:rPr>
-        <w:t>Hein, A. M., Pak, M., Pütz, D., Bühler, C., and Reiss, P. “World Ships — Architectures &amp; Feasibility Revisited.” Journal of the British Interplanetary Society 65 (2012): 119–133. https://ui.adsabs.harvard.edu/abs/2012JBIS...65..119H/abstract</w:t>
-      </w:r>
-    </w:p>
-    <w:p>
-      <w:r>
-        <w:rPr>
-          <w:rFonts w:ascii="Georgia" w:hAnsi="Georgia"/>
-          <w:sz w:val="26"/>
-          <w:szCs w:val="26"/>
-        </w:rPr>
-        <w:t xml:space="preserve">Marin, F., and Beluffi, C. “Computing the Minimal Crew for a Multi-Generational Space Travel towards Proxima Centauri b.” </w:t>
-      </w:r>
-      <w:hyperlink r:id="rId21">
+        <w:t xml:space="preserve">Hein, A. M., Pak, M., Pütz, D., Bühler, C., and Reiss, P. “</w:t>
+      </w:r>
+      <w:hyperlink r:id="rId8" w:history="1">
         <w:r>
           <w:rPr>
             <w:rStyle w:val="Hyperlink"/>
@@ -45414,7 +45447,7 @@
             <w:sz w:val="26"/>
             <w:szCs w:val="26"/>
           </w:rPr>
-          <w:t>arXiv:1806.03856</w:t>
+          <w:t xml:space="preserve">World Ships — Architectures &amp; Feasibility Revisited</w:t>
         </w:r>
       </w:hyperlink>
       <w:r>
@@ -45423,69 +45456,21 @@
           <w:sz w:val="26"/>
           <w:szCs w:val="26"/>
         </w:rPr>
-        <w:t xml:space="preserve"> (2018). https://arxiv.org/abs/1806.03856</w:t>
-      </w:r>
-    </w:p>
-    <w:p>
+        <w:t xml:space="preserve">.” Journal of the British Interplanetary Society 65 (2012): 119–133.</w:t>
+      </w:r>
+      <w:bookmarkEnd w:id="9001"/>
+    </w:p>
+    <w:p>
+      <w:bookmarkStart w:id="9002" w:name="bib_marin"/>
       <w:r>
         <w:rPr>
           <w:rFonts w:ascii="Georgia" w:hAnsi="Georgia"/>
           <w:sz w:val="26"/>
           <w:szCs w:val="26"/>
         </w:rPr>
-        <w:t>Seo, D., Neely, R. M., Shen, K., et al. “Wireless Recording in the Peripheral Nervous System with Ultrasonic Neural Dust.” Neuron 91 (2016). https://doi.org/10.1016/j.neuron.2016.06.034</w:t>
-      </w:r>
-    </w:p>
-    <w:p>
-      <w:r>
-        <w:rPr>
-          <w:rFonts w:ascii="Georgia" w:hAnsi="Georgia"/>
-          <w:sz w:val="26"/>
-          <w:szCs w:val="26"/>
-        </w:rPr>
-        <w:t>Sullivan, W. T., Brown, S., and Wetherill, C. “Eavesdropping: The Radio Signature of the Earth.” Science 199 (1978): 377–388. https://www.science.org/doi/10.1126/science.199.4327.377</w:t>
-      </w:r>
-    </w:p>
-    <w:p>
-      <w:r>
-        <w:rPr>
-          <w:rFonts w:ascii="Georgia" w:hAnsi="Georgia"/>
-          <w:sz w:val="26"/>
-          <w:szCs w:val="26"/>
-        </w:rPr>
-        <w:t>Caisse Saide, R., and Garrett, M. Airport civilian and military radar leakage as a marker for extraterrestrial detection, presented at the Royal Astronomical Society National Astronomy Meeting 2025; reported by Sci.News. https://www.sci.news/astronomy/civilian-military-radar-leakage-alien-civilizations-14055.html</w:t>
-      </w:r>
-    </w:p>
-    <w:p>
-      <w:r>
-        <w:rPr>
-          <w:rFonts w:ascii="Georgia" w:hAnsi="Georgia"/>
-          <w:sz w:val="26"/>
-          <w:szCs w:val="26"/>
-        </w:rPr>
-        <w:t>Bracewell, R. N. “Communications from Superior Galactic Communities.” Nature 186 (1960): 670. https://doi.org/10.1038/186670a0</w:t>
-      </w:r>
-    </w:p>
-    <w:p>
-      <w:r>
-        <w:rPr>
-          <w:rFonts w:ascii="Georgia" w:hAnsi="Georgia"/>
-          <w:sz w:val="26"/>
-          <w:szCs w:val="26"/>
-        </w:rPr>
-        <w:t>Benford, J. “Looking for Lurkers.” arXiv:1903.09582 (2019). https://arxiv.org/pdf/1903.09582</w:t>
-      </w:r>
-    </w:p>
-    <w:p>
-      <w:r>
-        <w:rPr>
-          <w:rFonts w:ascii="Georgia" w:hAnsi="Georgia"/>
-          <w:sz w:val="26"/>
-          <w:szCs w:val="26"/>
-        </w:rPr>
-        <w:t xml:space="preserve">Kurzgesagt. </w:t>
-      </w:r>
-      <w:hyperlink r:id="rId22">
+        <w:t xml:space="preserve">Marin, F., and Beluffi, C. “</w:t>
+      </w:r>
+      <w:hyperlink r:id="rId21" w:history="1">
         <w:r>
           <w:rPr>
             <w:rStyle w:val="Hyperlink"/>
@@ -45493,7 +45478,7 @@
             <w:sz w:val="26"/>
             <w:szCs w:val="26"/>
           </w:rPr>
-          <w:t>Generation Ships — The Hardest Part Is Not Distance</w:t>
+          <w:t xml:space="preserve">Computing the Minimal Crew for a Multi-Generational Space Travel towards Proxima Centauri b</w:t>
         </w:r>
       </w:hyperlink>
       <w:r>
@@ -45502,63 +45487,21 @@
           <w:sz w:val="26"/>
           <w:szCs w:val="26"/>
         </w:rPr>
-        <w:t>. https://www.youtube.com/watch?v=Uxp8ZVkMUFk</w:t>
-      </w:r>
-    </w:p>
-    <w:p>
+        <w:t xml:space="preserve">.” arXiv:1806.03856 (2018).</w:t>
+      </w:r>
+      <w:bookmarkEnd w:id="9002"/>
+    </w:p>
+    <w:p>
+      <w:bookmarkStart w:id="9003" w:name="bib_seo"/>
       <w:r>
         <w:rPr>
           <w:rFonts w:ascii="Georgia" w:hAnsi="Georgia"/>
           <w:sz w:val="26"/>
           <w:szCs w:val="26"/>
         </w:rPr>
-        <w:t>Kurzgesagt. The Fermi Paradox, parts one and two. https://www.youtube.com/watch?v=sNhhvQGsMEc and https://www.youtube.com/watch?v=1fQkVqno-uI</w:t>
-      </w:r>
-    </w:p>
-    <w:p>
-      <w:r>
-        <w:rPr>
-          <w:rFonts w:ascii="Georgia" w:hAnsi="Georgia"/>
-          <w:sz w:val="26"/>
-          <w:szCs w:val="26"/>
-        </w:rPr>
-        <w:t xml:space="preserve">Espenak, F. “Path of Total Solar Eclipse of 2026 Aug 12.” NASA Goddard Space Flight Center. </w:t>
-        <w:lastRenderedPageBreak/>
-        <w:t>https://eclipse.gsfc.nasa.gov/SEpath/SEpath2001/SE2026Aug12Tpath.html</w:t>
-      </w:r>
-    </w:p>
-    <w:p>
-      <w:r>
-        <w:rPr>
-          <w:rFonts w:ascii="Georgia" w:hAnsi="Georgia"/>
-          <w:sz w:val="26"/>
-          <w:szCs w:val="26"/>
-        </w:rPr>
-        <w:t>Bianchi, D. W., Zickwolf, G. K., Weil, G. J., Sylvester, S., and DeMaria, M. A. “Male Fetal Progenitor Cells Persist in Maternal Blood for as Long as 27 Years Postpartum.” Proceedings of the National Academy of Sciences 93 (1996): 705–708. https://doi.org/10.1073/pnas.93.2.705</w:t>
-      </w:r>
-    </w:p>
-    <w:p>
-      <w:r>
-        <w:rPr>
-          <w:rFonts w:ascii="Georgia" w:hAnsi="Georgia"/>
-          <w:sz w:val="26"/>
-          <w:szCs w:val="26"/>
-        </w:rPr>
-        <w:t>Lo, Y. M. D., Corbetta, N., Chamberlain, P. F., et al. “Presence of Fetal DNA in Maternal Plasma and Serum.” The Lancet 350 (1997): 485–487. https://doi.org/10.1016/S0140-6736(97)02174-0</w:t>
-      </w:r>
-    </w:p>
-    <w:p>
-      <w:r>
-        <w:rPr>
-          <w:rFonts w:ascii="Georgia" w:hAnsi="Georgia"/>
-          <w:sz w:val="26"/>
-          <w:szCs w:val="26"/>
-        </w:rPr>
-        <w:t>HamSCI, the Ham Radio Science Citizen Investigation, eclipse ionosphere experiments. https://hamsci.org</w:t>
-      </w:r>
-    </w:p>
-    <w:p>
-      <w:hyperlink r:id="rId23">
+        <w:t xml:space="preserve">Seo, D., Neely, R. M., Shen, K., et al. “</w:t>
+      </w:r>
+      <w:hyperlink r:id="rId17" w:history="1">
         <w:r>
           <w:rPr>
             <w:rStyle w:val="Hyperlink"/>
@@ -45566,7 +45509,7 @@
             <w:sz w:val="26"/>
             <w:szCs w:val="26"/>
           </w:rPr>
-          <w:t>Biosphere 2</w:t>
+          <w:t xml:space="preserve">Wireless Recording in the Peripheral Nervous System with Ultrasonic Neural Dust</w:t>
         </w:r>
       </w:hyperlink>
       <w:r>
@@ -45575,41 +45518,21 @@
           <w:sz w:val="26"/>
           <w:szCs w:val="26"/>
         </w:rPr>
-        <w:t>. https://en.wikipedia.org/wiki/Biosphere_2</w:t>
-      </w:r>
-    </w:p>
-    <w:p>
+        <w:t xml:space="preserve">.” Neuron 91 (2016).</w:t>
+      </w:r>
+      <w:bookmarkEnd w:id="9003"/>
+    </w:p>
+    <w:p>
+      <w:bookmarkStart w:id="9004" w:name="bib_sullivan"/>
       <w:r>
         <w:rPr>
           <w:rFonts w:ascii="Georgia" w:hAnsi="Georgia"/>
           <w:sz w:val="26"/>
           <w:szCs w:val="26"/>
         </w:rPr>
-        <w:t>Minimum viable population. https://en.wikipedia.org/wiki/Minimum_viable_population</w:t>
-      </w:r>
-    </w:p>
-    <w:p>
-      <w:r>
-        <w:rPr>
-          <w:rFonts w:ascii="Georgia" w:hAnsi="Georgia"/>
-          <w:sz w:val="26"/>
-          <w:szCs w:val="26"/>
-        </w:rPr>
-        <w:t>Generation ship, overview. https://en.wikipedia.org/wiki/Generation_ship</w:t>
-      </w:r>
-    </w:p>
-    <w:p>
-      <w:r>
-        <w:rPr>
-          <w:rFonts w:ascii="Georgia" w:hAnsi="Georgia"/>
-          <w:sz w:val="26"/>
-          <w:szCs w:val="26"/>
-        </w:rPr>
-        <w:t>Vera C. Rubin Observatory and the Trojan surveys. https://arxiv.org/abs/2506.02487</w:t>
-      </w:r>
-    </w:p>
-    <w:p>
-      <w:hyperlink r:id="rId24">
+        <w:t xml:space="preserve">Sullivan, W. T., Brown, S., and Wetherill, C. “</w:t>
+      </w:r>
+      <w:hyperlink r:id="rId33" w:history="1">
         <w:r>
           <w:rPr>
             <w:rStyle w:val="Hyperlink"/>
@@ -45617,7 +45540,7 @@
             <w:sz w:val="26"/>
             <w:szCs w:val="26"/>
           </w:rPr>
-          <w:t>Starlink</w:t>
+          <w:t xml:space="preserve">Eavesdropping: The Radio Signature of the Earth</w:t>
         </w:r>
       </w:hyperlink>
       <w:r>
@@ -45626,8 +45549,423 @@
           <w:sz w:val="26"/>
           <w:szCs w:val="26"/>
         </w:rPr>
-        <w:t>, public reporting on scale, consulted September 2026. https://www.space.com/spacex-starlink-satellites.html</w:t>
-      </w:r>
+        <w:t xml:space="preserve">.” Science 199 (1978): 377–388.</w:t>
+      </w:r>
+      <w:bookmarkEnd w:id="9004"/>
+    </w:p>
+    <w:p>
+      <w:bookmarkStart w:id="9005" w:name="bib_saide"/>
+      <w:r>
+        <w:rPr>
+          <w:rFonts w:ascii="Georgia" w:hAnsi="Georgia"/>
+          <w:sz w:val="26"/>
+          <w:szCs w:val="26"/>
+        </w:rPr>
+        <w:t xml:space="preserve">Caisse Saide, R., Garrett, M., et al. “Examining Airport Civilian and Military Radar Leakage as a Detectable Marker for Extraterrestrial Civilizations.” Royal Astronomical Society National Astronomy Meeting 2025; reported by Sci.News as “</w:t>
+      </w:r>
+      <w:hyperlink r:id="rId15" w:history="1">
+        <w:r>
+          <w:rPr>
+            <w:rStyle w:val="Hyperlink"/>
+            <w:rFonts w:ascii="Georgia" w:hAnsi="Georgia"/>
+            <w:sz w:val="26"/>
+            <w:szCs w:val="26"/>
+          </w:rPr>
+          <w:t xml:space="preserve">Civilian and Military Radar Leakage Is Revealing Our Existence to Alien Civilizations</w:t>
+        </w:r>
+      </w:hyperlink>
+      <w:r>
+        <w:rPr>
+          <w:rFonts w:ascii="Georgia" w:hAnsi="Georgia"/>
+          <w:sz w:val="26"/>
+          <w:szCs w:val="26"/>
+        </w:rPr>
+        <w:t xml:space="preserve">.”</w:t>
+      </w:r>
+      <w:bookmarkEnd w:id="9005"/>
+    </w:p>
+    <w:p>
+      <w:bookmarkStart w:id="9006" w:name="bib_bracewell"/>
+      <w:r>
+        <w:rPr>
+          <w:rFonts w:ascii="Georgia" w:hAnsi="Georgia"/>
+          <w:sz w:val="26"/>
+          <w:szCs w:val="26"/>
+        </w:rPr>
+        <w:t xml:space="preserve">Bracewell, R. N. “</w:t>
+      </w:r>
+      <w:hyperlink r:id="rId12" w:history="1">
+        <w:r>
+          <w:rPr>
+            <w:rStyle w:val="Hyperlink"/>
+            <w:rFonts w:ascii="Georgia" w:hAnsi="Georgia"/>
+            <w:sz w:val="26"/>
+            <w:szCs w:val="26"/>
+          </w:rPr>
+          <w:t xml:space="preserve">Communications from Superior Galactic Communities</w:t>
+        </w:r>
+      </w:hyperlink>
+      <w:r>
+        <w:rPr>
+          <w:rFonts w:ascii="Georgia" w:hAnsi="Georgia"/>
+          <w:sz w:val="26"/>
+          <w:szCs w:val="26"/>
+        </w:rPr>
+        <w:t xml:space="preserve">.” Nature 186 (1960): 670.</w:t>
+      </w:r>
+      <w:bookmarkEnd w:id="9006"/>
+    </w:p>
+    <w:p>
+      <w:bookmarkStart w:id="9007" w:name="bib_benford"/>
+      <w:r>
+        <w:rPr>
+          <w:rFonts w:ascii="Georgia" w:hAnsi="Georgia"/>
+          <w:sz w:val="26"/>
+          <w:szCs w:val="26"/>
+        </w:rPr>
+        <w:t xml:space="preserve">Benford, J. “</w:t>
+      </w:r>
+      <w:hyperlink r:id="rId34" w:history="1">
+        <w:r>
+          <w:rPr>
+            <w:rStyle w:val="Hyperlink"/>
+            <w:rFonts w:ascii="Georgia" w:hAnsi="Georgia"/>
+            <w:sz w:val="26"/>
+            <w:szCs w:val="26"/>
+          </w:rPr>
+          <w:t xml:space="preserve">Looking for Lurkers</w:t>
+        </w:r>
+      </w:hyperlink>
+      <w:r>
+        <w:rPr>
+          <w:rFonts w:ascii="Georgia" w:hAnsi="Georgia"/>
+          <w:sz w:val="26"/>
+          <w:szCs w:val="26"/>
+        </w:rPr>
+        <w:t xml:space="preserve">.” arXiv:1903.09582 (2019).</w:t>
+      </w:r>
+      <w:bookmarkEnd w:id="9007"/>
+    </w:p>
+    <w:p>
+      <w:bookmarkStart w:id="9008" w:name="bib_kz_fermi"/>
+      <w:r>
+        <w:rPr>
+          <w:rFonts w:ascii="Georgia" w:hAnsi="Georgia"/>
+          <w:sz w:val="26"/>
+          <w:szCs w:val="26"/>
+        </w:rPr>
+        <w:t xml:space="preserve">Kurzgesagt – In a Nutshell. “</w:t>
+      </w:r>
+      <w:hyperlink r:id="rId19" w:history="1">
+        <w:r>
+          <w:rPr>
+            <w:rStyle w:val="Hyperlink"/>
+            <w:rFonts w:ascii="Georgia" w:hAnsi="Georgia"/>
+            <w:sz w:val="26"/>
+            <w:szCs w:val="26"/>
+          </w:rPr>
+          <w:t xml:space="preserve">The Fermi Paradox — Where Are All the Aliens? (1/2)</w:t>
+        </w:r>
+      </w:hyperlink>
+      <w:r>
+        <w:rPr>
+          <w:rFonts w:ascii="Georgia" w:hAnsi="Georgia"/>
+          <w:sz w:val="26"/>
+          <w:szCs w:val="26"/>
+        </w:rPr>
+        <w:t xml:space="preserve">” and “</w:t>
+      </w:r>
+      <w:hyperlink r:id="rId20" w:history="1">
+        <w:r>
+          <w:rPr>
+            <w:rStyle w:val="Hyperlink"/>
+            <w:rFonts w:ascii="Georgia" w:hAnsi="Georgia"/>
+            <w:sz w:val="26"/>
+            <w:szCs w:val="26"/>
+          </w:rPr>
+          <w:t xml:space="preserve">The Fermi Paradox II — Solutions and Ideas</w:t>
+        </w:r>
+      </w:hyperlink>
+      <w:r>
+        <w:rPr>
+          <w:rFonts w:ascii="Georgia" w:hAnsi="Georgia"/>
+          <w:sz w:val="26"/>
+          <w:szCs w:val="26"/>
+        </w:rPr>
+        <w:t xml:space="preserve">.” YouTube.</w:t>
+      </w:r>
+      <w:bookmarkEnd w:id="9008"/>
+    </w:p>
+    <w:p>
+      <w:bookmarkStart w:id="9009" w:name="bib_espenak"/>
+      <w:r>
+        <w:rPr>
+          <w:rFonts w:ascii="Georgia" w:hAnsi="Georgia"/>
+          <w:sz w:val="26"/>
+          <w:szCs w:val="26"/>
+        </w:rPr>
+        <w:t xml:space="preserve">Espenak, F. “</w:t>
+      </w:r>
+      <w:hyperlink r:id="rId35" w:history="1">
+        <w:r>
+          <w:rPr>
+            <w:rStyle w:val="Hyperlink"/>
+            <w:rFonts w:ascii="Georgia" w:hAnsi="Georgia"/>
+            <w:sz w:val="26"/>
+            <w:szCs w:val="26"/>
+          </w:rPr>
+          <w:t xml:space="preserve">Path of Total Solar Eclipse of 2026 Aug 12</w:t>
+        </w:r>
+      </w:hyperlink>
+      <w:r>
+        <w:rPr>
+          <w:rFonts w:ascii="Georgia" w:hAnsi="Georgia"/>
+          <w:sz w:val="26"/>
+          <w:szCs w:val="26"/>
+        </w:rPr>
+        <w:t xml:space="preserve">.” NASA Goddard Space Flight Center.</w:t>
+      </w:r>
+      <w:bookmarkEnd w:id="9009"/>
+    </w:p>
+    <w:p>
+      <w:bookmarkStart w:id="9010" w:name="bib_bianchi"/>
+      <w:r>
+        <w:rPr>
+          <w:rFonts w:ascii="Georgia" w:hAnsi="Georgia"/>
+          <w:sz w:val="26"/>
+          <w:szCs w:val="26"/>
+        </w:rPr>
+        <w:t xml:space="preserve">Bianchi, D. W., Zickwolf, G. K., Weil, G. J., Sylvester, S., and DeMaria, M. A. “</w:t>
+      </w:r>
+      <w:hyperlink r:id="rId36" w:history="1">
+        <w:r>
+          <w:rPr>
+            <w:rStyle w:val="Hyperlink"/>
+            <w:rFonts w:ascii="Georgia" w:hAnsi="Georgia"/>
+            <w:sz w:val="26"/>
+            <w:szCs w:val="26"/>
+          </w:rPr>
+          <w:t xml:space="preserve">Male Fetal Progenitor Cells Persist in Maternal Blood for as Long as 27 Years Postpartum</w:t>
+        </w:r>
+      </w:hyperlink>
+      <w:r>
+        <w:rPr>
+          <w:rFonts w:ascii="Georgia" w:hAnsi="Georgia"/>
+          <w:sz w:val="26"/>
+          <w:szCs w:val="26"/>
+        </w:rPr>
+        <w:t xml:space="preserve">.” Proceedings of the National Academy of Sciences 93 (1996): 705–708.</w:t>
+      </w:r>
+      <w:bookmarkEnd w:id="9010"/>
+    </w:p>
+    <w:p>
+      <w:bookmarkStart w:id="9011" w:name="bib_lo"/>
+      <w:r>
+        <w:rPr>
+          <w:rFonts w:ascii="Georgia" w:hAnsi="Georgia"/>
+          <w:sz w:val="26"/>
+          <w:szCs w:val="26"/>
+        </w:rPr>
+        <w:t xml:space="preserve">Lo, Y. M. D., Corbetta, N., Chamberlain, P. F., et al. “</w:t>
+      </w:r>
+      <w:hyperlink r:id="rId37" w:history="1">
+        <w:r>
+          <w:rPr>
+            <w:rStyle w:val="Hyperlink"/>
+            <w:rFonts w:ascii="Georgia" w:hAnsi="Georgia"/>
+            <w:sz w:val="26"/>
+            <w:szCs w:val="26"/>
+          </w:rPr>
+          <w:t xml:space="preserve">Presence of Fetal DNA in Maternal Plasma and Serum</w:t>
+        </w:r>
+      </w:hyperlink>
+      <w:r>
+        <w:rPr>
+          <w:rFonts w:ascii="Georgia" w:hAnsi="Georgia"/>
+          <w:sz w:val="26"/>
+          <w:szCs w:val="26"/>
+        </w:rPr>
+        <w:t xml:space="preserve">.” The Lancet 350 (1997): 485–487.</w:t>
+      </w:r>
+      <w:bookmarkEnd w:id="9011"/>
+    </w:p>
+    <w:p>
+      <w:bookmarkStart w:id="9012" w:name="bib_hamsci"/>
+      <w:hyperlink r:id="rId38" w:history="1">
+        <w:r>
+          <w:rPr>
+            <w:rStyle w:val="Hyperlink"/>
+            <w:rFonts w:ascii="Georgia" w:hAnsi="Georgia"/>
+            <w:sz w:val="26"/>
+            <w:szCs w:val="26"/>
+          </w:rPr>
+          <w:t xml:space="preserve">HamSCI</w:t>
+        </w:r>
+      </w:hyperlink>
+      <w:r>
+        <w:rPr>
+          <w:rFonts w:ascii="Georgia" w:hAnsi="Georgia"/>
+          <w:sz w:val="26"/>
+          <w:szCs w:val="26"/>
+        </w:rPr>
+        <w:t xml:space="preserve">, the Ham Radio Science Citizen Investigation: eclipse ionosphere experiments.</w:t>
+      </w:r>
+      <w:bookmarkEnd w:id="9012"/>
+    </w:p>
+    <w:p>
+      <w:bookmarkStart w:id="9013" w:name="bib_biosphere2"/>
+      <w:r>
+        <w:rPr>
+          <w:rFonts w:ascii="Georgia" w:hAnsi="Georgia"/>
+          <w:sz w:val="26"/>
+          <w:szCs w:val="26"/>
+        </w:rPr>
+        <w:t xml:space="preserve">“</w:t>
+      </w:r>
+      <w:hyperlink r:id="rId23" w:history="1">
+        <w:r>
+          <w:rPr>
+            <w:rStyle w:val="Hyperlink"/>
+            <w:rFonts w:ascii="Georgia" w:hAnsi="Georgia"/>
+            <w:sz w:val="26"/>
+            <w:szCs w:val="26"/>
+          </w:rPr>
+          <w:t xml:space="preserve">Biosphere 2</w:t>
+        </w:r>
+      </w:hyperlink>
+      <w:r>
+        <w:rPr>
+          <w:rFonts w:ascii="Georgia" w:hAnsi="Georgia"/>
+          <w:sz w:val="26"/>
+          <w:szCs w:val="26"/>
+        </w:rPr>
+        <w:t xml:space="preserve">.” Wikipedia.</w:t>
+      </w:r>
+      <w:bookmarkEnd w:id="9013"/>
+    </w:p>
+    <w:p>
+      <w:bookmarkStart w:id="9014" w:name="bib_mvp"/>
+      <w:r>
+        <w:rPr>
+          <w:rFonts w:ascii="Georgia" w:hAnsi="Georgia"/>
+          <w:sz w:val="26"/>
+          <w:szCs w:val="26"/>
+        </w:rPr>
+        <w:t xml:space="preserve">“</w:t>
+      </w:r>
+      <w:hyperlink r:id="rId39" w:history="1">
+        <w:r>
+          <w:rPr>
+            <w:rStyle w:val="Hyperlink"/>
+            <w:rFonts w:ascii="Georgia" w:hAnsi="Georgia"/>
+            <w:sz w:val="26"/>
+            <w:szCs w:val="26"/>
+          </w:rPr>
+          <w:t xml:space="preserve">Minimum viable population</w:t>
+        </w:r>
+      </w:hyperlink>
+      <w:r>
+        <w:rPr>
+          <w:rFonts w:ascii="Georgia" w:hAnsi="Georgia"/>
+          <w:sz w:val="26"/>
+          <w:szCs w:val="26"/>
+        </w:rPr>
+        <w:t xml:space="preserve">.” Wikipedia.</w:t>
+      </w:r>
+      <w:bookmarkEnd w:id="9014"/>
+    </w:p>
+    <w:p>
+      <w:bookmarkStart w:id="9015" w:name="bib_genship"/>
+      <w:r>
+        <w:rPr>
+          <w:rFonts w:ascii="Georgia" w:hAnsi="Georgia"/>
+          <w:sz w:val="26"/>
+          <w:szCs w:val="26"/>
+        </w:rPr>
+        <w:t xml:space="preserve">“</w:t>
+      </w:r>
+      <w:hyperlink r:id="rId40" w:history="1">
+        <w:r>
+          <w:rPr>
+            <w:rStyle w:val="Hyperlink"/>
+            <w:rFonts w:ascii="Georgia" w:hAnsi="Georgia"/>
+            <w:sz w:val="26"/>
+            <w:szCs w:val="26"/>
+          </w:rPr>
+          <w:t xml:space="preserve">Generation ship</w:t>
+        </w:r>
+      </w:hyperlink>
+      <w:r>
+        <w:rPr>
+          <w:rFonts w:ascii="Georgia" w:hAnsi="Georgia"/>
+          <w:sz w:val="26"/>
+          <w:szCs w:val="26"/>
+        </w:rPr>
+        <w:t xml:space="preserve">.” Wikipedia.</w:t>
+      </w:r>
+      <w:bookmarkEnd w:id="9015"/>
+    </w:p>
+    <w:p>
+      <w:bookmarkStart w:id="9016" w:name="bib_rubin"/>
+      <w:r>
+        <w:rPr>
+          <w:rFonts w:ascii="Georgia" w:hAnsi="Georgia"/>
+          <w:sz w:val="26"/>
+          <w:szCs w:val="26"/>
+        </w:rPr>
+        <w:t xml:space="preserve">Kurlander, J. A., Bernardinelli, P. H., Schwamb, M. E., et al. “</w:t>
+      </w:r>
+      <w:hyperlink r:id="rId16" w:history="1">
+        <w:r>
+          <w:rPr>
+            <w:rStyle w:val="Hyperlink"/>
+            <w:rFonts w:ascii="Georgia" w:hAnsi="Georgia"/>
+            <w:sz w:val="26"/>
+            <w:szCs w:val="26"/>
+          </w:rPr>
+          <w:t xml:space="preserve">Predictions of the LSST Solar System Yield: Near-Earth Objects, Main Belt Asteroids, Jupiter Trojans, and Trans-Neptunian Objects</w:t>
+        </w:r>
+      </w:hyperlink>
+      <w:r>
+        <w:rPr>
+          <w:rFonts w:ascii="Georgia" w:hAnsi="Georgia"/>
+          <w:sz w:val="26"/>
+          <w:szCs w:val="26"/>
+        </w:rPr>
+        <w:t xml:space="preserve">.” arXiv:2506.02487 (2025). The Vera C. Rubin Observatory forecast.</w:t>
+      </w:r>
+      <w:bookmarkEnd w:id="9016"/>
+    </w:p>
+    <w:p>
+      <w:bookmarkStart w:id="9017" w:name="bib_starlink"/>
+      <w:r>
+        <w:rPr>
+          <w:rFonts w:ascii="Georgia" w:hAnsi="Georgia"/>
+          <w:sz w:val="26"/>
+          <w:szCs w:val="26"/>
+        </w:rPr>
+        <w:t xml:space="preserve">Space.com. “</w:t>
+      </w:r>
+      <w:hyperlink r:id="rId18" w:history="1">
+        <w:r>
+          <w:rPr>
+            <w:rStyle w:val="Hyperlink"/>
+            <w:rFonts w:ascii="Georgia" w:hAnsi="Georgia"/>
+            <w:sz w:val="26"/>
+            <w:szCs w:val="26"/>
+          </w:rPr>
+          <w:t xml:space="preserve">Starlink satellites: Facts, tracking and impact on astronomy</w:t>
+        </w:r>
+      </w:hyperlink>
+      <w:r>
+        <w:rPr>
+          <w:rFonts w:ascii="Georgia" w:hAnsi="Georgia"/>
+          <w:sz w:val="26"/>
+          <w:szCs w:val="26"/>
+        </w:rPr>
+        <w:t xml:space="preserve">.” Consulted September 2026.</w:t>
+      </w:r>
+      <w:bookmarkEnd w:id="9017"/>
     </w:p>
     <w:p>
       <w:pPr>
@@ -45678,29 +46016,7 @@
           <w:color w:val="2B2B2B"/>
           <w:szCs w:val="22"/>
         </w:rPr>
-        <w:t>The Invasion Storybooks begin with this book. The nine cousins named in the note are films and television series, not titles you can buy under this name. Prose retellings of those nine are still to come, and each of them will have to keep its hands off dialogue that belongs to someone else. When a retelling is finished, its title will be printed on this page. Until then, this is the shelf.</w:t>
-      </w:r>
-    </w:p>
-    <w:p>
-      <w:pPr>
-        <w:pStyle w:val="ListParagraph"/>
-        <w:numPr>
-          <w:ilvl w:val="0"/>
-          <w:numId w:val="4"/>
-        </w:numPr>
-        <w:rPr>
-          <w:rFonts w:ascii="Georgia" w:hAnsi="Georgia"/>
-          <w:color w:val="2B2B2B"/>
-          <w:szCs w:val="22"/>
-        </w:rPr>
-      </w:pPr>
-      <w:r>
-        <w:rPr>
-          <w:rFonts w:ascii="Georgia" w:hAnsi="Georgia"/>
-          <w:color w:val="2B2B2B"/>
-          <w:szCs w:val="22"/>
-        </w:rPr>
-        <w:t>Protocol Flamingo (Book 1, this book)</w:t>
+        <w:t>The Invasion Storybooks begin with this book. The nine cousins named in the note are films and television series, not titles you can buy under this name. When a prose retelling of one of them is finished, its title will be printed on this page.</w:t>
       </w:r>
     </w:p>
     <w:p>

</xml_diff>

<commit_message>
Protocol Flamingo: merge A Note on the Cousins into A Note to the Reader (nine cousins named once, contents entry removed, no dead links); SCORES next fix
</commit_message>
<xml_diff>
--- a/Protocol Flamingo/Protocol_Flamingo_REV10.docx
+++ b/Protocol Flamingo/Protocol_Flamingo_REV10.docx
@@ -955,26 +955,6 @@
             <w:sz w:val="26"/>
           </w:rPr>
           <w:t>A Note to the Reader</w:t>
-        </w:r>
-      </w:hyperlink>
-    </w:p>
-    <w:p>
-      <w:pPr>
-        <w:ind w:left="288"/>
-        <w:rPr>
-          <w:rFonts w:ascii="Georgia" w:hAnsi="Georgia"/>
-          <w:color w:val="2B2B2B"/>
-          <w:sz w:val="26"/>
-        </w:rPr>
-      </w:pPr>
-      <w:hyperlink w:anchor="_TocAll0025" w:history="1">
-        <w:r>
-          <w:rPr>
-            <w:rFonts w:ascii="Georgia" w:hAnsi="Georgia"/>
-            <w:color w:val="2B2B2B"/>
-            <w:sz w:val="26"/>
-          </w:rPr>
-          <w:t>A Note on the Cousins</w:t>
         </w:r>
       </w:hyperlink>
     </w:p>
@@ -43988,6 +43968,23 @@
     </w:p>
     <w:p>
       <w:pPr>
+        <w:rPr>
+          <w:rFonts w:ascii="Georgia" w:hAnsi="Georgia"/>
+          <w:color w:val="2B2B2B"/>
+          <w:sz w:val="26"/>
+        </w:rPr>
+      </w:pPr>
+      <w:r>
+        <w:rPr>
+          <w:rFonts w:ascii="Georgia" w:hAnsi="Georgia"/>
+          <w:color w:val="2B2B2B"/>
+          <w:sz w:val="26"/>
+        </w:rPr>
+        <w:t>For the record, the nine are The Invaders, Dark Skies, OVNI(s) and UFO on the quiet side of the family, and on the loud side the War of the Worlds films of 1953 and 2005, Independence Day, Enemy Mine and They Live. They are films and series, not books this shelf is selling, and the debt to them is paid by naming them here instead of replaying them inside the plot.</w:t>
+      </w:r>
+    </w:p>
+    <w:p>
+      <w:pPr>
         <w:jc w:val="both"/>
         <w:rPr>
           <w:rFonts w:ascii="Georgia" w:hAnsi="Georgia"/>
@@ -44111,103 +44108,7 @@
           <w:color w:val="2B2B2B"/>
           <w:sz w:val="26"/>
         </w:rPr>
-        <w:t>The truth, everyone here will eventually agree, is not the same thing as an explanation. But for once, at least one of them is allowed to end.</w:t>
-      </w:r>
-    </w:p>
-    <w:p>
-      <w:pPr>
-        <w:jc w:val="center"/>
-        <w:rPr>
-          <w:rFonts w:ascii="Georgia" w:eastAsia="Amazon Ember" w:hAnsi="Georgia" w:cs="Amazon Ember"/>
-          <w:b/>
-          <w:bCs/>
-          <w:color w:val="3B6EA5"/>
-          <w:szCs w:val="30"/>
-        </w:rPr>
-      </w:pPr>
-      <w:r>
-        <w:rPr>
-          <w:rFonts w:ascii="Georgia" w:eastAsia="Amazon Ember" w:hAnsi="Georgia" w:cs="Amazon Ember"/>
-          <w:b/>
-          <w:bCs/>
-          <w:color w:val="3B6EA5"/>
-          <w:szCs w:val="30"/>
-        </w:rPr>
-        <w:br w:type="page"/>
-      </w:r>
-    </w:p>
-    <w:p>
-      <w:pPr>
-        <w:pStyle w:val="Heading1"/>
-        <w:spacing w:before="600" w:after="320" w:line="400" w:lineRule="auto"/>
-        <w:rPr>
-          <w:rFonts w:ascii="Georgia" w:hAnsi="Georgia"/>
-          <w:color w:val="3B6EA5"/>
-        </w:rPr>
-      </w:pPr>
-      <w:bookmarkStart w:id="125" w:name="_TocAll0025"/>
-      <w:bookmarkEnd w:id="125"/>
-      <w:r>
-        <w:rPr>
-          <w:rFonts w:eastAsia="Amazon Ember" w:cs="Amazon Ember"/>
-          <w:bCs/>
-          <w:szCs w:val="30"/>
-        </w:rPr>
-        <w:t>A NOTE ON THE COUSINS</w:t>
-      </w:r>
-    </w:p>
-    <w:p>
-      <w:pPr>
-        <w:jc w:val="both"/>
-        <w:rPr>
-          <w:rFonts w:ascii="Georgia" w:hAnsi="Georgia"/>
-          <w:color w:val="2B2B2B"/>
-          <w:sz w:val="26"/>
-        </w:rPr>
-      </w:pPr>
-      <w:r>
-        <w:rPr>
-          <w:rFonts w:ascii="Georgia" w:hAnsi="Georgia"/>
-          <w:color w:val="2B2B2B"/>
-          <w:sz w:val="26"/>
-        </w:rPr>
-        <w:t>Protocol Flamingo is a work of fiction. It is not based on any film, television series, or declassified program, and not on any office of any real government. The United States’ All-domain Anomaly Resolution Office is real, and it is not the Desk. Nora Calder, Dana Osei, the Joint Sky Directorate, Halo Systems, the Feed, and Steve are invented. Every name in the novel was checked against the nine cousins named below and belongs to none of them.</w:t>
-      </w:r>
-    </w:p>
-    <w:p>
-      <w:pPr>
-        <w:jc w:val="both"/>
-        <w:rPr>
-          <w:rFonts w:ascii="Georgia" w:hAnsi="Georgia"/>
-          <w:color w:val="2B2B2B"/>
-          <w:sz w:val="26"/>
-        </w:rPr>
-      </w:pPr>
-      <w:r>
-        <w:rPr>
-          <w:rFonts w:ascii="Georgia" w:hAnsi="Georgia"/>
-          <w:color w:val="2B2B2B"/>
-          <w:sz w:val="26"/>
-        </w:rPr>
-        <w:t>The debt is of shape and of tone, and it is paid by being named here instead of replayed inside the plot. The quiet cousins supplied a private fight and a small office: The Invaders, Dark Skies, OVNI(s), and UFO. The loud ones supplied a countdown, a prepper, a white flag, and the suspicion that an occupation might already be a company: the 1953 and 2005 Wars of the Worlds, Independence Day, Enemy Mine, and They Live. Douglas Adams supplied the suspicion that the end of the world is somebody’s paperwork. Nothing in the novel is drawn from his books or from those pictures.</w:t>
-      </w:r>
-    </w:p>
-    <w:p>
-      <w:pPr>
-        <w:jc w:val="both"/>
-        <w:rPr>
-          <w:rFonts w:ascii="Georgia" w:hAnsi="Georgia"/>
-          <w:color w:val="2B2B2B"/>
-          <w:sz w:val="26"/>
-        </w:rPr>
-      </w:pPr>
-      <w:r>
-        <w:rPr>
-          <w:rFonts w:ascii="Georgia" w:hAnsi="Georgia"/>
-          <w:color w:val="2B2B2B"/>
-          <w:sz w:val="26"/>
-        </w:rPr>
-        <w:t>The nine cousins named above are films and series, not books this shelf is selling. The retellings are still to come. This novel is the one that is finished. Look up anyway. Nobody else is going to mention it.</w:t>
+        <w:t>The truth, everyone here will eventually agree, is not the same thing as an explanation. But for once, at least one of them is allowed to end. This novel is the one that is finished. Look up anyway. Nobody else is going to mention it.</w:t>
       </w:r>
     </w:p>
     <w:p>

</xml_diff>

<commit_message>
Protocol Flamingo: closing notes merged (per-path from book-2-lectures-after-qed 9529b60)
</commit_message>
<xml_diff>
--- a/Protocol Flamingo/Protocol_Flamingo_REV10.docx
+++ b/Protocol Flamingo/Protocol_Flamingo_REV10.docx
@@ -955,26 +955,6 @@
             <w:sz w:val="26"/>
           </w:rPr>
           <w:t>A Note to the Reader</w:t>
-        </w:r>
-      </w:hyperlink>
-    </w:p>
-    <w:p>
-      <w:pPr>
-        <w:ind w:left="288"/>
-        <w:rPr>
-          <w:rFonts w:ascii="Georgia" w:hAnsi="Georgia"/>
-          <w:color w:val="2B2B2B"/>
-          <w:sz w:val="26"/>
-        </w:rPr>
-      </w:pPr>
-      <w:hyperlink w:anchor="_TocAll0025" w:history="1">
-        <w:r>
-          <w:rPr>
-            <w:rFonts w:ascii="Georgia" w:hAnsi="Georgia"/>
-            <w:color w:val="2B2B2B"/>
-            <w:sz w:val="26"/>
-          </w:rPr>
-          <w:t>A Note on the Cousins</w:t>
         </w:r>
       </w:hyperlink>
     </w:p>
@@ -43988,6 +43968,23 @@
     </w:p>
     <w:p>
       <w:pPr>
+        <w:rPr>
+          <w:rFonts w:ascii="Georgia" w:hAnsi="Georgia"/>
+          <w:color w:val="2B2B2B"/>
+          <w:sz w:val="26"/>
+        </w:rPr>
+      </w:pPr>
+      <w:r>
+        <w:rPr>
+          <w:rFonts w:ascii="Georgia" w:hAnsi="Georgia"/>
+          <w:color w:val="2B2B2B"/>
+          <w:sz w:val="26"/>
+        </w:rPr>
+        <w:t>For the record, the nine are The Invaders, Dark Skies, OVNI(s) and UFO on the quiet side of the family, and on the loud side the War of the Worlds films of 1953 and 2005, Independence Day, Enemy Mine and They Live. They are films and series, not books this shelf is selling, and the debt to them is paid by naming them here instead of replaying them inside the plot.</w:t>
+      </w:r>
+    </w:p>
+    <w:p>
+      <w:pPr>
         <w:jc w:val="both"/>
         <w:rPr>
           <w:rFonts w:ascii="Georgia" w:hAnsi="Georgia"/>
@@ -44111,103 +44108,7 @@
           <w:color w:val="2B2B2B"/>
           <w:sz w:val="26"/>
         </w:rPr>
-        <w:t>The truth, everyone here will eventually agree, is not the same thing as an explanation. But for once, at least one of them is allowed to end.</w:t>
-      </w:r>
-    </w:p>
-    <w:p>
-      <w:pPr>
-        <w:jc w:val="center"/>
-        <w:rPr>
-          <w:rFonts w:ascii="Georgia" w:eastAsia="Amazon Ember" w:hAnsi="Georgia" w:cs="Amazon Ember"/>
-          <w:b/>
-          <w:bCs/>
-          <w:color w:val="3B6EA5"/>
-          <w:szCs w:val="30"/>
-        </w:rPr>
-      </w:pPr>
-      <w:r>
-        <w:rPr>
-          <w:rFonts w:ascii="Georgia" w:eastAsia="Amazon Ember" w:hAnsi="Georgia" w:cs="Amazon Ember"/>
-          <w:b/>
-          <w:bCs/>
-          <w:color w:val="3B6EA5"/>
-          <w:szCs w:val="30"/>
-        </w:rPr>
-        <w:br w:type="page"/>
-      </w:r>
-    </w:p>
-    <w:p>
-      <w:pPr>
-        <w:pStyle w:val="Heading1"/>
-        <w:spacing w:before="600" w:after="320" w:line="400" w:lineRule="auto"/>
-        <w:rPr>
-          <w:rFonts w:ascii="Georgia" w:hAnsi="Georgia"/>
-          <w:color w:val="3B6EA5"/>
-        </w:rPr>
-      </w:pPr>
-      <w:bookmarkStart w:id="125" w:name="_TocAll0025"/>
-      <w:bookmarkEnd w:id="125"/>
-      <w:r>
-        <w:rPr>
-          <w:rFonts w:eastAsia="Amazon Ember" w:cs="Amazon Ember"/>
-          <w:bCs/>
-          <w:szCs w:val="30"/>
-        </w:rPr>
-        <w:t>A NOTE ON THE COUSINS</w:t>
-      </w:r>
-    </w:p>
-    <w:p>
-      <w:pPr>
-        <w:jc w:val="both"/>
-        <w:rPr>
-          <w:rFonts w:ascii="Georgia" w:hAnsi="Georgia"/>
-          <w:color w:val="2B2B2B"/>
-          <w:sz w:val="26"/>
-        </w:rPr>
-      </w:pPr>
-      <w:r>
-        <w:rPr>
-          <w:rFonts w:ascii="Georgia" w:hAnsi="Georgia"/>
-          <w:color w:val="2B2B2B"/>
-          <w:sz w:val="26"/>
-        </w:rPr>
-        <w:t>Protocol Flamingo is a work of fiction. It is not based on any film, television series, or declassified program, and not on any office of any real government. The United States’ All-domain Anomaly Resolution Office is real, and it is not the Desk. Nora Calder, Dana Osei, the Joint Sky Directorate, Halo Systems, the Feed, and Steve are invented. Every name in the novel was checked against the nine cousins named below and belongs to none of them.</w:t>
-      </w:r>
-    </w:p>
-    <w:p>
-      <w:pPr>
-        <w:jc w:val="both"/>
-        <w:rPr>
-          <w:rFonts w:ascii="Georgia" w:hAnsi="Georgia"/>
-          <w:color w:val="2B2B2B"/>
-          <w:sz w:val="26"/>
-        </w:rPr>
-      </w:pPr>
-      <w:r>
-        <w:rPr>
-          <w:rFonts w:ascii="Georgia" w:hAnsi="Georgia"/>
-          <w:color w:val="2B2B2B"/>
-          <w:sz w:val="26"/>
-        </w:rPr>
-        <w:t>The debt is of shape and of tone, and it is paid by being named here instead of replayed inside the plot. The quiet cousins supplied a private fight and a small office: The Invaders, Dark Skies, OVNI(s), and UFO. The loud ones supplied a countdown, a prepper, a white flag, and the suspicion that an occupation might already be a company: the 1953 and 2005 Wars of the Worlds, Independence Day, Enemy Mine, and They Live. Douglas Adams supplied the suspicion that the end of the world is somebody’s paperwork. Nothing in the novel is drawn from his books or from those pictures.</w:t>
-      </w:r>
-    </w:p>
-    <w:p>
-      <w:pPr>
-        <w:jc w:val="both"/>
-        <w:rPr>
-          <w:rFonts w:ascii="Georgia" w:hAnsi="Georgia"/>
-          <w:color w:val="2B2B2B"/>
-          <w:sz w:val="26"/>
-        </w:rPr>
-      </w:pPr>
-      <w:r>
-        <w:rPr>
-          <w:rFonts w:ascii="Georgia" w:hAnsi="Georgia"/>
-          <w:color w:val="2B2B2B"/>
-          <w:sz w:val="26"/>
-        </w:rPr>
-        <w:t>The nine cousins named above are films and series, not books this shelf is selling. The retellings are still to come. This novel is the one that is finished. Look up anyway. Nobody else is going to mention it.</w:t>
+        <w:t>The truth, everyone here will eventually agree, is not the same thing as an explanation. But for once, at least one of them is allowed to end. This novel is the one that is finished. Look up anyway. Nobody else is going to mention it.</w:t>
       </w:r>
     </w:p>
     <w:p>

</xml_diff>

<commit_message>
Protocol Flamingo: apply the new all-books heading rule
Heading 1 (book parts, Contents, Glossary, etc.) and Heading 2 (chapter
titles) both set to 16pt, matching the rest of the catalog. Both were
already bold, centered, and medium-blue, and chapter openings already
had manual page breaks. Page size changed from 5.5in x 8.5in to the
catalog-standard 6in x 9in with 0.6in margins. Verified zip integrity
and unchanged paragraph count (2549) before replacing the tracked docx.

Co-Authored-By: Claude Sonnet 5 <noreply@anthropic.com>
Claude-Session: https://claude.ai/code/session_01No3CTqqXoAC7DqUj3kRTnA
</commit_message>
<xml_diff>
--- a/Protocol Flamingo/Protocol_Flamingo_REV10.docx
+++ b/Protocol Flamingo/Protocol_Flamingo_REV10.docx
@@ -47041,8 +47041,8 @@
       <w:footerReference w:type="default" r:id="rId28"/>
       <w:headerReference w:type="first" r:id="rId29"/>
       <w:footerReference w:type="first" r:id="rId30"/>
-      <w:pgSz w:w="7920" w:h="12240"/>
-      <w:pgMar w:top="720" w:right="720" w:bottom="720" w:left="720" w:header="706" w:footer="706" w:gutter="0"/>
+      <w:pgSz w:w="8640" w:h="12960"/>
+      <w:pgMar w:top="864" w:right="864" w:bottom="864" w:left="864" w:header="706" w:footer="706" w:gutter="0"/>
       <w:pgNumType w:start="1"/>
       <w:cols w:space="720"/>
       <w:docGrid w:linePitch="360"/>
@@ -48922,7 +48922,7 @@
       <w:rFonts w:ascii="Arial" w:eastAsia="Arial" w:hAnsi="Arial" w:cs="Arial"/>
       <w:b/>
       <w:color w:val="2E74B5"/>
-      <w:sz w:val="36"/>
+      <w:sz w:val="32"/>
       <w:szCs w:val="32"/>
     </w:rPr>
   </w:style>
@@ -48941,7 +48941,7 @@
       <w:rFonts w:ascii="Arial" w:eastAsia="Arial" w:hAnsi="Arial" w:cs="Arial"/>
       <w:b/>
       <w:color w:val="2E74B5"/>
-      <w:sz w:val="30"/>
+      <w:sz w:val="32"/>
       <w:szCs w:val="26"/>
     </w:rPr>
   </w:style>

</xml_diff>

<commit_message>
Protocol Flamingo: apply the new all-books heading rule (#81)
Heading 1 (book parts, Contents, Glossary, etc.) and Heading 2 (chapter
titles) both set to 16pt, matching the rest of the catalog. Both were
already bold, centered, and medium-blue, and chapter openings already
had manual page breaks. Page size changed from 5.5in x 8.5in to the
catalog-standard 6in x 9in with 0.6in margins. Verified zip integrity
and unchanged paragraph count (2549) before replacing the tracked docx.


Claude-Session: https://claude.ai/code/session_01No3CTqqXoAC7DqUj3kRTnA

Co-authored-by: Claude <noreply@anthropic.com>
</commit_message>
<xml_diff>
--- a/Protocol Flamingo/Protocol_Flamingo_REV10.docx
+++ b/Protocol Flamingo/Protocol_Flamingo_REV10.docx
@@ -47041,8 +47041,8 @@
       <w:footerReference w:type="default" r:id="rId28"/>
       <w:headerReference w:type="first" r:id="rId29"/>
       <w:footerReference w:type="first" r:id="rId30"/>
-      <w:pgSz w:w="7920" w:h="12240"/>
-      <w:pgMar w:top="720" w:right="720" w:bottom="720" w:left="720" w:header="706" w:footer="706" w:gutter="0"/>
+      <w:pgSz w:w="8640" w:h="12960"/>
+      <w:pgMar w:top="864" w:right="864" w:bottom="864" w:left="864" w:header="706" w:footer="706" w:gutter="0"/>
       <w:pgNumType w:start="1"/>
       <w:cols w:space="720"/>
       <w:docGrid w:linePitch="360"/>
@@ -48922,7 +48922,7 @@
       <w:rFonts w:ascii="Arial" w:eastAsia="Arial" w:hAnsi="Arial" w:cs="Arial"/>
       <w:b/>
       <w:color w:val="2E74B5"/>
-      <w:sz w:val="36"/>
+      <w:sz w:val="32"/>
       <w:szCs w:val="32"/>
     </w:rPr>
   </w:style>
@@ -48941,7 +48941,7 @@
       <w:rFonts w:ascii="Arial" w:eastAsia="Arial" w:hAnsi="Arial" w:cs="Arial"/>
       <w:b/>
       <w:color w:val="2E74B5"/>
-      <w:sz w:val="30"/>
+      <w:sz w:val="32"/>
       <w:szCs w:val="26"/>
     </w:rPr>
   </w:style>

</xml_diff>

<commit_message>
Protocol Flamingo: finalize editorial review and KDP age guidance
</commit_message>
<xml_diff>
--- a/Protocol Flamingo/Protocol_Flamingo_REV10.docx
+++ b/Protocol Flamingo/Protocol_Flamingo_REV10.docx
@@ -1227,7 +1227,7 @@
           <w:color w:val="2B2B2B"/>
           <w:sz w:val="26"/>
         </w:rPr>
-        <w:t>Nora Calder had filmed forty-one weddings, and this one was, by every measure she used to judge such things — light, timing, an open bar that closed at a decent hour — shaping up to be a good one, right up until the water tower started doing something water towers do not do.</w:t>
+        <w:t>Nora Calder had filmed forty-one weddings. By every measure she used — light, timing, an open bar that closed at a decent hour — this one was shaping up to be a good one, right up until the water tower started doing something water towers do not do.</w:t>
       </w:r>
     </w:p>
     <w:p>
@@ -2200,7 +2200,7 @@
           <w:color w:val="2B2B2B"/>
           <w:sz w:val="26"/>
         </w:rPr>
-        <w:t>Under her wiper was a flyer the color of a drugstore receipt. STARFALL, in letters that had tried to look like a planet. The eclipse of the year. Zaragoza, Spain. Wednesday 12 August. Your sky, live — wherever you are. Halo Systems. There was a picture of the moon wearing a ring like a halo in a medieval painting, and a QR code. Every car in the lot had one. She balled it up and missed the can by the barn door.</w:t>
+        <w:t>Under her wiper was a flyer the color of a drugstore receipt. STARFALL, in letters that had tried to look like a planet. The eclipse of the year. Zaragoza, Spain. Tuesday 12 August. Your sky, live — wherever you are. Halo Systems. There was a picture of the moon wearing a ring like a halo in a medieval painting, and a QR code. Every car in the lot had one. She balled it up and missed the can by the barn door.</w:t>
       </w:r>
     </w:p>
     <w:p>
@@ -2494,7 +2494,7 @@
           <w:color w:val="2B2B2B"/>
           <w:sz w:val="26"/>
         </w:rPr>
-        <w:t>Dana Osei had said so to the range safety officer, to the program manager, to two lieutenants, a congressional staffer and her own mother, and she was still saying it on the last Saturday in June — the same evening, as it turned out, as a wedding in a place called Lissome, Indiana — in a rental kitchen in Ogden, Utah, to a government attorney named Nowak whom she would never once see in person. She was thirty-eight, with close-cropped hair already going gray at thirty-eight, which she classified as a launch-related injury, and a launch engineer’s flat, precise way of finishing sentences, as if she were reading them off a checklist and would be graded on the punctuation.</w:t>
+        <w:t>Dana Osei had told the range safety officer, the program manager, two lieutenants, a congressional staffer, and her mother that the confetti was not the payload. On the last Saturday in June — the same evening as a wedding in Lissome, Indiana — she was still explaining this in a rental kitchen in Ogden, Utah. The government attorney on the phone was named Nowak, whom she would never meet in person. Dana was thirty-eight, with close-cropped hair already going gray, which she classified as a launch-related injury. Her launch-engineer’s way of finishing sentences was flat and precise, as if she were reading from a checklist and would be graded on the punctuation.</w:t>
       </w:r>
     </w:p>
     <w:p>
@@ -3786,7 +3786,7 @@
           <w:color w:val="2B2B2B"/>
           <w:sz w:val="26"/>
         </w:rPr>
-        <w:t>“That’s the one,” Priya said, and then, faster, “that’s the one that went missing, I timed it, the clip, I had it in a tab and it was gone before I hit save, nothing comes down that fast, nothing, not a beheading, not a copyright strike, somebody had to have —” She stopped, because Warren had raised one finger, the way a conductor stops an orchestra.</w:t>
+        <w:t>“That’s the one,” Priya said, and then, faster, “That’s the one that went missing. I timed it. The clip — I had it in a tab, and it was gone before I hit save. Nothing comes down that fast. Nothing — not a beheading, not a copyright strike. Somebody had to have —” She stopped, because Warren had raised one finger, the way a conductor stops an orchestra.</w:t>
       </w:r>
     </w:p>
     <w:p>
@@ -4016,7 +4016,7 @@
           <w:color w:val="2B2B2B"/>
           <w:sz w:val="26"/>
         </w:rPr>
-        <w:t>They fell into three camps. The first was convinced it was obviously AI, because the light moved wrong for something real. The second was convinced it was real and had been sent, personally, to warn them about a specific and unrelated apocalypse Nora had not been trying to discuss. The third and most confident camp had watched the same eighty seconds and concluded, with total sincerity and several paragraphs of supporting argument, that it was ball lightning, Chinese surveillance, a drone show gone wrong, swamp gas reflecting off a weather balloon, or, in one comment Nora returned to more often than she would admit, “obviously just Mercury, people, look it up,” a claim Mercury itself would have struggled to defend at nine o’clock on a June night over Indiana.</w:t>
+        <w:t>They fell into three camps. The first was convinced it was obviously AI, because the light moved wrong for something real. The second was convinced it was real and had been sent, personally, to warn them about a specific and unrelated apocalypse Nora had not been trying to discuss. The third, most confident camp watched the same eighty seconds and produced an array of explanations, each delivered with total sincerity and several paragraphs of evidence: ball lightning, state surveillance, a drone show gone wrong, swamp gas reflecting off a weather balloon. One commenter Nora returned to more often than she would admit called it “obviously just Mercury, people, look it up.” Mercury itself would have struggled to defend that claim at nine o’clock on a June night over Indiana.</w:t>
       </w:r>
     </w:p>
     <w:p>
@@ -11350,9 +11350,9 @@
           <w:color w:val="auto"/>
           <w:sz w:val="26"/>
         </w:rPr>
-        <w:t xml:space="preserve">The Canadians had radar tracks from the north and a public-safety file whose bland heading translated, in practice, to please stop calling these aircraft until somebody proves they are. Germany had instrument logs and three pages of objections to the chain of custody. France had a deeper archive than anyone had admitted. Australia had two heat blooms over empty country and a civil-aviation report that had been revised so often the revisions had become evidence. New </w:t>
+        <w:t xml:space="preserve">Canada’s radar service had tracks from the north and a public-safety file whose bland heading translated, in practice, to please stop calling these aircraft until somebody proves they are. German investigators had instrument logs and three pages of objections to the chain of custody. The French delegation had a deeper archive than anyone had admitted. Australian civil aviation had two heat blooms over empty country and a report revised so often the revisions had become evidence. New Zealand’s coastal service had a sighting accompanied by excellent weather data and almost no useful video. Japan’s optical station had the timing. Brazil’s file contained witness accounts. The American agencies had too many compartments to know what the Americans had.</w:t>
         <w:lastRenderedPageBreak/>
-        <w:t>Zealand had a coastal sighting accompanied by excellent weather data and almost no useful video. Japan had timing. Brazil had witnesses. The Americans had too many compartments to know what the Americans had.</w:t>
+        <w:t/>
       </w:r>
     </w:p>
     <w:p>
@@ -11634,9 +11634,9 @@
           <w:color w:val="2B2B2B"/>
           <w:sz w:val="26"/>
         </w:rPr>
-        <w:t xml:space="preserve">The conference room smelled of instant coffee and the dust that settles on venetian blinds nobody has opened in a decade. The overhead light had a flicker in its left third that three separate facilities requests had failed to fix. The table was laminate pretending to be walnut and sticky at one corner where a cup had lived too long. Outside, a tram bell. Inside, the air handling dropped a </w:t>
+        <w:t xml:space="preserve">The conference room smelled of instant coffee and the dust that settles on venetian blinds nobody has opened in a decade. The overhead light had a flicker in its left third that three separate facilities requests had failed to fix. The table was laminate pretending to be walnut and sticky at one corner where a cup had lived too long. Outside, a tram bell. Inside, the air handling dropped one metallic tick into the room every ninety seconds; nobody had ever found its source.</w:t>
         <w:lastRenderedPageBreak/>
-        <w:t>single metallic tick onto the minutes every ninety seconds, which a German officer named Berthold had once tried to have entered into the record as an interruption.</w:t>
+        <w:t/>
       </w:r>
     </w:p>
     <w:p>
@@ -11672,25 +11672,25 @@
           <w:color w:val="2B2B2B"/>
           <w:sz w:val="26"/>
         </w:rPr>
-        <w:t>Around the table sat the four services that paid for the building. Duval, for the French, rolling an unlit cigarette between two fingers. Berthold, for the Germans, with a stack of paper in triplicate. Whitcombe, for the British, a long gray man in a coat that smelled faintly of rain and who said everything as if apologizing for it in advance. And Cole, for the Americans, in the newest suit in the room, with the shop crease still in the sleeve. Dana looked at him and thought: that is the name Elena let slip on the stairs. He had a pleasant, square, forgettable face and the eyes of a man who counted exits.</w:t>
-      </w:r>
-    </w:p>
-    <w:p>
-      <w:pPr>
-        <w:jc w:val="both"/>
-        <w:rPr>
-          <w:rFonts w:ascii="Georgia" w:hAnsi="Georgia"/>
-          <w:color w:val="2B2B2B"/>
-          <w:sz w:val="26"/>
-        </w:rPr>
-      </w:pPr>
-      <w:r>
-        <w:rPr>
-          <w:rFonts w:ascii="Georgia" w:hAnsi="Georgia"/>
-          <w:color w:val="2B2B2B"/>
-          <w:sz w:val="26"/>
-        </w:rPr>
-        <w:t>Elena Marsh sat behind him, against the wall, with a legal pad on her knee. She did not look at Dana. Dana did not look at her. Both of them were very good at it, and both of them had had practice.</w:t>
+        <w:t>Around the table sat representatives of the four services that paid for the building. Duval, for the French service, had the deepest file in the room and kept it closed under one hand. Berthold, for the German service, had brought the instrument logs and kept the source records apart from the annotated copies. Whitcombe, for the British service, was long and gray, and waited for each speaker to finish before taking the floor. Cole, for the American service, wore the newest suit in the room, with the shop crease still in the sleeve. Dana looked at him and thought: that is the name Elena let slip on the stairs. He had a pleasant, square, forgettable face and the eyes of a man who counted exits.</w:t>
+      </w:r>
+    </w:p>
+    <w:p>
+      <w:pPr>
+        <w:jc w:val="both"/>
+        <w:rPr>
+          <w:rFonts w:ascii="Georgia" w:hAnsi="Georgia"/>
+          <w:color w:val="2B2B2B"/>
+          <w:sz w:val="26"/>
+        </w:rPr>
+      </w:pPr>
+      <w:r>
+        <w:rPr>
+          <w:rFonts w:ascii="Georgia" w:hAnsi="Georgia"/>
+          <w:color w:val="2B2B2B"/>
+          <w:sz w:val="26"/>
+        </w:rPr>
+        <w:t>Elena Marsh sat behind him, against the wall, with a legal pad on her knee. She did not look at Dana. Dana did not look at her. Both were practiced at it.</w:t>
       </w:r>
     </w:p>
     <w:p>
@@ -12182,7 +12182,7 @@
           <w:color w:val="2B2B2B"/>
           <w:sz w:val="26"/>
         </w:rPr>
-        <w:t>Nobody answered him. Berthold wanted the demonstration to be legal. Duval wanted it to be French. Whitcombe wanted it not to be a demonstration at all. Buchanan sat with her hands flat on the table and said that conversation without a loaded alternative was a hobby. Halvorsen let them talk until the flicker in the left third of the light became the loudest thing in the room, and then she said that the Directorate’s job was still to know, not to finish.</w:t>
+        <w:t>Nobody answered him. Berthold wanted a legal basis for the demonstration. Duval wanted the Directorate, not Washington, to direct it. Whitcombe wanted it not to be a demonstration at all. Buchanan sat with her hands flat on the table and said that conversation without a loaded alternative was a hobby. Halvorsen let them talk until the flicker in the left third of the light became the loudest thing in the room, and then she said that the Directorate’s job was still to know, not to finish.</w:t>
       </w:r>
     </w:p>
     <w:p>
@@ -14183,6 +14183,12 @@
       </w:r>
     </w:p>
     <w:p>
+      <w:pPr/>
+      <w:r>
+        <w:t>On the back of the agreement’s photocopy, Nora made two columns. The man in the windbreaker had watched her. The flyers had brought her and Jesse together. Until she had proof, she would treat them as two people with two purposes.</w:t>
+      </w:r>
+    </w:p>
+    <w:p>
       <w:pPr>
         <w:jc w:val="both"/>
         <w:rPr>
@@ -19350,7 +19356,7 @@
           <w:color w:val="2B2B2B"/>
           <w:sz w:val="26"/>
         </w:rPr>
-        <w:t>Crew bodies make the marker in bulk. Something in the ship’s biochemistry. We hybrids leak a little of it into the blood after the implant has been talking to us, which is all your cartridge can see. The smell is a different thing. A sweet volatile, like warm plastic and cut grass. Steve is not reading your protein. He is reading the air. Faintly, on someone like Dominic. Strongly, on someone who has been using the link on purpose.</w:t>
+        <w:t>“Crew bodies make the marker in bulk. Something in the ship’s biochemistry. We hybrids leak a little of it into the blood after the implant has been talking to us, which is all your cartridge can see. The smell is a different thing. A sweet volatile, like warm plastic and cut grass. Steve is not reading your protein. He is reading the air. Faintly, on someone like Dominic. Strongly, on someone who has been using the link on purpose,” Feld said.</w:t>
       </w:r>
     </w:p>
     <w:p>
@@ -19612,7 +19618,7 @@
           <w:color w:val="auto"/>
           <w:sz w:val="26"/>
         </w:rPr>
-        <w:t>The ship did not cheat relativity. That was the first thing Feld insisted on explaining once Nora could ask questions without being sick. There had been no jump, no folded space, no secret engine that made distance a misunderstanding. The voyage had been slow enough for ancestors to become history. The vessel survived by treating velocity as expensive, heat as debt, and every kilogram as an argument.</w:t>
+        <w:t>Later, once Nora could ask questions without being sick, Feld insisted on explaining that the ship had not cheated relativity. There had been no jump, no folded space, no secret engine that made distance a misunderstanding. The voyage had been slow enough for ancestors to become history. The vessel survived by treating velocity as expensive, heat as debt, and every kilogram as an argument.</w:t>
       </w:r>
     </w:p>
     <w:p>
@@ -20271,7 +20277,7 @@
           <w:color w:val="2B2B2B"/>
           <w:sz w:val="26"/>
         </w:rPr>
-        <w:t xml:space="preserve">“I was born in Columbus, Ohio,” the Escort said, “in 1990. That’s not true. A baby was born in Columbus, Ohio, in 1990, to a woman named Sheila who worked at a bank, and four hours after he was born he was taken to the nursery for observation, and up here. And what went back down to Sheila was me.” He said it the way a man discloses a chronic condition. “Grown in a tank like those, over nine months, from cells they took from her blood when she was six months pregnant. Fetal cells. They </w:t>
+        <w:t xml:space="preserve">“I was born in Columbus, Ohio,” the Escort said, “in 1990. That’s not true. A baby was born in Columbus, Ohio, in 1990, to a woman named Sheila who worked at a bank, and four hours after he was born he was taken to the nursery for observation, and up here. And what went back down to Sheila was me.” He said it the way a man discloses a chronic condition. “Grown in a tank like those, on an accelerated schedule over the remaining three months, from cells they took from her blood when she was six months pregnant. Fetal cells. They </w:t>
         <w:lastRenderedPageBreak/>
         <w:t>cross the placenta, a few of them; they’re in every pregnant woman’s blood. Your own doctors use them for tests. The ship uses them for other things. What they grow from those cells is a twin. Genetically, I am that baby. Same face. Same blood. Plus one thing.” He tapped the base of his skull, lightly, the way a man knocks wood. “About the size of a grain of rice.”</w:t>
       </w:r>
@@ -20544,7 +20550,7 @@
           <w:color w:val="2B2B2B"/>
           <w:sz w:val="26"/>
         </w:rPr>
-        <w:t>“In bodies that can live on a planet. Their language, their memory, their committees — God help us, their committees — in bodies that can breathe your air and eat your food.” He tipped his chin at the deck. “The taken ones grow up down there as theirs. The foundlings. A little over four thousand now. More were taken. Not all of them lived; the ship is a hard place to be a baby. Some have children of their own by now, born up here, and the oldest of those are about twenty-five.” He tapped his skull again. “And the ones like me, grown and sent down to fill the cribs, are the other half. The listening post. Our implants send our lives up a few times a year, in visits we don’t remember. We’re how they found out what a gas station is.”</w:t>
+        <w:t>“In bodies that can live on a planet. Their language, their memory, their committees — God help us, their committees — in bodies that can breathe your air and eat your food.” He tipped his chin at the deck. “The taken infants grow up aboard the ship as theirs. The foundlings. A little over four thousand now. More were taken. Not all of them lived; the ship is a hard place to be a baby. Some have children of their own by now, born up here, and the oldest of those are about twenty-five.” He tapped his skull again. “And the ones like me, grown and sent down to fill the cribs, are the other half. The listening post. Our implants send our lives up a few times a year, in visits we don’t remember. We’re how they found out what a gas station is.”</w:t>
       </w:r>
     </w:p>
     <w:p>
@@ -21290,9 +21296,9 @@
           <w:color w:val="2B2B2B"/>
           <w:sz w:val="26"/>
         </w:rPr>
-        <w:t xml:space="preserve">“The ship finds out tomorrow. Tonight is the tender, and whatever it was told, years ago, to do if somebody </w:t>
+        <w:t xml:space="preserve">The ship finds out after Starfall. The tender is what matters then, and whatever it was told, years ago, to do if somebody finally asked.</w:t>
         <w:lastRenderedPageBreak/>
-        <w:t>finally asked.” He held her eye. “There is a cached signature up there. A conditional. It arms if a carried ask matches the clause, and it dies four seconds before third contact if it doesn’t. After that the muster finishes, because nobody on the Boat can reach the switch in time to be merciful. That is not a metaphor. That is the speed of light.”</w:t>
+        <w:t/>
       </w:r>
     </w:p>
     <w:p>
@@ -22344,27 +22350,27 @@
           <w:color w:val="2B2B2B"/>
           <w:sz w:val="26"/>
         </w:rPr>
-        <w:t>A man with no wallet and no coat walked into the emergency department of a hospital there at two in the morning and put an orderly through a supply cart when the orderly asked him to sit. It took four people to get him on the floor. He did not swear. He did not say a word. He bit. The psychiatrist on call, a man named Carl Daniels, came in from home with his shirt buttoned wrong and found the patient already in restraints, staring at the ceiling tiles as if reading a language printed on them. In the hallway a security guard was wrapping his own hand and saying, to nobody, that the guy had looked at him first like he was a piece of furniture that had started talking.</w:t>
-      </w:r>
-    </w:p>
-    <w:p>
-      <w:pPr>
-        <w:jc w:val="both"/>
-        <w:rPr>
-          <w:rFonts w:ascii="Georgia" w:hAnsi="Georgia"/>
-          <w:color w:val="2B2B2B"/>
-          <w:sz w:val="26"/>
-        </w:rPr>
-      </w:pPr>
-      <w:r>
-        <w:rPr>
-          <w:rFonts w:ascii="Georgia" w:hAnsi="Georgia"/>
-          <w:color w:val="2B2B2B"/>
-          <w:sz w:val="26"/>
-        </w:rPr>
-        <w:t xml:space="preserve">Daniels had seen four of them in nine years. Patients who arrived with no papers, no dental records, and no language a linguistics department could place. They did not get profiled, or studied, or referred up any chain that a genuinely unprecedented case should have climbed. They got a diagnosis nobody argued with, a locked bed, and — in the hallway shorthand his own nursing staff had adopted without any official sanction — a chart marked berserk. And then, more often than the charts liked to </w:t>
+        <w:t>A man with no wallet and no coat walked into the emergency department of a hospital there at two in the morning and put an orderly through a supply cart when the orderly asked him to sit. It took four people to get him on the floor. He said something the orderly did not understand. Then he bit. The psychiatrist on call, a man named Carl Daniels, came in from home with his shirt buttoned wrong and found the patient already in restraints, staring at the ceiling tiles as if reading a language printed on them. In the hallway a security guard was wrapping his own hand and saying, to nobody, that the guy had looked at him first like he was a piece of furniture that had started talking.</w:t>
+      </w:r>
+    </w:p>
+    <w:p>
+      <w:pPr>
+        <w:jc w:val="both"/>
+        <w:rPr>
+          <w:rFonts w:ascii="Georgia" w:hAnsi="Georgia"/>
+          <w:color w:val="2B2B2B"/>
+          <w:sz w:val="26"/>
+        </w:rPr>
+      </w:pPr>
+      <w:r>
+        <w:rPr>
+          <w:rFonts w:ascii="Georgia" w:hAnsi="Georgia"/>
+          <w:color w:val="2B2B2B"/>
+          <w:sz w:val="26"/>
+        </w:rPr>
+        <w:t xml:space="preserve">Daniels had seen four of them in nine years. Patients arrived with no papers, no dental records, and no language a linguistics department could place. They were not profiled, studied, or referred up any chain that a genuinely unprecedented case should have climbed. They got diagnoses nobody challenged, a locked bed, and — in the hallway shorthand his nursing staff had adopted without official sanction — a chart marked berserk. The word was shorthand for what no one could explain, not a diagnosis. When a crisis turned physical, the records began with the altercation; nobody could reconstruct what had led to it. The outcome was either transfer to a facility with better locks or something worse for everyone.</w:t>
         <w:lastRenderedPageBreak/>
-        <w:t>admit, a fight they started for reasons nobody could reconstruct, which either moved them to a facility with better locks or ended badly for everyone.</w:t>
+        <w:t/>
       </w:r>
     </w:p>
     <w:p>
@@ -22401,6 +22407,349 @@
           <w:sz w:val="26"/>
         </w:rPr>
         <w:t>He called the Desk because the Desk’s number was on a card Gladys had mailed him in 2019, after he had written up the hitchhiker outside Elko for a psychiatric journal nobody read, in the hope that someday a fifth would have somewhere to go besides a locked bed. Gladys took the call standing, drawer-phone against her shoulder, and wrote Terre Haute in the same print she had used for Lissome.</w:t>
+      </w:r>
+    </w:p>
+    <w:p>
+      <w:pPr>
+        <w:jc w:val="center"/>
+        <w:rPr>
+          <w:rFonts w:ascii="Georgia" w:hAnsi="Georgia"/>
+          <w:color w:val="2B2B2B"/>
+          <w:sz w:val="26"/>
+        </w:rPr>
+      </w:pPr>
+      <w:r>
+        <w:rPr>
+          <w:rFonts w:ascii="Georgia" w:hAnsi="Georgia"/>
+          <w:color w:val="2B2B2B"/>
+          <w:sz w:val="26"/>
+        </w:rPr>
+        <w:t>∗</w:t>
+      </w:r>
+    </w:p>
+    <w:p>
+      <w:pPr>
+        <w:jc w:val="both"/>
+        <w:rPr>
+          <w:rFonts w:ascii="Georgia" w:hAnsi="Georgia"/>
+          <w:color w:val="2B2B2B"/>
+          <w:sz w:val="26"/>
+        </w:rPr>
+      </w:pPr>
+      <w:r>
+        <w:rPr>
+          <w:rFonts w:ascii="Georgia" w:hAnsi="Georgia"/>
+          <w:color w:val="2B2B2B"/>
+          <w:sz w:val="26"/>
+        </w:rPr>
+        <w:t>Across the Atlantic, at a research annex outside Trieste, Alberto Fucchi was running an experiment with a private research institute in China. His lab had no windows, which was how he knew the bats were getting in. Fucchi was an Italian biologist with a secure university post and a habit of treating ethics review as an obstacle to route around. Lin, a technician seconded from the partner institute, had asked for the donor-consent records before the samples arrived.</w:t>
+      </w:r>
+    </w:p>
+    <w:p>
+      <w:pPr>
+        <w:jc w:val="both"/>
+        <w:rPr>
+          <w:rFonts w:ascii="Georgia" w:hAnsi="Georgia"/>
+          <w:color w:val="2B2B2B"/>
+          <w:sz w:val="26"/>
+        </w:rPr>
+      </w:pPr>
+      <w:r>
+        <w:rPr>
+          <w:rFonts w:ascii="Georgia" w:hAnsi="Georgia"/>
+          <w:color w:val="2B2B2B"/>
+          <w:sz w:val="26"/>
+        </w:rPr>
+        <w:t>The first bat appeared above the centrifuge at 2:13 a.m., clinging upside down to a pipe with the calm of a creature that had read the building plans. Alberto called security. Security said the roof was sealed. He called maintenance. Maintenance said the roof was sealed now.</w:t>
+      </w:r>
+    </w:p>
+    <w:p>
+      <w:pPr>
+        <w:jc w:val="both"/>
+        <w:rPr>
+          <w:rFonts w:ascii="Georgia" w:hAnsi="Georgia"/>
+          <w:color w:val="2B2B2B"/>
+          <w:sz w:val="26"/>
+        </w:rPr>
+      </w:pPr>
+      <w:r>
+        <w:rPr>
+          <w:rFonts w:ascii="Georgia" w:hAnsi="Georgia"/>
+          <w:color w:val="2B2B2B"/>
+          <w:sz w:val="26"/>
+        </w:rPr>
+        <w:t>By morning, three bats were roosting in the animal room, and every lab rat had abandoned its bedding to crowd along the far side of its cage.</w:t>
+      </w:r>
+    </w:p>
+    <w:p>
+      <w:pPr>
+        <w:jc w:val="both"/>
+        <w:rPr>
+          <w:rFonts w:ascii="Georgia" w:hAnsi="Georgia"/>
+          <w:color w:val="2B2B2B"/>
+          <w:sz w:val="26"/>
+        </w:rPr>
+      </w:pPr>
+      <w:r>
+        <w:rPr>
+          <w:rFonts w:ascii="Georgia" w:hAnsi="Georgia"/>
+          <w:color w:val="2B2B2B"/>
+          <w:sz w:val="26"/>
+        </w:rPr>
+        <w:t>“They’re afraid of the bats,” said Lin, the technician.</w:t>
+      </w:r>
+    </w:p>
+    <w:p>
+      <w:pPr>
+        <w:keepLines/>
+        <w:jc w:val="both"/>
+        <w:rPr>
+          <w:rFonts w:ascii="Georgia" w:hAnsi="Georgia"/>
+          <w:color w:val="2B2B2B"/>
+          <w:sz w:val="26"/>
+        </w:rPr>
+      </w:pPr>
+      <w:r>
+        <w:rPr>
+          <w:rFonts w:ascii="Georgia" w:hAnsi="Georgia"/>
+          <w:color w:val="2B2B2B"/>
+          <w:sz w:val="26"/>
+        </w:rPr>
+        <w:t>“They’re afraid of us,” Alberto said. He leaned toward the nearest cage. The rats stared back, bright-eyed and unusually still. “That’s the whole point of the experiment.”</w:t>
+      </w:r>
+    </w:p>
+    <w:p>
+      <w:pPr>
+        <w:jc w:val="both"/>
+        <w:rPr>
+          <w:rFonts w:ascii="Georgia" w:hAnsi="Georgia"/>
+          <w:color w:val="2B2B2B"/>
+          <w:sz w:val="26"/>
+        </w:rPr>
+      </w:pPr>
+      <w:r>
+        <w:rPr>
+          <w:rFonts w:ascii="Georgia" w:hAnsi="Georgia"/>
+          <w:color w:val="2B2B2B"/>
+          <w:sz w:val="26"/>
+        </w:rPr>
+        <w:t>The experiment used blood samples carrying Analyte 7, supplied through the private partner institute; its director, Dr. Shen, had agreed to remove the donors’ names from the paperwork. Fucchi’s university review board had rejected the protocol, which would have been illegal anywhere it was performed. Dr. Shen approved it anyway. Fucchi told himself that approval made the risk theirs. Lin had asked to see the signed consent forms; Fucchi told her the institute had cleared the collection. The forms bore no signatures. No one had asked the donors.</w:t>
+      </w:r>
+    </w:p>
+    <w:p>
+      <w:pPr>
+        <w:jc w:val="both"/>
+        <w:rPr>
+          <w:rFonts w:ascii="Georgia" w:hAnsi="Georgia"/>
+          <w:color w:val="2B2B2B"/>
+          <w:sz w:val="26"/>
+        </w:rPr>
+      </w:pPr>
+      <w:r>
+        <w:rPr>
+          <w:rFonts w:ascii="Georgia" w:hAnsi="Georgia"/>
+          <w:color w:val="2B2B2B"/>
+          <w:sz w:val="26"/>
+        </w:rPr>
+        <w:t>The rats had begun responding to the signal before the researchers switched on the transmitter. The bats, apparently, had heard it first.</w:t>
+      </w:r>
+    </w:p>
+    <w:p>
+      <w:pPr>
+        <w:jc w:val="both"/>
+        <w:rPr>
+          <w:rFonts w:ascii="Georgia" w:hAnsi="Georgia"/>
+          <w:color w:val="2B2B2B"/>
+          <w:sz w:val="26"/>
+        </w:rPr>
+      </w:pPr>
+      <w:r>
+        <w:rPr>
+          <w:rFonts w:ascii="Georgia" w:hAnsi="Georgia"/>
+          <w:color w:val="2B2B2B"/>
+          <w:sz w:val="26"/>
+        </w:rPr>
+        <w:t>Lin looked up at the ceiling. “Maybe we should stop.”</w:t>
+      </w:r>
+    </w:p>
+    <w:p>
+      <w:pPr>
+        <w:jc w:val="both"/>
+        <w:rPr>
+          <w:rFonts w:ascii="Georgia" w:hAnsi="Georgia"/>
+          <w:color w:val="2B2B2B"/>
+          <w:sz w:val="26"/>
+        </w:rPr>
+      </w:pPr>
+      <w:r>
+        <w:rPr>
+          <w:rFonts w:ascii="Georgia" w:hAnsi="Georgia"/>
+          <w:color w:val="2B2B2B"/>
+          <w:sz w:val="26"/>
+        </w:rPr>
+        <w:t>Alberto glanced at the sealed door, the locked cabinets, the consent forms translated into four languages and signed by no one who had seen the actual protocol.</w:t>
+      </w:r>
+    </w:p>
+    <w:p>
+      <w:pPr>
+        <w:jc w:val="both"/>
+        <w:rPr>
+          <w:rFonts w:ascii="Georgia" w:hAnsi="Georgia"/>
+          <w:color w:val="2B2B2B"/>
+          <w:sz w:val="26"/>
+        </w:rPr>
+      </w:pPr>
+      <w:r>
+        <w:rPr>
+          <w:rFonts w:ascii="Georgia" w:hAnsi="Georgia"/>
+          <w:color w:val="2B2B2B"/>
+          <w:sz w:val="26"/>
+        </w:rPr>
+        <w:t>“Stopping is easy,” he said. “Explaining why we started is harder.”</w:t>
+      </w:r>
+    </w:p>
+    <w:p>
+      <w:pPr>
+        <w:jc w:val="both"/>
+        <w:rPr>
+          <w:rFonts w:ascii="Georgia" w:hAnsi="Georgia"/>
+          <w:color w:val="2B2B2B"/>
+          <w:sz w:val="26"/>
+        </w:rPr>
+      </w:pPr>
+      <w:r>
+        <w:rPr>
+          <w:rFonts w:ascii="Georgia" w:hAnsi="Georgia"/>
+          <w:color w:val="2B2B2B"/>
+          <w:sz w:val="26"/>
+        </w:rPr>
+        <w:t>One of the bats dropped from the pipe. It landed on the cage, folded its wings, and looked straight at him.</w:t>
+      </w:r>
+    </w:p>
+    <w:p>
+      <w:pPr>
+        <w:jc w:val="both"/>
+        <w:rPr>
+          <w:rFonts w:ascii="Georgia" w:hAnsi="Georgia"/>
+          <w:color w:val="2B2B2B"/>
+          <w:sz w:val="26"/>
+        </w:rPr>
+      </w:pPr>
+      <w:r>
+        <w:rPr>
+          <w:rFonts w:ascii="Georgia" w:hAnsi="Georgia"/>
+          <w:color w:val="2B2B2B"/>
+          <w:sz w:val="26"/>
+        </w:rPr>
+        <w:t>Every rat in the room began tapping the bars at once.</w:t>
+      </w:r>
+    </w:p>
+    <w:p>
+      <w:pPr>
+        <w:jc w:val="both"/>
+        <w:rPr>
+          <w:rFonts w:ascii="Georgia" w:hAnsi="Georgia"/>
+          <w:color w:val="2B2B2B"/>
+          <w:sz w:val="26"/>
+        </w:rPr>
+      </w:pPr>
+      <w:r>
+        <w:rPr>
+          <w:rFonts w:ascii="Georgia" w:hAnsi="Georgia"/>
+          <w:color w:val="2B2B2B"/>
+          <w:sz w:val="26"/>
+        </w:rPr>
+        <w:t>Alberto’s phone rang. Dr. Shen, director of the partner institute in China, was calling from the other side of the world. He let it ring.</w:t>
+      </w:r>
+    </w:p>
+    <w:p>
+      <w:pPr>
+        <w:jc w:val="both"/>
+        <w:rPr>
+          <w:rFonts w:ascii="Georgia" w:hAnsi="Georgia"/>
+          <w:color w:val="2B2B2B"/>
+          <w:sz w:val="26"/>
+        </w:rPr>
+      </w:pPr>
+      <w:r>
+        <w:rPr>
+          <w:rFonts w:ascii="Georgia" w:hAnsi="Georgia"/>
+          <w:color w:val="2B2B2B"/>
+          <w:sz w:val="26"/>
+        </w:rPr>
+        <w:t>Then, from somewhere inside the ventilation shaft, came a sound like a thousand tiny claws answering the rats.</w:t>
+      </w:r>
+    </w:p>
+    <w:p>
+      <w:pPr>
+        <w:jc w:val="both"/>
+        <w:rPr>
+          <w:rFonts w:ascii="Georgia" w:hAnsi="Georgia"/>
+          <w:color w:val="2B2B2B"/>
+          <w:sz w:val="26"/>
+        </w:rPr>
+      </w:pPr>
+      <w:r>
+        <w:rPr>
+          <w:rFonts w:ascii="Georgia" w:hAnsi="Georgia"/>
+          <w:color w:val="2B2B2B"/>
+          <w:sz w:val="26"/>
+        </w:rPr>
+        <w:t>Lin backed toward the door. “What’s in the walls?”</w:t>
+      </w:r>
+    </w:p>
+    <w:p>
+      <w:pPr>
+        <w:jc w:val="both"/>
+        <w:rPr>
+          <w:rFonts w:ascii="Georgia" w:hAnsi="Georgia"/>
+          <w:color w:val="2B2B2B"/>
+          <w:sz w:val="26"/>
+        </w:rPr>
+      </w:pPr>
+      <w:r>
+        <w:rPr>
+          <w:rFonts w:ascii="Georgia" w:hAnsi="Georgia"/>
+          <w:color w:val="2B2B2B"/>
+          <w:sz w:val="26"/>
+        </w:rPr>
+        <w:t>Alberto watched the bat.</w:t>
+      </w:r>
+    </w:p>
+    <w:p>
+      <w:pPr>
+        <w:jc w:val="both"/>
+        <w:rPr>
+          <w:rFonts w:ascii="Georgia" w:hAnsi="Georgia"/>
+          <w:color w:val="2B2B2B"/>
+          <w:sz w:val="26"/>
+        </w:rPr>
+      </w:pPr>
+      <w:r>
+        <w:rPr>
+          <w:rFonts w:ascii="Georgia" w:hAnsi="Georgia"/>
+          <w:color w:val="2B2B2B"/>
+          <w:sz w:val="26"/>
+        </w:rPr>
+        <w:t>“I was hoping,” he said, “you’d tell me.”</w:t>
+      </w:r>
+    </w:p>
+    <w:p>
+      <w:pPr>
+        <w:jc w:val="center"/>
+        <w:rPr>
+          <w:rFonts w:ascii="Georgia" w:hAnsi="Georgia"/>
+          <w:color w:val="2B2B2B"/>
+          <w:sz w:val="26"/>
+        </w:rPr>
+      </w:pPr>
+      <w:r>
+        <w:rPr>
+          <w:rFonts w:ascii="Georgia" w:hAnsi="Georgia"/>
+          <w:color w:val="2B2B2B"/>
+          <w:sz w:val="26"/>
+        </w:rPr>
+        <w:t>∗</w:t>
       </w:r>
     </w:p>
     <w:p>
@@ -23070,9 +23419,8 @@
           <w:color w:val="2B2B2B"/>
           <w:sz w:val="26"/>
         </w:rPr>
-        <w:t xml:space="preserve">Kade came in with the phone still in his hand. He did not see her. He went to the operations lead and said, in </w:t>
-        <w:lastRenderedPageBreak/>
-        <w:t>his low level voice, “Retask Halo Two to Reno. Halvorsen’s team boards at Reno at eight. Cancel the Sacramento leg.”</w:t>
+        <w:t xml:space="preserve">Kade came in with the phone still in his hand. He did not see her. He went to the operations lead and said, in a low voice, “Retask Halo Two to Reno. Halvorsen’s team boards at Reno at eight. Cancel the Sacramento leg.”</w:t>
+        <w:t/>
       </w:r>
     </w:p>
     <w:p>
@@ -27388,7 +27736,7 @@
           <w:color w:val="2B2B2B"/>
           <w:sz w:val="26"/>
         </w:rPr>
-        <w:t xml:space="preserve">“He said you would make it a story,” said his mother. “He said, Linh, he loves me, and he will put me on the radio, and then I will belong to everybody. He wanted to belong to us.” Her voice did not shake; it had had seven years to stop. “I kept the promise. I listened to every episode. You did your father’s voice for seven years, and </w:t>
+        <w:t xml:space="preserve">“He said you would make it a story,” said his mother. “He said, Linh, he loves me, and he will put me on the radio, and then I will belong to everybody. He wanted to belong to us.” Her voice did not shake; seven years had taught it not to. “I kept the promise. I listened to every episode. You did your father’s voice for seven years, and </w:t>
         <w:lastRenderedPageBreak/>
         <w:t>you never once asked me what he sounded like when he was frightened.”</w:t>
       </w:r>
@@ -27861,7 +28209,7 @@
           <w:color w:val="2B2B2B"/>
           <w:sz w:val="26"/>
         </w:rPr>
-        <w:t>“Because you’ll be in the trailer,” she said. “Halvorsen told me. And you’ll have a question about the second signature at the moment it matters. And I’ll be sitting at the back of the trailer with a legal pad, because Cole has sent me to make sure the authorization is executed. And you’ll ask me. And I will answer you. Technically.” “It’s the only way I have left of doing the right thing.”</w:t>
+        <w:t>“Because you’ll be in the trailer,” she said. “Halvorsen told me. And you’ll have a question about the second signature at the moment it matters. And I’ll be sitting at the back of the trailer with a legal pad, because Cole has sent me to make sure the authorization is executed. And you’ll ask me. And I will answer you. Technically. It’s the only way I have left of doing the right thing.”</w:t>
       </w:r>
     </w:p>
     <w:p>
@@ -28902,7 +29250,7 @@
           <w:color w:val="auto"/>
           <w:sz w:val="26"/>
         </w:rPr>
-        <w:t>Zaragoza was full of people temporarily living somewhere else. Eclipse tourists dragged hard-shell suitcases over old pavement. Families compared train reservations in four languages. A German couple argued softly over a folder containing passports, insurance papers and copies of copies. An Australian had sunscreen clipped to a backpack with the solemnity of survival equipment. A Canadian visitor carried a jacket despite the heat because experience had taught him that weather was a negotiation, not a promise.</w:t>
+        <w:t>Zaragoza was full of people temporarily living somewhere else. Eclipse tourists dragged hard-shell suitcases over old pavement. Families compared train reservations in four languages. One couple checked an overfull folder of passports, insurance papers, and photocopies for the fourth time. A woman clipped sunscreen to her backpack because the stands offered little shade. A visitor carried a jacket despite the heat; the forecast called for wind after sunset.</w:t>
       </w:r>
     </w:p>
     <w:p>
@@ -32626,9 +32974,9 @@
           <w:color w:val="2B2B2B"/>
           <w:sz w:val="26"/>
         </w:rPr>
-        <w:t xml:space="preserve">It was thirty-four degrees in the shade, and there was no shade. The concourses smelled of sunscreen and beer and the hot sweet fry of churro stands. A public-address voice asked people in Spanish, English, French and German not to look directly at the sun without approved eclipse glasses, and then told them where the merchandise stands were. People had brought dogs. A mariachi band, for reasons no one could explain, was playing on the north concourse. The astronomers from Utrecht had set up tripods along the top of section 102 </w:t>
+        <w:t xml:space="preserve">It was thirty-four degrees in the shade, and there was no shade. The concourses smelled of sunscreen and beer and the hot sweet fry of churro stands. A public-address voice asked people in Spanish, English, French and German not to look directly at the sun without approved eclipse glasses, and then told them where the merchandise stands were. People had brought dogs. An ensemble was performing a jota, an Aragonese music-and-dance tradition, on the north concourse; it was one of the event’s booked acts. The astronomers from Utrecht had set up tripods along the top of section 102 and were explaining Baily’s beads to anyone who slowed down.</w:t>
         <w:lastRenderedPageBreak/>
-        <w:t>and were explaining Baily’s beads to anyone who slowed down.</w:t>
+        <w:t/>
       </w:r>
     </w:p>
     <w:p>
@@ -33082,7 +33430,7 @@
           <w:color w:val="2B2B2B"/>
           <w:sz w:val="26"/>
         </w:rPr>
-        <w:t>She had twelve volunteers in a second trailer behind the first, at two long folding tables, with headsets and laminated maps of the bowl’s sections and a stack of Gary Huff’s laminated cards, which Dana had brought from Indiana in her wallet and photocopied that morning in the Halo compound, because Huff’s card, alone of all the documents anyone had brought to Spain, had a numbered list of what to do in an emergency. It said IN THE EVENT OF A SATURDAY at the top. Gladys had crossed out SATURDAY and written WEDNESDAY above it in pencil. The eleventh instruction still said CALL GARY. She had decided to leave it.</w:t>
+        <w:t>Dana had put twelve volunteers in a second trailer behind the first, at two long folding tables. The volunteers had headsets, laminated maps of the bowl’s sections, and a stack of Gary Huff’s cards. Dana had brought Huff’s card from Indiana in her wallet and photocopied it that morning at the Halo compound. Of everything they had brought to Spain, it was the only numbered emergency plan. It began: IN THE EVENT OF A SATURDAY. Gladys had crossed out SATURDAY and written WEDNESDAY above it in pencil. She left the eleventh instruction — CALL GARY — unchanged.</w:t>
       </w:r>
     </w:p>
     <w:p>
@@ -33561,7 +33909,7 @@
           <w:color w:val="2B2B2B"/>
           <w:sz w:val="26"/>
         </w:rPr>
-        <w:t xml:space="preserve">“Good evening, everyone,” he said. “In about seven minutes the moon is going to cover the sun completely, and it’s going to get very dark, very fast. That’s normal. </w:t>
+        <w:t xml:space="preserve">“Good evening, everyone,” he said. “In about eleven minutes the moon is going to cover the sun completely, and it’s going to get very dark, very fast. That’s normal. </w:t>
         <w:lastRenderedPageBreak/>
         <w:t>That’s what we came for. Some people find it overwhelming. Some people feel strange. If someone near you seems unwell, or confused, or doesn’t seem to be themselves — please don’t touch them. Just let a steward know, or call the number on the screen. Stay in your seat. Look up.” A pause. “And take your glasses off only when the last light is gone. Not before. You’ll know. Everybody always knows.”</w:t>
       </w:r>
@@ -33581,7 +33929,7 @@
           <w:color w:val="2B2B2B"/>
           <w:sz w:val="26"/>
         </w:rPr>
-        <w:t>Eighty thousand people, who had been talking and drinking and filming and arguing about the mariachi band, went quieter by a measurable fraction. Priya saw it on the trailer’s audio meter: a drop of four decibels across the whole bowl, as if the place had taken a breath.</w:t>
+        <w:t>Eighty thousand people, who had been talking and drinking and filming and arguing about the jota performance, went quieter by a measurable fraction. Priya saw it on the trailer’s audio meter: a drop of four decibels across the whole bowl, as if the place had taken a breath.</w:t>
       </w:r>
     </w:p>
     <w:p>
@@ -34346,7 +34694,7 @@
           <w:color w:val="2B2B2B"/>
           <w:sz w:val="26"/>
         </w:rPr>
-        <w:t>The old Spaniard in seat 6 had taken off his welder’s goggles and was looking at the three of them with frank interest.</w:t>
+        <w:t>The man in seat 6 had taken off his welder’s goggles and was looking at the three of them with frank interest.</w:t>
       </w:r>
     </w:p>
     <w:p>
@@ -35143,7 +35491,7 @@
           <w:color w:val="2B2B2B"/>
           <w:sz w:val="26"/>
         </w:rPr>
-        <w:t>In its place, six degrees above the western horizon, hung a black disc, perfectly round, blacker than anything in the sky had a right to be, and around it, spreading out in long soft streamers like silver hair in water, the corona: the sun’s outer atmosphere, a million degrees hot and a million times fainter than its face, visible for eighty-four seconds to the people of one narrow strip of the Earth. The sky went the deep blue of the last minute before night. Venus burned. A few bright stars came out. All around the horizon, beyond the edge of the moon’s shadow, a band of false sunset glowed orange and yellow, three hundred and sixty degrees of it, as if the world had been set inside a ring of fire. The temperature had dropped several degrees in a few minutes. Birds on the plain had gone silent. Somewhere on the north concourse, the mariachi band had stopped.</w:t>
+        <w:t>In its place, six degrees above the western horizon, hung a black disc, perfectly round, blacker than anything in the sky had a right to be, and around it, spreading out in long soft streamers like silver hair in water, the corona: the sun’s outer atmosphere, a million degrees hot and a million times fainter than its face, visible for eighty-four seconds to the people of one narrow strip of the Earth. The sky went the deep blue of the last minute before night. Venus burned. A few bright stars came out. All around the horizon, beyond the edge of the moon’s shadow, a band of false sunset glowed orange and yellow, three hundred and sixty degrees of it, as if the world had been set inside a ring of fire. The temperature had dropped several degrees in a few minutes. Birds on the plain had gone silent. Somewhere on the north concourse, the jota ensemble had stopped.</w:t>
       </w:r>
     </w:p>
     <w:p>
@@ -35904,9 +36252,9 @@
           <w:color w:val="2B2B2B"/>
           <w:sz w:val="26"/>
         </w:rPr>
-        <w:t xml:space="preserve">She did not pull. She did not shout. She held his hand in both of hers and stayed in her seat, and when he stood, she stood with him, so that he was not alone in the chair, and the old Spaniard in seat 6 stood too, without being </w:t>
+        <w:t xml:space="preserve">She did not pull. She did not shout. She held his hand in both of hers and stayed in her seat, and when he stood, she stood with him, so that he was not alone in the chair, and the man in seat 6 stood too, without being asked, and put a hand on the back of Dominic’s seat, as if steadying furniture in a storm.</w:t>
         <w:lastRenderedPageBreak/>
-        <w:t>asked, and put a hand on the back of Dominic’s seat, as if steadying furniture in a storm.</w:t>
+        <w:t/>
       </w:r>
     </w:p>
     <w:p>
@@ -36106,7 +36454,7 @@
           <w:color w:val="2B2B2B"/>
           <w:sz w:val="26"/>
         </w:rPr>
-        <w:t>The old Spaniard from seat 6 had her by the shoulders. He was saying something in Spanish, urgently, and his straw hat had gone over the rail. Above her, Mabs had not let go of Dominic’s hand. She had gone down on one knee in the aisle to keep hold of it, and he was dragging her, a step, another, toward the gangway, and she was letting herself be dragged rather than let go.</w:t>
+        <w:t>The man from seat 6 had her by the shoulders. He was speaking urgently in Spanish, and his straw hat had gone over the rail. Above her, Mabs had not let go of Dominic’s hand. She had gone down on one knee in the aisle to keep hold of it, and he was dragging her, a step, another, toward the gangway, and she was letting herself be dragged rather than let go.</w:t>
       </w:r>
     </w:p>
     <w:p>
@@ -37340,25 +37688,25 @@
           <w:color w:val="2B2B2B"/>
           <w:sz w:val="26"/>
         </w:rPr>
-        <w:t>And high above them, in the deep blue of the returning evening, four hundred sails that had been waiting in the sunlight outside the moon’s shadow, a few hundred kilometers up, turned all at once — just as a marketing department had dreamed and an engineer had designed and nobody at all had known what it would mean — and caught the sun, and threw it down, and a second ring of light drew itself slowly around the moon, wide, the width of an outstretched hand, silver and perfect, like a compass circle drawn on the sky.</w:t>
-      </w:r>
-    </w:p>
-    <w:p>
-      <w:pPr>
-        <w:jc w:val="both"/>
-        <w:rPr>
-          <w:rFonts w:ascii="Georgia" w:hAnsi="Georgia"/>
-          <w:color w:val="2B2B2B"/>
-          <w:sz w:val="26"/>
-        </w:rPr>
-      </w:pPr>
-      <w:r>
-        <w:rPr>
-          <w:rFonts w:ascii="Georgia" w:hAnsi="Georgia"/>
-          <w:color w:val="2B2B2B"/>
-          <w:sz w:val="26"/>
-        </w:rPr>
-        <w:t>People cheered, because they had paid to cheer. A child two rows down said it was a filter. The old Spaniard in seat 6 put his welder’s goggles back on and said, to no one, in Spanish, that he had seen four eclipses and this was the first one that had made him feel like he was being looked at.</w:t>
+        <w:t>High above them, in the deep blue of the returning evening, four hundred sails — waiting in sunlight outside the moon’s shadow, a few hundred kilometers up — turned all at once. A marketing department had dreamed the spectacle; an engineer had designed it; nobody had known what it would mean. The sails caught the sun and threw it down. A second ring of light drew itself slowly around the moon, wide as an outstretched hand, silver and perfect, like a compass circle drawn on the sky.</w:t>
+      </w:r>
+    </w:p>
+    <w:p>
+      <w:pPr>
+        <w:jc w:val="both"/>
+        <w:rPr>
+          <w:rFonts w:ascii="Georgia" w:hAnsi="Georgia"/>
+          <w:color w:val="2B2B2B"/>
+          <w:sz w:val="26"/>
+        </w:rPr>
+      </w:pPr>
+      <w:r>
+        <w:rPr>
+          <w:rFonts w:ascii="Georgia" w:hAnsi="Georgia"/>
+          <w:color w:val="2B2B2B"/>
+          <w:sz w:val="26"/>
+        </w:rPr>
+        <w:t>People cheered, because they had paid to cheer. A child two rows down said it was a filter. The man in seat 6 put his welder’s goggles back on and said in Spanish, to no one in particular, that he had seen four eclipses and this was the first that made him feel as if someone were looking back.</w:t>
       </w:r>
     </w:p>
     <w:p>
@@ -37849,9 +38197,8 @@
           <w:color w:val="2B2B2B"/>
           <w:sz w:val="26"/>
         </w:rPr>
-        <w:t xml:space="preserve">The twenty-meter band was full of ham operators, because ham operators had been waiting for this eclipse as long as the astronomers from Utrecht had. An eclipse changes the ionosphere. When the moon’s shadow </w:t>
-        <w:lastRenderedPageBreak/>
-        <w:t>sweeps across the upper atmosphere, the sun’s ultraviolet stops reaching it, and the charged layers that bounce shortwave signals around the curve of the world thin out and shift, and for a few minutes, along the path, the radio sky behaves like night. Scientists had been measuring it since the 1920s. Hams had been chasing it for nearly as long. That afternoon, every ham in Europe who could get on the air was on the air from inside the shadow, and every ham in America with a decent antenna was listening for them: men in Spain and Portugal and southern France calling CQ, CQ, CQ eclipse, and reading out signal reports, and a man in Valencia so excited he kept forgetting to say over.</w:t>
+        <w:t xml:space="preserve">The twenty-meter band was full of ham operators who had been waiting for the eclipse as long as the astronomers from Utrecht. An eclipse changes the ionosphere: as the Moon’s shadow crosses the upper atmosphere, less ultraviolet reaches it, altering the charged layers that carry shortwave signals around Earth. Along the shadow’s path, the radio sky briefly behaves like night. Scientists had measured the effect since the 1920s; hams had chased it almost as long. That afternoon, European operators called CQ eclipse from Spain, Portugal, and southern France while American operators listened. One man in Valencia was so excited he kept forgetting to say over.</w:t>
+        <w:t/>
       </w:r>
     </w:p>
     <w:p>
@@ -39402,7 +39749,7 @@
           <w:color w:val="2B2B2B"/>
           <w:sz w:val="26"/>
         </w:rPr>
-        <w:t>The retired astronomers from Utrecht said afterward that it was the most beautiful thing they had ever seen. Nobody in the bowl disagreed with them. Eighty thousand people stood in the long red light and watched the horned sun sink into the haze over the distant hills, and nobody left until it was gone, and then the PA said, in four languages, that the event had concluded and thanked everyone for being part of history, and the stadium emptied the way stadiums empty: slowly, then all at once. Cups rolled. A lost pair of eclipse glasses hung on a rail. The mariachi band started up again on the north concourse, no more explicable than before, and a hundred people danced.</w:t>
+        <w:t>The retired astronomers from Utrecht said afterward that it was the most beautiful thing they had ever seen. Nobody in the bowl disagreed with them. Eighty thousand people stood in the long red light and watched the horned sun sink into the haze over the distant hills, and nobody left until it was gone, and then the PA said, in four languages, that the event had concluded and thanked everyone for being part of history, and the stadium emptied the way stadiums empty: slowly, then all at once. Cups rolled. A lost pair of eclipse glasses hung on a rail. On the north concourse, the jota ensemble picked up where it had left off. A hundred people danced.</w:t>
       </w:r>
     </w:p>
     <w:p>
@@ -39474,9 +39821,8 @@
           <w:color w:val="2B2B2B"/>
           <w:sz w:val="26"/>
         </w:rPr>
-        <w:t xml:space="preserve">Gladys’s volunteers found most of them in the next hour, sitting where they had sat down, on steps and in aisles and in a few cases in other people’s seats, blinking, confused, embarrassed. A woman in section 108 thought she had fainted. A man in section 131 thought he had had too much sun. The teenager from Bilbao’s neighbor, a </w:t>
-        <w:lastRenderedPageBreak/>
-        <w:t>postal clerk from Logroño, said that he had had the strangest dream, standing up, of walking down a corridor with very soft floors, and that he had been looking for someone, and had not found them, and had been told to sit down and wait.</w:t>
+        <w:t xml:space="preserve">Gladys’s volunteers found most of them in the next hour, sitting where they had sat down, on steps and in aisles and in a few cases in other people’s seats, blinking, confused, embarrassed. A woman in section 108 thought she had fainted. A man in section 131 thought he had had too much sun. A postal clerk from Logroño, the neighbor of the teenager from Bilbao, told the retired schoolteacher from Leeds that he had dreamed of walking down a corridor with very soft floors, looking for someone he could not find, before someone told him to sit and wait.</w:t>
+        <w:t/>
       </w:r>
     </w:p>
     <w:p>
@@ -39584,9 +39930,8 @@
           <w:color w:val="2B2B2B"/>
           <w:sz w:val="26"/>
         </w:rPr>
-        <w:t xml:space="preserve">Kim the caterer, from Dominic’s wedding, had watched Starfall on television at a sports bar in Indianapolis, and had stood up from her stool at 2:28 Eastern, and walked as far as the door, and stopped, and gone back to her stool and finished her beer, and said to the bartender that she had had a weird moment. Mr. Wendell Price, Rosa’s neighbor, had been asleep in his recliner and had woken up standing in his own front yard, and had decided it was his blood pressure. Curtis, in a bar in Fort Wayne, three beers into the eclipse, had not stood up at all. He had sat on his stool through the whole thing with his hand clamped white-knuckled </w:t>
-        <w:lastRenderedPageBreak/>
-        <w:t>around his glass, and he had stopped talking, in the middle of a story about a lake in Michigan, for eighty-four seconds.</w:t>
+        <w:t xml:space="preserve">Kim the caterer from Dominic’s wedding watched Starfall on television at an Indianapolis sports bar. At 2:28 Eastern, she stood, walked to the door, then returned to her stool and finished her beer. She told the bartender she’d had a weird moment. Mr. Wendell Price, Rosa’s neighbor, woke from a nap in his recliner standing in his front yard and blamed his blood pressure. In a Fort Wayne bar, Curtis sat through the eclipse with one hand clamped around his glass. Three beers in, he stopped mid-story about a lake in Michigan for eighty-four seconds.</w:t>
+        <w:t/>
       </w:r>
     </w:p>
     <w:p>
@@ -39929,7 +40274,7 @@
           <w:color w:val="2B2B2B"/>
           <w:sz w:val="26"/>
         </w:rPr>
-        <w:t>“Find them,” said Buchanan, to her people, and then, after a pause, to the technician, slowly and clearly, as if to a child or a foreign dignitary: “You are safe. Safe.”</w:t>
+        <w:t>“Find them,” said Buchanan, to her people, and then, after a pause, to the technician, slowly and clearly, leaving space between the words: “You are safe. Safe.”</w:t>
       </w:r>
     </w:p>
     <w:p>
@@ -40728,7 +41073,7 @@
           <w:color w:val="2B2B2B"/>
           <w:sz w:val="26"/>
         </w:rPr>
-        <w:t>“Good,” said Nora. “Never use it.” And she kissed him, in the empty concourse, under the sodium lights, while a mariachi band played on the north side of the bowl for a hundred people dancing, and she thought, for the first time since the barn, that she would like very much to film something again. Not this. Something ordinary. A wedding. Anybody’s.</w:t>
+        <w:t>“Good,” said Nora. “Never use it.” And she kissed him, in the empty concourse, under the sodium lights, while the jota ensemble played on the north side of the bowl for a hundred people dancing, and she thought, for the first time since the barn, that she would like very much to film something again. Not this. Something ordinary. A wedding. Anybody’s.</w:t>
       </w:r>
     </w:p>
     <w:p>
@@ -42897,6 +43242,30 @@
           <w:color w:val="2B2B2B"/>
           <w:sz w:val="26"/>
         </w:rPr>
+        <w:t>∗</w:t>
+      </w:r>
+    </w:p>
+    <w:p>
+      <w:pPr/>
+      <w:r>
+        <w:t>In Trieste, on the night of August twelfth, Alberto Fucchi watched the eclipse feed with Lin. At 20:28:58, the rats crowded the bars. The lab transmitter was unplugged. The room was sealed. At 20:30:22, when the picture showed the corona returning, every rat stopped tapping at once. Above them, the bats lifted from the pipe and vanished through the roof gap.</w:t>
+      </w:r>
+    </w:p>
+    <w:p>
+      <w:pPr/>
+      <w:r>
+        <w:t>Dr. Shen, director of the partner institute in China, called. This time Fucchi answered. “The animals were not the experiment,” he said. “They were the witnesses.” Lin had assembled the raw recordings, sample chain, and original unsigned consent forms for the Italian review board. Fucchi gave her a signed account of his role. Lin sent the packet under her own name.</w:t>
+      </w:r>
+    </w:p>
+    <w:p>
+      <w:pPr/>
+      <w:r>
+        <w:t>By morning the rats were in licensed care, the annex was closed, and the records were beyond either lab’s control. Fucchi waited for the inquiry to begin. He had spent weeks asking what the bats and rats were hearing. Now he knew the first honest answer was his to give.</w:t>
+      </w:r>
+    </w:p>
+    <w:p>
+      <w:pPr/>
+      <w:r>
         <w:t>∗</w:t>
       </w:r>
     </w:p>
@@ -43998,9 +44367,9 @@
           <w:color w:val="2B2B2B"/>
           <w:sz w:val="26"/>
         </w:rPr>
-        <w:t xml:space="preserve">It borrows its shape from the quiet cousins and a few tricks from the loud ones. From The Invaders and Dark Skies it takes the private fight: a person who saw something and cannot get anyone official to believe them. From OVNI(s) and UFO it takes the government effort: an office too small to matter, reporting to a commander who answers to people with flags on their desks. From They Live it takes the idea, without the eyewear, that the scariest occupation is the one that has already incorporated and is currently doing the quarterly numbers through the very screens we volunteer to watch. And because a household should not raise a child on only its solemn relatives, it borrows a little mischief from the loud side of the family too — a countdown hidden in noise, from the picture about the holiday; a cellar survivalist convinced he alone saw it coming, from the picture about the tripods under the street; a white flag offered in good faith and answered badly, from the picture about the Martians and the hymn; and the old, better lesson that a name spoken correctly can do what a </w:t>
+        <w:t xml:space="preserve">It borrows its shape from the quiet cousins and a few tricks from the loud ones. The Invaders and Dark Skies supply the private fight: someone has seen something and cannot get the authorities to believe it. OVNI(s) and UFO lend the government effort: an office too small to matter, reporting to a commander who answers to people with flags on their desks. They Live suggests the scariest occupation: one already incorporated, doing quarterly numbers through the screens we volunteer to watch. A household should not raise a child on only solemn relatives, though. The loud cousins add a little mischief: a countdown hidden in noise; a cellar survivalist sure he alone sees the tripods coming; a white flag offered in good faith and answered with violence. The oldest cousin offers a better lesson: sometimes, getting an enemy’s name right can do what a fleet cannot.</w:t>
         <w:lastRenderedPageBreak/>
-        <w:t>fleet cannot, from the picture about the two enemies and the rock that outlasted their war.</w:t>
+        <w:t/>
       </w:r>
     </w:p>
     <w:p>
@@ -44348,7 +44717,7 @@
           <w:color w:val="2B2B2B"/>
           <w:sz w:val="26"/>
         </w:rPr>
-        <w:t>The New Starter’s Handbook, quoted throughout this book, does not exist and cites nothing. This appendix is the opposite kind of document. The papers and the counts in it are real, the links go to those sources, and none of it is required reading. Where the novel exceeds the citation, the paragraph says so. The bibliography at the back lists the same works in one place.</w:t>
+        <w:t>The New Starter’s Handbook, quoted throughout this book, does not exist and cites nothing. This appendix is the opposite kind of document: its sources are real, and its figures are measurements or model estimates, not proof of the novel’s fictional events. None of it is required reading. Where the novel exceeds a source, the paragraph says so. The bibliography at the back lists the sources in one place.</w:t>
       </w:r>
     </w:p>
     <w:p>
@@ -44386,26 +44755,7 @@
           <w:color w:val="2B2B2B"/>
           <w:sz w:val="26"/>
         </w:rPr>
-        <w:t xml:space="preserve">A ship that travels for forty thousand years rather than build something faster than light is not a fantasy so much as a concession: nothing in known physics outruns light, which leaves slow and enormous as the only honest option for crossing interstellar distance with a living crew. The concept has a name, </w:t>
-      </w:r>
-      <w:hyperlink w:anchor="bib_genship" w:history="1">
-        <w:r>
-          <w:rPr>
-            <w:rStyle w:val="Hyperlink"/>
-            <w:rFonts w:ascii="Georgia" w:hAnsi="Georgia"/>
-            <w:color w:val="2B2B2B"/>
-            <w:sz w:val="26"/>
-          </w:rPr>
-          <w:t xml:space="preserve">a generation ship</w:t>
-        </w:r>
-      </w:hyperlink>
-      <w:r>
-        <w:rPr>
-          <w:rFonts w:ascii="Georgia" w:hAnsi="Georgia"/>
-          <w:color w:val="2B2B2B"/>
-          <w:sz w:val="26"/>
-        </w:rPr>
-        <w:t xml:space="preserve">, and a real engineering literature, including Hein, Pak, Pütz, Bühler, and Reiss, “</w:t>
+        <w:t>A ship carrying a living population for forty thousand years rather than using faster-than-light travel is a speculative engineering choice, not a consequence demanded by physics. Known physics gives no way to send usable information faster than light. A generation ship is one proposed way to carry a living population across interstellar distances without suspended animation or another unproven technology. The concept has a real engineering literature, including Hein, Pak, Pütz, Bühler, and Reiss, “</w:t>
       </w:r>
       <w:hyperlink w:anchor="bib_hein" w:history="1">
         <w:r>
@@ -44424,7 +44774,7 @@
           <w:color w:val="2B2B2B"/>
           <w:sz w:val="26"/>
         </w:rPr>
-        <w:t xml:space="preserve">,” Journal of the British Interplanetary Society (2012). It is worth remembering, reading this book’s forty-thousand-year vessel held together by duct tape and committee, that humanity’s actual attempt at a small sealed biosphere, </w:t>
+        <w:t xml:space="preserve">”, Journal of the British Interplanetary Society (2012). It is useful to compare with the real </w:t>
       </w:r>
       <w:hyperlink w:anchor="bib_biosphere2" w:history="1">
         <w:r>
@@ -44443,7 +44793,7 @@
           <w:color w:val="2B2B2B"/>
           <w:sz w:val="26"/>
         </w:rPr>
-        <w:t xml:space="preserve">, sealed in Arizona in 1991, could not keep eight people supplied inside a fully sealed system for two years. Oxygen fell from 21 percent to about 14.5, crops failed, and outside oxygen had to be pumped in before the mission ended. All eight came out alive. The air did not hold. This book’s ship is not that. It is the version where the engineering problem gets solved, imperfectly, by people who had two thousand generations and no alternative. The solving is the fiction. The difficulty is not.</w:t>
+        <w:t xml:space="preserve">, sealed in Arizona in 1991, which could not sustain a fully closed air and food system without intervention through its planned two-year mission. Oxygen fell from about 20.9 percent to roughly 14.4 percent; oxygen was later added, while the food system provided much of the crew diet. All eight came out alive. The air did not hold. This ship is not that. It is the version where the engineering problem gets solved, imperfectly, by people who had two thousand generations and no alternative. The solving is the fiction. The difficulty is not.</w:t>
       </w:r>
     </w:p>
     <w:p>
@@ -44481,7 +44831,7 @@
           <w:color w:val="2B2B2B"/>
           <w:sz w:val="26"/>
         </w:rPr>
-        <w:t xml:space="preserve">The ship’s need for outside genetic material is not a decoration. A sealed population loses genetic diversity every generation. Conservation biology calls the floor under that loss a </w:t>
+        <w:t xml:space="preserve">In the novel, the crew believes it needs outside genetic material. In a closed population, genetic drift and inbreeding can reduce diversity over generations, especially when the effective breeding population is small. Conservation biologists use the term </w:t>
       </w:r>
       <w:hyperlink w:anchor="bib_mvp" w:history="1">
         <w:r>
@@ -44500,7 +44850,7 @@
           <w:color w:val="2B2B2B"/>
           <w:sz w:val="26"/>
         </w:rPr>
-        <w:t xml:space="preserve">, and the numbers argued for a wild species over evolutionary time are often in the thousands. </w:t>
+        <w:t xml:space="preserve"> for estimated population sizes that meet a specified persistence target; it is not a universal genetic threshold, and estimates depend on the species and model. </w:t>
       </w:r>
       <w:hyperlink w:anchor="bib_marin" w:history="1">
         <w:r>
@@ -44519,7 +44869,7 @@
           <w:color w:val="2B2B2B"/>
           <w:sz w:val="26"/>
         </w:rPr>
-        <w:t xml:space="preserve"> is more generous to the engineers than that folklore: under strict breeding rules, a founding crew of 98 can hold for a 6,300-year trip. Forty thousand years is not 6,300, and this book’s ship did not have those rules. That is the shopping trip. The story’s request, at the end, is for consented passage and consented samples, because taking infants without asking does not repair a crew, and children born on Earth to hybrid parents do not fly home by themselves.</w:t>
+        <w:t xml:space="preserve"> found, under its stated breeding rules and model assumptions, that 98 founders could sustain a 6,300-year mission. That is a model result, not a validated rule for real spacecraft populations. Forty thousand years is far beyond that modeled trip, and this ship did not follow those rules. That is the shopping trip. The story request, at the end, is for consented passage and consented samples, because taking infants without asking does not repair a crew, and children born on Earth to hybrid parents do not fly home by themselves.</w:t>
       </w:r>
     </w:p>
     <w:p>
@@ -44681,7 +45031,7 @@
           <w:sz w:val="26"/>
           <w:szCs w:val="23"/>
         </w:rPr>
-        <w:t xml:space="preserve">, and a 2025 study of airport and military radar put that leakage within reach of a telescope like Green Bank out to about two hundred light-years. This book borrows the year. The physics was already sitting there.</w:t>
+        <w:t xml:space="preserve">, and preliminary results presented at the 2025 Royal Astronomical Society National Astronomy Meeting estimated that airport and military radar could be detectable by a Green Bank-class telescope out to about two hundred light-years under the model assumptions. This book borrows the year. The physics was already sitting there.</w:t>
       </w:r>
     </w:p>
     <w:p>
@@ -44719,7 +45069,26 @@
           <w:color w:val="2B2B2B"/>
           <w:sz w:val="26"/>
         </w:rPr>
-        <w:t xml:space="preserve">Kade’s worry that Halo’s satellites might accidentally spot the ship is not hand-waved either. The real </w:t>
+        <w:t xml:space="preserve">Kade’s worry that Halo’s satellites might accidentally spot the ship is not hand-waved. The real </w:t>
+      </w:r>
+      <w:hyperlink w:anchor="bib_rubin_start" w:history="1">
+        <w:r>
+          <w:rPr>
+            <w:rStyle w:val="Hyperlink"/>
+            <w:rFonts w:ascii="Georgia" w:hAnsi="Georgia"/>
+            <w:color w:val="2B2B2B"/>
+            <w:sz w:val="26"/>
+          </w:rPr>
+          <w:t>Vera C. Rubin Observatory</w:t>
+        </w:r>
+      </w:hyperlink>
+      <w:r>
+        <w:rPr>
+          <w:rFonts w:ascii="Georgia" w:hAnsi="Georgia"/>
+          <w:color w:val="2B2B2B"/>
+          <w:sz w:val="26"/>
+        </w:rPr>
+        <w:t xml:space="preserve"> began its ten-year Legacy Survey of Space and Time (LSST) on 29 June 2026. A 2025 simulation </w:t>
       </w:r>
       <w:hyperlink w:anchor="bib_rubin" w:history="1">
         <w:r>
@@ -44729,7 +45098,7 @@
             <w:color w:val="2B2B2B"/>
             <w:sz w:val="26"/>
           </w:rPr>
-          <w:t xml:space="preserve">Vera C. Rubin Observatory</w:t>
+          <w:t>by Kurlander and colleagues</w:t>
         </w:r>
       </w:hyperlink>
       <w:r>
@@ -44738,7 +45107,7 @@
           <w:color w:val="2B2B2B"/>
           <w:sz w:val="26"/>
         </w:rPr>
-        <w:t xml:space="preserve"> is expected, over its ten-year survey, to catalog over a hundred thousand Jupiter Trojans alone — more than seven times the number currently known — which is to say that the part of the sky this book’s ship is hiding in is, this decade, for the first time in human history, actually about to be looked at properly. The hull in this book is a few kilometers across and dark. A small moon in that swarm would already have been famous. Rubin’s threat is to the small and the dark, which is the only size of secret the Trojan cloud can still keep.</w:t>
+        <w:t xml:space="preserve"> forecasts a final catalog of about 109,000 Jupiter Trojans, many times the number known when the forecast was made. The Trojan region is now being surveyed on an unprecedented scale. A body the size of the fictional hull presents more reflecting area than smaller Trojans, but its low albedo and viewing geometry still affect whether a survey detects it. The novel does not specify enough about the hull to predict its detectability.</w:t>
       </w:r>
     </w:p>
     <w:p>
@@ -44776,7 +45145,7 @@
           <w:color w:val="2B2B2B"/>
           <w:sz w:val="26"/>
         </w:rPr>
-        <w:t xml:space="preserve">A mote on the scale of a grain of rice is not pure invention. Seo, Neely, Shen, and colleagues showed, in </w:t>
+        <w:t xml:space="preserve">Millimeter-scale ultrasonic neural-dust devices have a real research basis. Seo, Neely, Shen, and colleagues demonstrated power delivery to millimeter-scale devices in tissue and battery-free ultrasonic backscatter of nerve and muscle signals in anesthetized rats (</w:t>
       </w:r>
       <w:hyperlink w:anchor="bib_seo" w:history="1">
         <w:r>
@@ -44795,7 +45164,7 @@
           <w:color w:val="2B2B2B"/>
           <w:sz w:val="26"/>
         </w:rPr>
-        <w:t xml:space="preserve">, that ultrasonic neural dust — wireless, dust-sized sensors — can record from a nerve at that size. What this book adds, and does not pretend has been demonstrated, is the second hop. The mote talks to a tender or a ground relay close enough to hear it. It does not stream a life to Jupiter. The constant signal in the novel is a dog tag: alive, located, unharmed. The occasional signal is a visit, at a range of hours missing from an ordinary afternoon, not a radio conversation with the Trojan swarm. A coin-sized commercial brain implant that talks to hardware worn on the body is a different machine, and it is not the one in this story.</w:t>
+        <w:t xml:space="preserve">). The novel extrapolates from that work: its mote, biological link, identity-like status signal, and relay to a nearby tender or ground station have not been demonstrated. It cannot communicate directly with Jupiter.</w:t>
       </w:r>
     </w:p>
     <w:p>
@@ -44833,7 +45202,7 @@
           <w:color w:val="2B2B2B"/>
           <w:sz w:val="26"/>
         </w:rPr>
-        <w:t xml:space="preserve">Halo Systems is not much of an exaggeration. A real satellite internet constellation, </w:t>
+        <w:t xml:space="preserve">SpaceX said on 6 October 2026 that </w:t>
       </w:r>
       <w:hyperlink w:anchor="bib_starlink" w:history="1">
         <w:r>
@@ -44843,7 +45212,7 @@
             <w:color w:val="2B2B2B"/>
             <w:sz w:val="26"/>
           </w:rPr>
-          <w:t xml:space="preserve">Starlink</w:t>
+          <w:t>Starlink</w:t>
         </w:r>
       </w:hyperlink>
       <w:r>
@@ -44852,7 +45221,26 @@
           <w:color w:val="2B2B2B"/>
           <w:sz w:val="26"/>
         </w:rPr>
-        <w:t xml:space="preserve">, had, as of September 2026, more than eleven thousand working satellites in orbit, with public filings and stated ambitions running well past that. The idea of a company quietly running capable eyes on the solar system out of the same budget line as a consumer internet product is, on the public record of that constellation’s scale, not speculative. It is Tuesday.</w:t>
+        <w:t xml:space="preserve"> operated more than 11,000 satellites in low Earth orbit. Its Stargaze system uses the satellites’ star trackers to make optical observations of nearby objects in Earth orbit (</w:t>
+      </w:r>
+      <w:hyperlink w:anchor="bib_stargaze" w:history="1">
+        <w:r>
+          <w:rPr>
+            <w:rStyle w:val="Hyperlink"/>
+            <w:rFonts w:ascii="Georgia" w:hAnsi="Georgia"/>
+            <w:color w:val="2B2B2B"/>
+            <w:sz w:val="26"/>
+          </w:rPr>
+          <w:t>Stargaze</w:t>
+        </w:r>
+      </w:hyperlink>
+      <w:r>
+        <w:rPr>
+          <w:rFonts w:ascii="Georgia" w:hAnsi="Georgia"/>
+          <w:color w:val="2B2B2B"/>
+          <w:sz w:val="26"/>
+        </w:rPr>
+        <w:t>). That is real space-traffic awareness in Earth orbit; it does not establish covert surveillance of the solar system or a Trojan swarm. Halo’s reach in this novel is an extrapolation.</w:t>
       </w:r>
     </w:p>
     <w:p>
@@ -44947,9 +45335,28 @@
           <w:color w:val="2B2B2B"/>
           <w:sz w:val="26"/>
         </w:rPr>
-        <w:t xml:space="preserve">The windbreaker man’s collar is an old trick, not a gadget. Most camera sensors are sensitive to near-infrared light that human eyes cannot see, so a ring of bright infrared LEDs around a face can wash it out on video while looking like nothing at all in person. Researchers at Japan’s National Institute of Informatics demonstrated a “privacy visor” on this principle in 2012. Phone cameras with good infrared filters resist it better than cheap security cameras do. The trick works in this </w:t>
         <w:lastRenderedPageBreak/>
-        <w:t>book about as well as it works in life: well enough, at night.</w:t>
+        <w:t xml:space="preserve">The windbreaker man’s collar is an old trick, not a gadget. Digital-camera sensors can respond to near-infrared light, which people cannot see, though some cameras filter much of it. In 2012, researchers at Japan’s </w:t>
+      </w:r>
+      <w:hyperlink w:anchor="bib_echizen" w:history="1">
+        <w:r>
+          <w:rPr>
+            <w:rStyle w:val="Hyperlink"/>
+            <w:rFonts w:ascii="Georgia" w:hAnsi="Georgia"/>
+            <w:color w:val="2B2B2B"/>
+            <w:sz w:val="26"/>
+          </w:rPr>
+          <w:t>National Institute of Informatics</w:t>
+        </w:r>
+      </w:hyperlink>
+      <w:r>
+        <w:rPr>
+          <w:rFonts w:ascii="Georgia" w:hAnsi="Georgia"/>
+          <w:color w:val="2B2B2B"/>
+          <w:sz w:val="26"/>
+        </w:rPr>
+        <w:lastRenderedPageBreak/>
+        <w:t xml:space="preserve"> demonstrated a prototype visor whose near-infrared LEDs interfered with face detection while remaining invisible to people. The test used one camera model and a particular face-detection algorithm; it did not selectively erase one face from arbitrary video. Results depend on sensor filters, exposure, distance, and detection method. The windbreaker man’s selective, persistent face-smear is fictional extrapolation from that limited principle.</w:t>
       </w:r>
     </w:p>
     <w:p>
@@ -45025,7 +45432,7 @@
           <w:color w:val="2B2B2B"/>
           <w:sz w:val="26"/>
         </w:rPr>
-        <w:t xml:space="preserve">. That is the true part. Using those cells to clone the baby — to grow a genetic twin in a tank in nine months, fit it with an implant, and swap it into a hospital cot — is entirely this book’s invention. Real mammalian cloning starts from a donor cell, an emptied egg and a surrogate mother, and rarely works even then; nothing in current biology comes close to what the ship does.</w:t>
+        <w:t xml:space="preserve">. That is the true part. Using those cells to clone the baby — to grow a genetic twin from those cells on an accelerated schedule before the expected birth, fit it with an implant, and swap it into a hospital cot — is entirely this book’s invention. Real mammalian cloning starts from a donor cell, an emptied egg and a surrogate mother, and rarely works even then; nothing in current biology comes close to what the ship does.</w:t>
       </w:r>
     </w:p>
     <w:p>
@@ -45058,20 +45465,48 @@
         </w:rPr>
       </w:pPr>
       <w:r>
-        <w:t>The radio details in the story obey one stubborn rule: information cannot outrun light. Near-Earth links can feel conversational; links to the Jupiter Trojan region cannot. The tender therefore functions as a store-and-forward relay, holding messages when the next link is unavailable and separating local reaction time from deep-space light-time.</w:t>
-      </w:r>
-    </w:p>
-    <w:p>
-      <w:pPr>
-        <w:jc w:val="both"/>
-        <w:rPr>
-          <w:rFonts w:ascii="Georgia" w:hAnsi="Georgia"/>
-          <w:color w:val="2B2B2B"/>
-          <w:sz w:val="26"/>
-        </w:rPr>
-      </w:pPr>
-      <w:r>
-        <w:t>The Boat’s location among the Jupiter Trojans also uses a real piece of celestial mechanics. Trojan objects share Jupiter’s orbit around the Sun in stable regions associated with the Sun-Jupiter L4 and L5 points (where an object can sit gravitationally locked to Jupiter instead of drifting around it), roughly sixty degrees ahead of or behind Jupiter. The novel’s ship is fictional; the orbital neighborhood is not.</w:t>
+        <w:t xml:space="preserve">The radio details in the story obey one stubborn rule: </w:t>
+      </w:r>
+      <w:hyperlink w:anchor="bib_relativity" w:history="1">
+        <w:r>
+          <w:rPr>
+            <w:rStyle w:val="Hyperlink"/>
+            <w:rFonts w:ascii="Georgia" w:hAnsi="Georgia"/>
+            <w:color w:val="2B2B2B"/>
+            <w:sz w:val="26"/>
+          </w:rPr>
+          <w:t>usable information cannot outrun light</w:t>
+        </w:r>
+      </w:hyperlink>
+      <w:r>
+        <w:t>. Near-Earth links can feel conversational; links to the Jupiter Trojan region cannot. The tender therefore functions as a store-and-forward relay, holding messages when the next link is unavailable and separating local reaction time from deep-space light-time.</w:t>
+      </w:r>
+    </w:p>
+    <w:p>
+      <w:pPr>
+        <w:jc w:val="both"/>
+        <w:rPr>
+          <w:rFonts w:ascii="Georgia" w:hAnsi="Georgia"/>
+          <w:color w:val="2B2B2B"/>
+          <w:sz w:val="26"/>
+        </w:rPr>
+      </w:pPr>
+      <w:r>
+        <w:t xml:space="preserve">The Boat’s location among the Jupiter Trojans also uses a real piece of celestial mechanics. Trojan objects share Jupiter’s orbit around the Sun in stable regions associated with the </w:t>
+      </w:r>
+      <w:hyperlink w:anchor="bib_lagrange" w:history="1">
+        <w:r>
+          <w:rPr>
+            <w:rStyle w:val="Hyperlink"/>
+            <w:rFonts w:ascii="Georgia" w:hAnsi="Georgia"/>
+            <w:color w:val="2B2B2B"/>
+            <w:sz w:val="26"/>
+          </w:rPr>
+          <w:t>Sun–Jupiter L4 and L5 points</w:t>
+        </w:r>
+      </w:hyperlink>
+      <w:r>
+        <w:t xml:space="preserve"> (where an object can sit gravitationally locked to Jupiter instead of drifting around it), roughly sixty degrees ahead of or behind Jupiter. The novel’s ship is fictional; the orbital neighborhood is not.</w:t>
       </w:r>
     </w:p>
     <w:p>
@@ -45157,7 +45592,7 @@
           <w:color w:val="2B2B2B"/>
           <w:sz w:val="26"/>
         </w:rPr>
-        <w:t>The eighty-four seconds are a local event. The tender may decide. The Boat may not. A round trip to the Trojans is an hour-class delay, and the novel does not spend it inside the bowl. The stand-down is a conditional signature stored on the tender years earlier, armed only if a carried ask matches the clause, and expired if the ask is late. The council minutes arrive afterward. They can ratify. They can dissent. They cannot reach back into the dark and move a hand.</w:t>
+        <w:t>The eighty-four seconds are a local event. The tender may decide. The Boat may not. At roughly six AU from Earth, the Boat has a one-way light-time of about fifty minutes; a round trip takes about one hundred minutes. The novel does not spend that delay inside the bowl. The stand-down is a conditional signature stored on the tender years earlier, armed only if a carried ask matches the clause, and expired if the ask is late. The council minutes arrive afterward. They can ratify. They can dissent. They cannot reach back into the dark and move a hand.</w:t>
       </w:r>
     </w:p>
     <w:p>
@@ -45193,9 +45628,9 @@
           <w:color w:val="2B2B2B"/>
           <w:sz w:val="26"/>
         </w:rPr>
-        <w:t xml:space="preserve">The ring is an illumination problem, not a miracle. Four hundred sails can draw a naked-eye circle beside a corona only if their area and reflectivity are doing ordinary optical work at a sun six degrees up. Kade’s argument in the trailer is that work. The genetic crime is also a constraint: a sealed population under mutational </w:t>
+        <w:t xml:space="preserve">The novel gives no area, reflectivity, or orbital-geometry calculation for the sails, so the ring should be read as a fictional spectacle, not a demonstrated design. The genetic constraint is also invented: mutational load does not establish that adult genomes could not develop aboard. Fetal cells as a workaround and the nine-month replacement twin are fictional.</w:t>
         <w:lastRenderedPageBreak/>
-        <w:t>load, unable to gestate an Earth-normal body aboard, using fetal cells because adult genomes would not develop. The nine-month twin is invention. The light-time is not.</w:t>
+        <w:t/>
       </w:r>
     </w:p>
     <w:p>
@@ -45233,7 +45668,7 @@
           <w:color w:val="2B2B2B"/>
           <w:sz w:val="26"/>
         </w:rPr>
-        <w:t>A people that carries its culture forward in another species’ bodies, raises taken children as its own and governs itself by a clause about asking is fiction, and so is every institution in this book. The difficulty underneath it, how a small sealed population survives across deep time without becoming something else, is not.</w:t>
+        <w:t>A people that carries its culture forward in the bodies of another species, raises taken children as its own and governs itself by a clause about asking is fiction, and so is every institution in this book. Analyte 7, hybrid physiology, the effects of the implant on behavior, and the responses of rats and bats to the eclipse are invented; no known biology supports those events. The cloning and replacement procedure is also fiction. Maintaining genetic health and a functioning closed life-support system across deep time are real, unsolved challenges; this book’s specific genetic crisis and solution are invented.</w:t>
       </w:r>
     </w:p>
     <w:p>
@@ -45419,7 +45854,7 @@
           <w:sz w:val="26"/>
           <w:szCs w:val="26"/>
         </w:rPr>
-        <w:t xml:space="preserve">.” Neuron 91 (2016).</w:t>
+        <w:t xml:space="preserve">.” Neuron 91 (2016): 529–539.</w:t>
       </w:r>
       <w:bookmarkEnd w:id="9003"/>
     </w:p>
@@ -45462,7 +45897,7 @@
           <w:sz w:val="26"/>
           <w:szCs w:val="26"/>
         </w:rPr>
-        <w:t xml:space="preserve">Caisse Saide, R., Garrett, M., et al. “Examining Airport Civilian and Military Radar Leakage as a Detectable Marker for Extraterrestrial Civilizations.” Royal Astronomical Society National Astronomy Meeting 2025; reported by Sci.News as “</w:t>
+        <w:t xml:space="preserve">Caisse Saide, R., Garrett, M., et al. “</w:t>
       </w:r>
       <w:hyperlink r:id="rId15" w:history="1">
         <w:r>
@@ -45472,7 +45907,7 @@
             <w:sz w:val="26"/>
             <w:szCs w:val="26"/>
           </w:rPr>
-          <w:t xml:space="preserve">Civilian and Military Radar Leakage Is Revealing Our Existence to Alien Civilizations</w:t>
+          <w:t xml:space="preserve">Examining Airport Civilian and Military Radar Leakage as a Detectable Marker for Extraterrestrial Civilizations</w:t>
         </w:r>
       </w:hyperlink>
       <w:r>
@@ -45481,7 +45916,7 @@
           <w:sz w:val="26"/>
           <w:szCs w:val="26"/>
         </w:rPr>
-        <w:t xml:space="preserve">.”</w:t>
+        <w:t xml:space="preserve">”. Royal Astronomical Society National Astronomy Meeting, 8 July 2025 (preliminary results).</w:t>
       </w:r>
       <w:bookmarkEnd w:id="9005"/>
     </w:p>
@@ -45627,6 +46062,37 @@
         <w:t xml:space="preserve">.” NASA Goddard Space Flight Center.</w:t>
       </w:r>
       <w:bookmarkEnd w:id="9009"/>
+    </w:p>
+    <w:p>
+      <w:bookmarkStart w:id="9018" w:name="bib_echizen"/>
+      <w:r>
+        <w:rPr>
+          <w:rFonts w:ascii="Georgia" w:hAnsi="Georgia"/>
+          <w:sz w:val="26"/>
+          <w:szCs w:val="26"/>
+        </w:rPr>
+        <w:t>Echizen, I., and S. Gohshi. “</w:t>
+      </w:r>
+      <w:hyperlink r:id="rId7" w:history="1">
+        <w:r>
+          <w:rPr>
+            <w:rStyle w:val="Hyperlink"/>
+            <w:rFonts w:ascii="Georgia" w:hAnsi="Georgia"/>
+            <w:sz w:val="26"/>
+            <w:szCs w:val="26"/>
+          </w:rPr>
+          <w:t>Privacy Protection Techniques Using Differences in Human and Device Sensitivity: Protecting Photographed Subjects against Invasion of Privacy Caused by Unintentional Capture in Camera Images</w:t>
+        </w:r>
+      </w:hyperlink>
+      <w:r>
+        <w:rPr>
+          <w:rFonts w:ascii="Georgia" w:hAnsi="Georgia"/>
+          <w:sz w:val="26"/>
+          <w:szCs w:val="26"/>
+        </w:rPr>
+        <w:t>.” National Institute of Informatics, 12 Dec. 2012.</w:t>
+      </w:r>
+      <w:bookmarkEnd w:id="9018"/>
     </w:p>
     <w:p>
       <w:bookmarkStart w:id="9010" w:name="bib_bianchi"/>
@@ -45721,7 +46187,7 @@
           <w:sz w:val="26"/>
           <w:szCs w:val="26"/>
         </w:rPr>
-        <w:t xml:space="preserve">“</w:t>
+        <w:t xml:space="preserve">Dempster, W. F. “</w:t>
       </w:r>
       <w:hyperlink r:id="rId23" w:history="1">
         <w:r>
@@ -45731,7 +46197,7 @@
             <w:sz w:val="26"/>
             <w:szCs w:val="26"/>
           </w:rPr>
-          <w:t xml:space="preserve">Biosphere 2</w:t>
+          <w:t xml:space="preserve">Tightly closed ecological systems reveal atmospheric subtleties – experience from Biosphere 2</w:t>
         </w:r>
       </w:hyperlink>
       <w:r>
@@ -45740,7 +46206,7 @@
           <w:sz w:val="26"/>
           <w:szCs w:val="26"/>
         </w:rPr>
-        <w:t xml:space="preserve">.” Wikipedia.</w:t>
+        <w:t xml:space="preserve">”. Advances in Space Research 42 (2008): 1951–1956.</w:t>
       </w:r>
       <w:bookmarkEnd w:id="9013"/>
     </w:p>
@@ -45752,7 +46218,7 @@
           <w:sz w:val="26"/>
           <w:szCs w:val="26"/>
         </w:rPr>
-        <w:t xml:space="preserve">“</w:t>
+        <w:t xml:space="preserve">Shaffer, M. L. “</w:t>
       </w:r>
       <w:hyperlink r:id="rId39" w:history="1">
         <w:r>
@@ -45762,7 +46228,7 @@
             <w:sz w:val="26"/>
             <w:szCs w:val="26"/>
           </w:rPr>
-          <w:t xml:space="preserve">Minimum viable population</w:t>
+          <w:t xml:space="preserve">Minimum population sizes for species conservation</w:t>
         </w:r>
       </w:hyperlink>
       <w:r>
@@ -45771,40 +46237,9 @@
           <w:sz w:val="26"/>
           <w:szCs w:val="26"/>
         </w:rPr>
-        <w:t xml:space="preserve">.” Wikipedia.</w:t>
+        <w:t xml:space="preserve">.” BioScience 31.2 (1981): 131–134.</w:t>
       </w:r>
       <w:bookmarkEnd w:id="9014"/>
-    </w:p>
-    <w:p>
-      <w:bookmarkStart w:id="9015" w:name="bib_genship"/>
-      <w:r>
-        <w:rPr>
-          <w:rFonts w:ascii="Georgia" w:hAnsi="Georgia"/>
-          <w:sz w:val="26"/>
-          <w:szCs w:val="26"/>
-        </w:rPr>
-        <w:t xml:space="preserve">“</w:t>
-      </w:r>
-      <w:hyperlink r:id="rId40" w:history="1">
-        <w:r>
-          <w:rPr>
-            <w:rStyle w:val="Hyperlink"/>
-            <w:rFonts w:ascii="Georgia" w:hAnsi="Georgia"/>
-            <w:sz w:val="26"/>
-            <w:szCs w:val="26"/>
-          </w:rPr>
-          <w:t xml:space="preserve">Generation ship</w:t>
-        </w:r>
-      </w:hyperlink>
-      <w:r>
-        <w:rPr>
-          <w:rFonts w:ascii="Georgia" w:hAnsi="Georgia"/>
-          <w:sz w:val="26"/>
-          <w:szCs w:val="26"/>
-        </w:rPr>
-        <w:t xml:space="preserve">.” Wikipedia.</w:t>
-      </w:r>
-      <w:bookmarkEnd w:id="9015"/>
     </w:p>
     <w:p>
       <w:bookmarkStart w:id="9016" w:name="bib_rubin"/>
@@ -45838,6 +46273,130 @@
       <w:bookmarkEnd w:id="9016"/>
     </w:p>
     <w:p>
+      <w:bookmarkStart w:id="9021" w:name="bib_relativity"/>
+      <w:r>
+        <w:rPr>
+          <w:rFonts w:ascii="Georgia" w:hAnsi="Georgia"/>
+          <w:sz w:val="26"/>
+          <w:szCs w:val="26"/>
+        </w:rPr>
+        <w:t>NASA Jet Propulsion Laboratory. “</w:t>
+      </w:r>
+      <w:hyperlink r:id="rId11" w:history="1">
+        <w:r>
+          <w:rPr>
+            <w:rStyle w:val="Hyperlink"/>
+            <w:rFonts w:ascii="Georgia" w:hAnsi="Georgia"/>
+            <w:sz w:val="26"/>
+            <w:szCs w:val="26"/>
+          </w:rPr>
+          <w:t>NASA Researchers Put New Spin on Einstein’s Relativity Theory</w:t>
+        </w:r>
+      </w:hyperlink>
+      <w:r>
+        <w:rPr>
+          <w:rFonts w:ascii="Georgia" w:hAnsi="Georgia"/>
+          <w:sz w:val="26"/>
+          <w:szCs w:val="26"/>
+        </w:rPr>
+        <w:t>.” 28 Mar. 2002.</w:t>
+      </w:r>
+      <w:bookmarkEnd w:id="9021"/>
+    </w:p>
+    <w:p>
+      <w:bookmarkStart w:id="9022" w:name="bib_lagrange"/>
+      <w:r>
+        <w:rPr>
+          <w:rFonts w:ascii="Georgia" w:hAnsi="Georgia"/>
+          <w:sz w:val="26"/>
+          <w:szCs w:val="26"/>
+        </w:rPr>
+        <w:t>NASA. “</w:t>
+      </w:r>
+      <w:hyperlink r:id="rId13" w:history="1">
+        <w:r>
+          <w:rPr>
+            <w:rStyle w:val="Hyperlink"/>
+            <w:rFonts w:ascii="Georgia" w:hAnsi="Georgia"/>
+            <w:sz w:val="26"/>
+            <w:szCs w:val="26"/>
+          </w:rPr>
+          <w:t>How the Sun Affects Asteroids in Our Neighborhood</w:t>
+        </w:r>
+      </w:hyperlink>
+      <w:r>
+        <w:rPr>
+          <w:rFonts w:ascii="Georgia" w:hAnsi="Georgia"/>
+          <w:sz w:val="26"/>
+          <w:szCs w:val="26"/>
+        </w:rPr>
+        <w:t>.” 30 Apr. 2021.</w:t>
+      </w:r>
+      <w:bookmarkEnd w:id="9022"/>
+    </w:p>
+    <w:p>
+      <w:bookmarkStart w:id="9019" w:name="bib_rubin_start"/>
+      <w:r>
+        <w:rPr>
+          <w:rFonts w:ascii="Georgia" w:hAnsi="Georgia"/>
+          <w:sz w:val="26"/>
+          <w:szCs w:val="26"/>
+        </w:rPr>
+        <w:t>Rubin Observatory. “</w:t>
+      </w:r>
+      <w:hyperlink r:id="rId9" w:history="1">
+        <w:r>
+          <w:rPr>
+            <w:rStyle w:val="Hyperlink"/>
+            <w:rFonts w:ascii="Georgia" w:hAnsi="Georgia"/>
+            <w:sz w:val="26"/>
+            <w:szCs w:val="26"/>
+          </w:rPr>
+          <w:t>Action! NSF–DOE Vera C. Rubin Observatory Begins Capturing the Greatest Cosmic Movie Ever Made</w:t>
+        </w:r>
+      </w:hyperlink>
+      <w:r>
+        <w:rPr>
+          <w:rFonts w:ascii="Georgia" w:hAnsi="Georgia"/>
+          <w:sz w:val="26"/>
+          <w:szCs w:val="26"/>
+        </w:rPr>
+        <w:t>.” 30 June 2026.</w:t>
+      </w:r>
+      <w:bookmarkEnd w:id="9019"/>
+    </w:p>
+    <w:p>
+      <w:bookmarkStart w:id="9020" w:name="bib_stargaze"/>
+      <w:r>
+        <w:rPr>
+          <w:rFonts w:ascii="Georgia" w:hAnsi="Georgia"/>
+          <w:sz w:val="26"/>
+          <w:szCs w:val="26"/>
+        </w:rPr>
+        <w:t>SpaceX. “</w:t>
+      </w:r>
+      <w:hyperlink r:id="rId10" w:history="1">
+        <w:r>
+          <w:rPr>
+            <w:rStyle w:val="Hyperlink"/>
+            <w:rFonts w:ascii="Georgia" w:hAnsi="Georgia"/>
+            <w:sz w:val="26"/>
+            <w:szCs w:val="26"/>
+          </w:rPr>
+          <w:t>Stargaze</w:t>
+        </w:r>
+      </w:hyperlink>
+      <w:r>
+        <w:rPr>
+          <w:rFonts w:ascii="Georgia" w:hAnsi="Georgia"/>
+          <w:sz w:val="26"/>
+          <w:szCs w:val="26"/>
+        </w:rPr>
+        <w:t>.” Starlink Space Safety documentation, accessed 12 Oct. 2026.</w:t>
+      </w:r>
+      <w:bookmarkEnd w:id="9020"/>
+    </w:p>
+    <w:p>
       <w:bookmarkStart w:id="9017" w:name="bib_starlink"/>
       <w:r>
         <w:rPr>
@@ -45845,7 +46404,7 @@
           <w:sz w:val="26"/>
           <w:szCs w:val="26"/>
         </w:rPr>
-        <w:t xml:space="preserve">Space.com. “</w:t>
+        <w:t xml:space="preserve">SpaceX. “</w:t>
       </w:r>
       <w:hyperlink r:id="rId18" w:history="1">
         <w:r>
@@ -45855,7 +46414,7 @@
             <w:sz w:val="26"/>
             <w:szCs w:val="26"/>
           </w:rPr>
-          <w:t xml:space="preserve">Starlink satellites: Facts, tracking and impact on astronomy</w:t>
+          <w:t xml:space="preserve">Space Safety: The Need for Improved Data Sharing Between Operators in Low-Earth Orbit</w:t>
         </w:r>
       </w:hyperlink>
       <w:r>
@@ -45864,7 +46423,7 @@
           <w:sz w:val="26"/>
           <w:szCs w:val="26"/>
         </w:rPr>
-        <w:t xml:space="preserve">.” Consulted September 2026.</w:t>
+        <w:t xml:space="preserve">.” Starlink Updates, 6 Oct. 2026.</w:t>
       </w:r>
       <w:bookmarkEnd w:id="9017"/>
     </w:p>
@@ -47041,8 +47600,8 @@
       <w:footerReference w:type="default" r:id="rId28"/>
       <w:headerReference w:type="first" r:id="rId29"/>
       <w:footerReference w:type="first" r:id="rId30"/>
-      <w:pgSz w:w="8640" w:h="12960"/>
-      <w:pgMar w:top="864" w:right="864" w:bottom="864" w:left="864" w:header="706" w:footer="706" w:gutter="0"/>
+      <w:pgSz w:w="7920" w:h="12240"/>
+      <w:pgMar w:top="720" w:right="720" w:bottom="720" w:left="720" w:header="706" w:footer="706" w:gutter="0"/>
       <w:pgNumType w:start="1"/>
       <w:cols w:space="720"/>
       <w:docGrid w:linePitch="360"/>
@@ -48922,7 +49481,7 @@
       <w:rFonts w:ascii="Arial" w:eastAsia="Arial" w:hAnsi="Arial" w:cs="Arial"/>
       <w:b/>
       <w:color w:val="2E74B5"/>
-      <w:sz w:val="32"/>
+      <w:sz w:val="36"/>
       <w:szCs w:val="32"/>
     </w:rPr>
   </w:style>
@@ -48941,7 +49500,7 @@
       <w:rFonts w:ascii="Arial" w:eastAsia="Arial" w:hAnsi="Arial" w:cs="Arial"/>
       <w:b/>
       <w:color w:val="2E74B5"/>
-      <w:sz w:val="32"/>
+      <w:sz w:val="30"/>
       <w:szCs w:val="26"/>
     </w:rPr>
   </w:style>

</xml_diff>